<commit_message>
fill: sturcture in text
</commit_message>
<xml_diff>
--- a/forms/A2_form.docx
+++ b/forms/A2_form.docx
@@ -228,10 +228,10 @@
         </w:tblCellMar>
       </w:tblPr>
       <w:tblGrid>
-        <w:gridCol w:w="1699"/>
-        <w:gridCol w:w="3000"/>
-        <w:gridCol w:w="2361"/>
-        <w:gridCol w:w="2299"/>
+        <w:gridCol w:w="1698"/>
+        <w:gridCol w:w="3001"/>
+        <w:gridCol w:w="2362"/>
+        <w:gridCol w:w="2298"/>
       </w:tblGrid>
       <w:tr>
         <w:trPr>
@@ -239,7 +239,7 @@
         </w:trPr>
         <w:tc>
           <w:tcPr>
-            <w:tcW w:w="1699" w:type="dxa"/>
+            <w:tcW w:w="1698" w:type="dxa"/>
             <w:tcBorders>
               <w:top w:val="single" w:sz="4" w:space="0" w:color="000000"/>
               <w:left w:val="single" w:sz="4" w:space="0" w:color="000000"/>
@@ -266,7 +266,7 @@
         </w:tc>
         <w:tc>
           <w:tcPr>
-            <w:tcW w:w="3000" w:type="dxa"/>
+            <w:tcW w:w="3001" w:type="dxa"/>
             <w:tcBorders>
               <w:top w:val="single" w:sz="4" w:space="0" w:color="000000"/>
               <w:left w:val="single" w:sz="4" w:space="0" w:color="000000"/>
@@ -293,7 +293,7 @@
         </w:tc>
         <w:tc>
           <w:tcPr>
-            <w:tcW w:w="2361" w:type="dxa"/>
+            <w:tcW w:w="2362" w:type="dxa"/>
             <w:tcBorders>
               <w:top w:val="single" w:sz="4" w:space="0" w:color="000000"/>
               <w:left w:val="single" w:sz="4" w:space="0" w:color="000000"/>
@@ -320,7 +320,7 @@
         </w:tc>
         <w:tc>
           <w:tcPr>
-            <w:tcW w:w="2299" w:type="dxa"/>
+            <w:tcW w:w="2298" w:type="dxa"/>
             <w:tcBorders>
               <w:top w:val="single" w:sz="4" w:space="0" w:color="000000"/>
               <w:left w:val="single" w:sz="4" w:space="0" w:color="000000"/>
@@ -350,7 +350,7 @@
         <w:trPr/>
         <w:tc>
           <w:tcPr>
-            <w:tcW w:w="1699" w:type="dxa"/>
+            <w:tcW w:w="1698" w:type="dxa"/>
             <w:tcBorders>
               <w:top w:val="single" w:sz="4" w:space="0" w:color="000000"/>
               <w:left w:val="single" w:sz="4" w:space="0" w:color="000000"/>
@@ -372,73 +372,73 @@
         </w:tc>
         <w:tc>
           <w:tcPr>
-            <w:tcW w:w="3000" w:type="dxa"/>
-            <w:tcBorders>
-              <w:top w:val="single" w:sz="4" w:space="0" w:color="000000"/>
-              <w:left w:val="single" w:sz="4" w:space="0" w:color="000000"/>
-              <w:bottom w:val="single" w:sz="4" w:space="0" w:color="000000"/>
-              <w:right w:val="single" w:sz="4" w:space="0" w:color="000000"/>
-            </w:tcBorders>
-          </w:tcPr>
-          <w:p>
-            <w:pPr>
-              <w:pStyle w:val="Normal"/>
-              <w:spacing w:before="0" w:after="80"/>
-              <w:rPr/>
-            </w:pPr>
-            <w:r>
-              <w:rPr/>
-            </w:r>
-          </w:p>
-        </w:tc>
-        <w:tc>
-          <w:tcPr>
-            <w:tcW w:w="2361" w:type="dxa"/>
-            <w:tcBorders>
-              <w:top w:val="single" w:sz="4" w:space="0" w:color="000000"/>
-              <w:left w:val="single" w:sz="4" w:space="0" w:color="000000"/>
-              <w:bottom w:val="single" w:sz="4" w:space="0" w:color="000000"/>
-              <w:right w:val="single" w:sz="4" w:space="0" w:color="000000"/>
-            </w:tcBorders>
-          </w:tcPr>
-          <w:p>
-            <w:pPr>
-              <w:pStyle w:val="Normal"/>
-              <w:spacing w:before="0" w:after="80"/>
-              <w:rPr/>
-            </w:pPr>
-            <w:r>
-              <w:rPr/>
-            </w:r>
-          </w:p>
-        </w:tc>
-        <w:tc>
-          <w:tcPr>
-            <w:tcW w:w="2299" w:type="dxa"/>
-            <w:tcBorders>
-              <w:top w:val="single" w:sz="4" w:space="0" w:color="000000"/>
-              <w:left w:val="single" w:sz="4" w:space="0" w:color="000000"/>
-              <w:bottom w:val="single" w:sz="4" w:space="0" w:color="000000"/>
-              <w:right w:val="single" w:sz="4" w:space="0" w:color="000000"/>
-            </w:tcBorders>
-          </w:tcPr>
-          <w:p>
-            <w:pPr>
-              <w:pStyle w:val="Normal"/>
-              <w:spacing w:before="0" w:after="80"/>
-              <w:rPr/>
-            </w:pPr>
-            <w:r>
-              <w:rPr/>
-            </w:r>
-          </w:p>
-        </w:tc>
-      </w:tr>
-      <w:tr>
-        <w:trPr/>
-        <w:tc>
-          <w:tcPr>
-            <w:tcW w:w="1699" w:type="dxa"/>
+            <w:tcW w:w="3001" w:type="dxa"/>
+            <w:tcBorders>
+              <w:top w:val="single" w:sz="4" w:space="0" w:color="000000"/>
+              <w:left w:val="single" w:sz="4" w:space="0" w:color="000000"/>
+              <w:bottom w:val="single" w:sz="4" w:space="0" w:color="000000"/>
+              <w:right w:val="single" w:sz="4" w:space="0" w:color="000000"/>
+            </w:tcBorders>
+          </w:tcPr>
+          <w:p>
+            <w:pPr>
+              <w:pStyle w:val="Normal"/>
+              <w:spacing w:before="0" w:after="80"/>
+              <w:rPr/>
+            </w:pPr>
+            <w:r>
+              <w:rPr/>
+            </w:r>
+          </w:p>
+        </w:tc>
+        <w:tc>
+          <w:tcPr>
+            <w:tcW w:w="2362" w:type="dxa"/>
+            <w:tcBorders>
+              <w:top w:val="single" w:sz="4" w:space="0" w:color="000000"/>
+              <w:left w:val="single" w:sz="4" w:space="0" w:color="000000"/>
+              <w:bottom w:val="single" w:sz="4" w:space="0" w:color="000000"/>
+              <w:right w:val="single" w:sz="4" w:space="0" w:color="000000"/>
+            </w:tcBorders>
+          </w:tcPr>
+          <w:p>
+            <w:pPr>
+              <w:pStyle w:val="Normal"/>
+              <w:spacing w:before="0" w:after="80"/>
+              <w:rPr/>
+            </w:pPr>
+            <w:r>
+              <w:rPr/>
+            </w:r>
+          </w:p>
+        </w:tc>
+        <w:tc>
+          <w:tcPr>
+            <w:tcW w:w="2298" w:type="dxa"/>
+            <w:tcBorders>
+              <w:top w:val="single" w:sz="4" w:space="0" w:color="000000"/>
+              <w:left w:val="single" w:sz="4" w:space="0" w:color="000000"/>
+              <w:bottom w:val="single" w:sz="4" w:space="0" w:color="000000"/>
+              <w:right w:val="single" w:sz="4" w:space="0" w:color="000000"/>
+            </w:tcBorders>
+          </w:tcPr>
+          <w:p>
+            <w:pPr>
+              <w:pStyle w:val="Normal"/>
+              <w:spacing w:before="0" w:after="80"/>
+              <w:rPr/>
+            </w:pPr>
+            <w:r>
+              <w:rPr/>
+            </w:r>
+          </w:p>
+        </w:tc>
+      </w:tr>
+      <w:tr>
+        <w:trPr/>
+        <w:tc>
+          <w:tcPr>
+            <w:tcW w:w="1698" w:type="dxa"/>
             <w:tcBorders>
               <w:top w:val="single" w:sz="4" w:space="0" w:color="000000"/>
               <w:left w:val="single" w:sz="4" w:space="0" w:color="000000"/>
@@ -460,73 +460,73 @@
         </w:tc>
         <w:tc>
           <w:tcPr>
-            <w:tcW w:w="3000" w:type="dxa"/>
-            <w:tcBorders>
-              <w:top w:val="single" w:sz="4" w:space="0" w:color="000000"/>
-              <w:left w:val="single" w:sz="4" w:space="0" w:color="000000"/>
-              <w:bottom w:val="single" w:sz="4" w:space="0" w:color="000000"/>
-              <w:right w:val="single" w:sz="4" w:space="0" w:color="000000"/>
-            </w:tcBorders>
-          </w:tcPr>
-          <w:p>
-            <w:pPr>
-              <w:pStyle w:val="Normal"/>
-              <w:spacing w:before="0" w:after="80"/>
-              <w:rPr/>
-            </w:pPr>
-            <w:r>
-              <w:rPr/>
-            </w:r>
-          </w:p>
-        </w:tc>
-        <w:tc>
-          <w:tcPr>
-            <w:tcW w:w="2361" w:type="dxa"/>
-            <w:tcBorders>
-              <w:top w:val="single" w:sz="4" w:space="0" w:color="000000"/>
-              <w:left w:val="single" w:sz="4" w:space="0" w:color="000000"/>
-              <w:bottom w:val="single" w:sz="4" w:space="0" w:color="000000"/>
-              <w:right w:val="single" w:sz="4" w:space="0" w:color="000000"/>
-            </w:tcBorders>
-          </w:tcPr>
-          <w:p>
-            <w:pPr>
-              <w:pStyle w:val="Normal"/>
-              <w:spacing w:before="0" w:after="80"/>
-              <w:rPr/>
-            </w:pPr>
-            <w:r>
-              <w:rPr/>
-            </w:r>
-          </w:p>
-        </w:tc>
-        <w:tc>
-          <w:tcPr>
-            <w:tcW w:w="2299" w:type="dxa"/>
-            <w:tcBorders>
-              <w:top w:val="single" w:sz="4" w:space="0" w:color="000000"/>
-              <w:left w:val="single" w:sz="4" w:space="0" w:color="000000"/>
-              <w:bottom w:val="single" w:sz="4" w:space="0" w:color="000000"/>
-              <w:right w:val="single" w:sz="4" w:space="0" w:color="000000"/>
-            </w:tcBorders>
-          </w:tcPr>
-          <w:p>
-            <w:pPr>
-              <w:pStyle w:val="Normal"/>
-              <w:spacing w:before="0" w:after="80"/>
-              <w:rPr/>
-            </w:pPr>
-            <w:r>
-              <w:rPr/>
-            </w:r>
-          </w:p>
-        </w:tc>
-      </w:tr>
-      <w:tr>
-        <w:trPr/>
-        <w:tc>
-          <w:tcPr>
-            <w:tcW w:w="1699" w:type="dxa"/>
+            <w:tcW w:w="3001" w:type="dxa"/>
+            <w:tcBorders>
+              <w:top w:val="single" w:sz="4" w:space="0" w:color="000000"/>
+              <w:left w:val="single" w:sz="4" w:space="0" w:color="000000"/>
+              <w:bottom w:val="single" w:sz="4" w:space="0" w:color="000000"/>
+              <w:right w:val="single" w:sz="4" w:space="0" w:color="000000"/>
+            </w:tcBorders>
+          </w:tcPr>
+          <w:p>
+            <w:pPr>
+              <w:pStyle w:val="Normal"/>
+              <w:spacing w:before="0" w:after="80"/>
+              <w:rPr/>
+            </w:pPr>
+            <w:r>
+              <w:rPr/>
+            </w:r>
+          </w:p>
+        </w:tc>
+        <w:tc>
+          <w:tcPr>
+            <w:tcW w:w="2362" w:type="dxa"/>
+            <w:tcBorders>
+              <w:top w:val="single" w:sz="4" w:space="0" w:color="000000"/>
+              <w:left w:val="single" w:sz="4" w:space="0" w:color="000000"/>
+              <w:bottom w:val="single" w:sz="4" w:space="0" w:color="000000"/>
+              <w:right w:val="single" w:sz="4" w:space="0" w:color="000000"/>
+            </w:tcBorders>
+          </w:tcPr>
+          <w:p>
+            <w:pPr>
+              <w:pStyle w:val="Normal"/>
+              <w:spacing w:before="0" w:after="80"/>
+              <w:rPr/>
+            </w:pPr>
+            <w:r>
+              <w:rPr/>
+            </w:r>
+          </w:p>
+        </w:tc>
+        <w:tc>
+          <w:tcPr>
+            <w:tcW w:w="2298" w:type="dxa"/>
+            <w:tcBorders>
+              <w:top w:val="single" w:sz="4" w:space="0" w:color="000000"/>
+              <w:left w:val="single" w:sz="4" w:space="0" w:color="000000"/>
+              <w:bottom w:val="single" w:sz="4" w:space="0" w:color="000000"/>
+              <w:right w:val="single" w:sz="4" w:space="0" w:color="000000"/>
+            </w:tcBorders>
+          </w:tcPr>
+          <w:p>
+            <w:pPr>
+              <w:pStyle w:val="Normal"/>
+              <w:spacing w:before="0" w:after="80"/>
+              <w:rPr/>
+            </w:pPr>
+            <w:r>
+              <w:rPr/>
+            </w:r>
+          </w:p>
+        </w:tc>
+      </w:tr>
+      <w:tr>
+        <w:trPr/>
+        <w:tc>
+          <w:tcPr>
+            <w:tcW w:w="1698" w:type="dxa"/>
             <w:tcBorders>
               <w:top w:val="single" w:sz="4" w:space="0" w:color="000000"/>
               <w:left w:val="single" w:sz="4" w:space="0" w:color="000000"/>
@@ -548,49 +548,49 @@
         </w:tc>
         <w:tc>
           <w:tcPr>
-            <w:tcW w:w="3000" w:type="dxa"/>
-            <w:tcBorders>
-              <w:top w:val="single" w:sz="4" w:space="0" w:color="000000"/>
-              <w:left w:val="single" w:sz="4" w:space="0" w:color="000000"/>
-              <w:bottom w:val="single" w:sz="4" w:space="0" w:color="000000"/>
-              <w:right w:val="single" w:sz="4" w:space="0" w:color="000000"/>
-            </w:tcBorders>
-          </w:tcPr>
-          <w:p>
-            <w:pPr>
-              <w:pStyle w:val="Normal"/>
-              <w:spacing w:before="0" w:after="80"/>
-              <w:rPr/>
-            </w:pPr>
-            <w:r>
-              <w:rPr/>
-            </w:r>
-          </w:p>
-        </w:tc>
-        <w:tc>
-          <w:tcPr>
-            <w:tcW w:w="2361" w:type="dxa"/>
-            <w:tcBorders>
-              <w:top w:val="single" w:sz="4" w:space="0" w:color="000000"/>
-              <w:left w:val="single" w:sz="4" w:space="0" w:color="000000"/>
-              <w:bottom w:val="single" w:sz="4" w:space="0" w:color="000000"/>
-              <w:right w:val="single" w:sz="4" w:space="0" w:color="000000"/>
-            </w:tcBorders>
-          </w:tcPr>
-          <w:p>
-            <w:pPr>
-              <w:pStyle w:val="Normal"/>
-              <w:spacing w:before="0" w:after="80"/>
-              <w:rPr/>
-            </w:pPr>
-            <w:r>
-              <w:rPr/>
-            </w:r>
-          </w:p>
-        </w:tc>
-        <w:tc>
-          <w:tcPr>
-            <w:tcW w:w="2299" w:type="dxa"/>
+            <w:tcW w:w="3001" w:type="dxa"/>
+            <w:tcBorders>
+              <w:top w:val="single" w:sz="4" w:space="0" w:color="000000"/>
+              <w:left w:val="single" w:sz="4" w:space="0" w:color="000000"/>
+              <w:bottom w:val="single" w:sz="4" w:space="0" w:color="000000"/>
+              <w:right w:val="single" w:sz="4" w:space="0" w:color="000000"/>
+            </w:tcBorders>
+          </w:tcPr>
+          <w:p>
+            <w:pPr>
+              <w:pStyle w:val="Normal"/>
+              <w:spacing w:before="0" w:after="80"/>
+              <w:rPr/>
+            </w:pPr>
+            <w:r>
+              <w:rPr/>
+            </w:r>
+          </w:p>
+        </w:tc>
+        <w:tc>
+          <w:tcPr>
+            <w:tcW w:w="2362" w:type="dxa"/>
+            <w:tcBorders>
+              <w:top w:val="single" w:sz="4" w:space="0" w:color="000000"/>
+              <w:left w:val="single" w:sz="4" w:space="0" w:color="000000"/>
+              <w:bottom w:val="single" w:sz="4" w:space="0" w:color="000000"/>
+              <w:right w:val="single" w:sz="4" w:space="0" w:color="000000"/>
+            </w:tcBorders>
+          </w:tcPr>
+          <w:p>
+            <w:pPr>
+              <w:pStyle w:val="Normal"/>
+              <w:spacing w:before="0" w:after="80"/>
+              <w:rPr/>
+            </w:pPr>
+            <w:r>
+              <w:rPr/>
+            </w:r>
+          </w:p>
+        </w:tc>
+        <w:tc>
+          <w:tcPr>
+            <w:tcW w:w="2298" w:type="dxa"/>
             <w:tcBorders>
               <w:top w:val="single" w:sz="4" w:space="0" w:color="000000"/>
               <w:left w:val="single" w:sz="4" w:space="0" w:color="000000"/>
@@ -1056,6 +1056,7 @@
                 <w:rFonts w:ascii="Arial;sans-serif" w:hAnsi="Arial;sans-serif"/>
                 <w:b w:val="false"/>
                 <w:i w:val="false"/>
+                <w:i w:val="false"/>
                 <w:caps w:val="false"/>
                 <w:smallCaps w:val="false"/>
                 <w:strike w:val="false"/>
@@ -1083,8 +1084,45 @@
                 <w:effect w:val="none"/>
                 <w:shd w:fill="auto" w:val="clear"/>
               </w:rPr>
-              <w:t xml:space="preserve">1. </w:t>
-            </w:r>
+              <w:t>1. Pristine Pixel Quality:</w:t>
+            </w:r>
+            <w:r>
+              <w:rPr>
+                <w:rFonts w:ascii="Arial;sans-serif" w:hAnsi="Arial;sans-serif"/>
+                <w:b w:val="false"/>
+                <w:i w:val="false"/>
+                <w:caps w:val="false"/>
+                <w:smallCaps w:val="false"/>
+                <w:strike w:val="false"/>
+                <w:dstrike w:val="false"/>
+                <w:color w:val="000000"/>
+                <w:sz w:val="22"/>
+                <w:u w:val="none"/>
+                <w:effect w:val="none"/>
+                <w:shd w:fill="auto" w:val="clear"/>
+              </w:rPr>
+              <w:t xml:space="preserve"> The pages are vector-rendered, resulting in stroke pixels with uniformly high contrast and 0° skew. A vision model can exploit these crisp edges without needing to account for scanner noise or fading.</w:t>
+            </w:r>
+          </w:p>
+          <w:p>
+            <w:pPr>
+              <w:pStyle w:val="BodyText"/>
+              <w:spacing w:before="0" w:after="80"/>
+              <w:rPr>
+                <w:rFonts w:ascii="Arial;sans-serif" w:hAnsi="Arial;sans-serif"/>
+                <w:b w:val="false"/>
+                <w:i w:val="false"/>
+                <w:i w:val="false"/>
+                <w:caps w:val="false"/>
+                <w:smallCaps w:val="false"/>
+                <w:strike w:val="false"/>
+                <w:dstrike w:val="false"/>
+                <w:color w:val="000000"/>
+                <w:sz w:val="22"/>
+                <w:u w:val="none"/>
+                <w:effect w:val="none"/>
+              </w:rPr>
+            </w:pPr>
             <w:r>
               <w:rPr>
                 <w:rFonts w:ascii="Arial;sans-serif" w:hAnsi="Arial;sans-serif"/>
@@ -1100,7 +1138,7 @@
                 <w:effect w:val="none"/>
                 <w:shd w:fill="auto" w:val="clear"/>
               </w:rPr>
-              <w:t>Pristine Pixel Quality:</w:t>
+              <w:t>2. Distinct Geometric Layouts:</w:t>
             </w:r>
             <w:r>
               <w:rPr>
@@ -1117,7 +1155,7 @@
                 <w:effect w:val="none"/>
                 <w:shd w:fill="auto" w:val="clear"/>
               </w:rPr>
-              <w:t xml:space="preserve"> The pages are vector-rendered, resulting in stroke pixels with uniformly high contrast and 0° skew. A vision model can exploit these crisp edges without needing to account for scanner noise or fading.</w:t>
+              <w:t xml:space="preserve"> The model must exploit geometric blocking to separate dense horizontal paragraphs from structured multi-column tables and non-text diagrams (where figure labels are often scattered and rotated).</w:t>
             </w:r>
           </w:p>
           <w:p>
@@ -1127,6 +1165,7 @@
               <w:rPr>
                 <w:rFonts w:ascii="Arial;sans-serif" w:hAnsi="Arial;sans-serif"/>
                 <w:b w:val="false"/>
+                <w:i w:val="false"/>
                 <w:i w:val="false"/>
                 <w:caps w:val="false"/>
                 <w:smallCaps w:val="false"/>
@@ -1153,24 +1192,7 @@
                 <w:effect w:val="none"/>
                 <w:shd w:fill="auto" w:val="clear"/>
               </w:rPr>
-              <w:t xml:space="preserve">2. </w:t>
-            </w:r>
-            <w:r>
-              <w:rPr>
-                <w:rFonts w:ascii="Arial;sans-serif" w:hAnsi="Arial;sans-serif"/>
-                <w:b/>
-                <w:i w:val="false"/>
-                <w:caps w:val="false"/>
-                <w:smallCaps w:val="false"/>
-                <w:strike w:val="false"/>
-                <w:dstrike w:val="false"/>
-                <w:color w:val="000000"/>
-                <w:sz w:val="22"/>
-                <w:u w:val="none"/>
-                <w:effect w:val="none"/>
-                <w:shd w:fill="auto" w:val="clear"/>
-              </w:rPr>
-              <w:t>Distinct Geometric Layouts:</w:t>
+              <w:t>3. Overloaded Vertical Zones:</w:t>
             </w:r>
             <w:r>
               <w:rPr>
@@ -1187,76 +1209,6 @@
                 <w:effect w:val="none"/>
                 <w:shd w:fill="auto" w:val="clear"/>
               </w:rPr>
-              <w:t xml:space="preserve"> The model must exploit geometric blocking to separate dense horizontal paragraphs from structured multi-column tables and non-text diagrams (where figure labels are often scattered and rotated).</w:t>
-            </w:r>
-          </w:p>
-          <w:p>
-            <w:pPr>
-              <w:pStyle w:val="BodyText"/>
-              <w:spacing w:before="0" w:after="80"/>
-              <w:rPr>
-                <w:rFonts w:ascii="Arial;sans-serif" w:hAnsi="Arial;sans-serif"/>
-                <w:b w:val="false"/>
-                <w:i w:val="false"/>
-                <w:caps w:val="false"/>
-                <w:smallCaps w:val="false"/>
-                <w:strike w:val="false"/>
-                <w:dstrike w:val="false"/>
-                <w:color w:val="000000"/>
-                <w:sz w:val="22"/>
-                <w:u w:val="none"/>
-                <w:effect w:val="none"/>
-              </w:rPr>
-            </w:pPr>
-            <w:r>
-              <w:rPr>
-                <w:rFonts w:ascii="Arial;sans-serif" w:hAnsi="Arial;sans-serif"/>
-                <w:b/>
-                <w:i w:val="false"/>
-                <w:caps w:val="false"/>
-                <w:smallCaps w:val="false"/>
-                <w:strike w:val="false"/>
-                <w:dstrike w:val="false"/>
-                <w:color w:val="000000"/>
-                <w:sz w:val="22"/>
-                <w:u w:val="none"/>
-                <w:effect w:val="none"/>
-                <w:shd w:fill="auto" w:val="clear"/>
-              </w:rPr>
-              <w:t xml:space="preserve">3. </w:t>
-            </w:r>
-            <w:r>
-              <w:rPr>
-                <w:rFonts w:ascii="Arial;sans-serif" w:hAnsi="Arial;sans-serif"/>
-                <w:b/>
-                <w:i w:val="false"/>
-                <w:caps w:val="false"/>
-                <w:smallCaps w:val="false"/>
-                <w:strike w:val="false"/>
-                <w:dstrike w:val="false"/>
-                <w:color w:val="000000"/>
-                <w:sz w:val="22"/>
-                <w:u w:val="none"/>
-                <w:effect w:val="none"/>
-                <w:shd w:fill="auto" w:val="clear"/>
-              </w:rPr>
-              <w:t>Overloaded Vertical Zones:</w:t>
-            </w:r>
-            <w:r>
-              <w:rPr>
-                <w:rFonts w:ascii="Arial;sans-serif" w:hAnsi="Arial;sans-serif"/>
-                <w:b w:val="false"/>
-                <w:i w:val="false"/>
-                <w:caps w:val="false"/>
-                <w:smallCaps w:val="false"/>
-                <w:strike w:val="false"/>
-                <w:dstrike w:val="false"/>
-                <w:color w:val="000000"/>
-                <w:sz w:val="22"/>
-                <w:u w:val="none"/>
-                <w:effect w:val="none"/>
-                <w:shd w:fill="auto" w:val="clear"/>
-              </w:rPr>
               <w:t xml:space="preserve"> Latin sub/superscripts in chemical and mathematical formulas occupy the exact same vertical space above and below the baseline as Bangla matras. A vision model cannot safely separate lines based purely on horizontal whitespace gaps, as the vertical zones are structurally mixed.</w:t>
             </w:r>
           </w:p>
@@ -1334,7 +1286,99 @@
               <w:rPr/>
             </w:pPr>
             <w:r>
-              <w:rPr/>
+              <w:rPr>
+                <w:b/>
+                <w:bCs/>
+              </w:rPr>
+              <w:t>1.</w:t>
+            </w:r>
+            <w:r>
+              <w:rPr/>
+              <w:t xml:space="preserve"> </w:t>
+            </w:r>
+            <w:r>
+              <w:rPr>
+                <w:b/>
+                <w:bCs/>
+              </w:rPr>
+              <w:t>Intense Bangla-Latin Code-Mixing:</w:t>
+            </w:r>
+            <w:r>
+              <w:rPr/>
+              <w:t xml:space="preserve"> The text frequently switches between Bangla script and Latin/numeric scientific notation (like $H_2SO_4$ or $F=ma$) mid-sentence. A sequence model must learn to predict seamless transitions between these two distinct vocabularies, sometimes even within a single token (e.g., when a formula binds to a Bangla case suffix like "$H_2SO_4$-</w:t>
+            </w:r>
+            <w:r>
+              <w:rPr/>
+              <w:t>এর</w:t>
+            </w:r>
+            <w:r>
+              <w:rPr/>
+              <w:t>" without whitespace).</w:t>
+            </w:r>
+          </w:p>
+          <w:p>
+            <w:pPr>
+              <w:pStyle w:val="Normal"/>
+              <w:spacing w:before="0" w:after="80"/>
+              <w:rPr/>
+            </w:pPr>
+            <w:r>
+              <w:rPr>
+                <w:b/>
+                <w:bCs/>
+              </w:rPr>
+              <w:t xml:space="preserve">2. </w:t>
+            </w:r>
+            <w:r>
+              <w:rPr>
+                <w:b/>
+                <w:bCs/>
+              </w:rPr>
+              <w:t>High-Density Conjuncts (</w:t>
+            </w:r>
+            <w:r>
+              <w:rPr>
+                <w:b/>
+                <w:b/>
+                <w:bCs/>
+              </w:rPr>
+              <w:t>যুক্তবর্ণ</w:t>
+            </w:r>
+            <w:r>
+              <w:rPr>
+                <w:b/>
+                <w:bCs/>
+              </w:rPr>
+              <w:t>):</w:t>
+            </w:r>
+            <w:r>
+              <w:rPr/>
+              <w:t xml:space="preserve"> Scientific vocabulary relies heavily on complex, fused conjuncts (~7% of all characters). A sequence model exploits the fact that these aren't random letter combinations, but specific, predictable linguistic tokens. Accurate prediction here is critical, as a single mis-predicted conjunct destroys the entire word token for downstream retrieval.</w:t>
+            </w:r>
+          </w:p>
+          <w:p>
+            <w:pPr>
+              <w:pStyle w:val="Normal"/>
+              <w:spacing w:before="0" w:after="80"/>
+              <w:rPr/>
+            </w:pPr>
+            <w:r>
+              <w:rPr>
+                <w:b/>
+                <w:bCs/>
+              </w:rPr>
+              <w:t xml:space="preserve">3. </w:t>
+            </w:r>
+            <w:r>
+              <w:rPr>
+                <w:b/>
+                <w:bCs/>
+              </w:rPr>
+              <w:t>Domain-Specific Context:</w:t>
+            </w:r>
+            <w:r>
+              <w:rPr/>
+              <w:t xml:space="preserve"> Reading order carries strict scientific meaning. The sequence model (especially during embedding) can exploit the fact that Latin mathematical or chemical formulas are almost always contextually anchored by the surrounding Bangla definitions in the same paragraph.</w:t>
             </w:r>
           </w:p>
         </w:tc>
@@ -1460,8 +1504,8 @@
         </w:tblCellMar>
       </w:tblPr>
       <w:tblGrid>
-        <w:gridCol w:w="1699"/>
-        <w:gridCol w:w="2901"/>
+        <w:gridCol w:w="1698"/>
+        <w:gridCol w:w="2902"/>
         <w:gridCol w:w="3199"/>
         <w:gridCol w:w="1560"/>
       </w:tblGrid>
@@ -1471,7 +1515,7 @@
         </w:trPr>
         <w:tc>
           <w:tcPr>
-            <w:tcW w:w="1699" w:type="dxa"/>
+            <w:tcW w:w="1698" w:type="dxa"/>
             <w:tcBorders>
               <w:top w:val="single" w:sz="4" w:space="0" w:color="000000"/>
               <w:left w:val="single" w:sz="4" w:space="0" w:color="000000"/>
@@ -1498,7 +1542,7 @@
         </w:tc>
         <w:tc>
           <w:tcPr>
-            <w:tcW w:w="2901" w:type="dxa"/>
+            <w:tcW w:w="2902" w:type="dxa"/>
             <w:tcBorders>
               <w:top w:val="single" w:sz="4" w:space="0" w:color="000000"/>
               <w:left w:val="single" w:sz="4" w:space="0" w:color="000000"/>
@@ -1582,7 +1626,7 @@
         <w:trPr/>
         <w:tc>
           <w:tcPr>
-            <w:tcW w:w="1699" w:type="dxa"/>
+            <w:tcW w:w="1698" w:type="dxa"/>
             <w:tcBorders>
               <w:top w:val="single" w:sz="4" w:space="0" w:color="000000"/>
               <w:left w:val="single" w:sz="4" w:space="0" w:color="000000"/>
@@ -1604,7 +1648,7 @@
         </w:tc>
         <w:tc>
           <w:tcPr>
-            <w:tcW w:w="2901" w:type="dxa"/>
+            <w:tcW w:w="2902" w:type="dxa"/>
             <w:tcBorders>
               <w:top w:val="single" w:sz="4" w:space="0" w:color="000000"/>
               <w:left w:val="single" w:sz="4" w:space="0" w:color="000000"/>
@@ -1677,7 +1721,7 @@
         <w:trPr/>
         <w:tc>
           <w:tcPr>
-            <w:tcW w:w="1699" w:type="dxa"/>
+            <w:tcW w:w="1698" w:type="dxa"/>
             <w:tcBorders>
               <w:top w:val="single" w:sz="4" w:space="0" w:color="000000"/>
               <w:left w:val="single" w:sz="4" w:space="0" w:color="000000"/>
@@ -1699,7 +1743,7 @@
         </w:tc>
         <w:tc>
           <w:tcPr>
-            <w:tcW w:w="2901" w:type="dxa"/>
+            <w:tcW w:w="2902" w:type="dxa"/>
             <w:tcBorders>
               <w:top w:val="single" w:sz="4" w:space="0" w:color="000000"/>
               <w:left w:val="single" w:sz="4" w:space="0" w:color="000000"/>
@@ -1772,7 +1816,7 @@
         <w:trPr/>
         <w:tc>
           <w:tcPr>
-            <w:tcW w:w="1699" w:type="dxa"/>
+            <w:tcW w:w="1698" w:type="dxa"/>
             <w:tcBorders>
               <w:top w:val="single" w:sz="4" w:space="0" w:color="000000"/>
               <w:left w:val="single" w:sz="4" w:space="0" w:color="000000"/>
@@ -1794,7 +1838,7 @@
         </w:tc>
         <w:tc>
           <w:tcPr>
-            <w:tcW w:w="2901" w:type="dxa"/>
+            <w:tcW w:w="2902" w:type="dxa"/>
             <w:tcBorders>
               <w:top w:val="single" w:sz="4" w:space="0" w:color="000000"/>
               <w:left w:val="single" w:sz="4" w:space="0" w:color="000000"/>
@@ -1867,7 +1911,7 @@
         <w:trPr/>
         <w:tc>
           <w:tcPr>
-            <w:tcW w:w="1699" w:type="dxa"/>
+            <w:tcW w:w="1698" w:type="dxa"/>
             <w:tcBorders>
               <w:top w:val="single" w:sz="4" w:space="0" w:color="000000"/>
               <w:left w:val="single" w:sz="4" w:space="0" w:color="000000"/>
@@ -1889,7 +1933,7 @@
         </w:tc>
         <w:tc>
           <w:tcPr>
-            <w:tcW w:w="2901" w:type="dxa"/>
+            <w:tcW w:w="2902" w:type="dxa"/>
             <w:tcBorders>
               <w:top w:val="single" w:sz="4" w:space="0" w:color="000000"/>
               <w:left w:val="single" w:sz="4" w:space="0" w:color="000000"/>
@@ -1962,7 +2006,7 @@
         <w:trPr/>
         <w:tc>
           <w:tcPr>
-            <w:tcW w:w="1699" w:type="dxa"/>
+            <w:tcW w:w="1698" w:type="dxa"/>
             <w:tcBorders>
               <w:top w:val="single" w:sz="4" w:space="0" w:color="000000"/>
               <w:left w:val="single" w:sz="4" w:space="0" w:color="000000"/>
@@ -1984,7 +2028,7 @@
         </w:tc>
         <w:tc>
           <w:tcPr>
-            <w:tcW w:w="2901" w:type="dxa"/>
+            <w:tcW w:w="2902" w:type="dxa"/>
             <w:tcBorders>
               <w:top w:val="single" w:sz="4" w:space="0" w:color="000000"/>
               <w:left w:val="single" w:sz="4" w:space="0" w:color="000000"/>
@@ -2057,7 +2101,7 @@
         <w:trPr/>
         <w:tc>
           <w:tcPr>
-            <w:tcW w:w="1699" w:type="dxa"/>
+            <w:tcW w:w="1698" w:type="dxa"/>
             <w:tcBorders>
               <w:top w:val="single" w:sz="4" w:space="0" w:color="000000"/>
               <w:left w:val="single" w:sz="4" w:space="0" w:color="000000"/>
@@ -2079,7 +2123,7 @@
         </w:tc>
         <w:tc>
           <w:tcPr>
-            <w:tcW w:w="2901" w:type="dxa"/>
+            <w:tcW w:w="2902" w:type="dxa"/>
             <w:tcBorders>
               <w:top w:val="single" w:sz="4" w:space="0" w:color="000000"/>
               <w:left w:val="single" w:sz="4" w:space="0" w:color="000000"/>
@@ -3560,17 +3604,15 @@
         </w:tblCellMar>
       </w:tblPr>
       <w:tblGrid>
-        <w:gridCol w:w="2199"/>
-        <w:gridCol w:w="3401"/>
+        <w:gridCol w:w="2198"/>
+        <w:gridCol w:w="3402"/>
         <w:gridCol w:w="3760"/>
       </w:tblGrid>
       <w:tr>
-        <w:trPr>
-          <w:tblHeader w:val="true"/>
-        </w:trPr>
-        <w:tc>
-          <w:tcPr>
-            <w:tcW w:w="2199" w:type="dxa"/>
+        <w:trPr/>
+        <w:tc>
+          <w:tcPr>
+            <w:tcW w:w="2198" w:type="dxa"/>
             <w:tcBorders>
               <w:top w:val="single" w:sz="4" w:space="0" w:color="000000"/>
               <w:left w:val="single" w:sz="4" w:space="0" w:color="000000"/>
@@ -3597,7 +3639,7 @@
         </w:tc>
         <w:tc>
           <w:tcPr>
-            <w:tcW w:w="3401" w:type="dxa"/>
+            <w:tcW w:w="3402" w:type="dxa"/>
             <w:tcBorders>
               <w:top w:val="single" w:sz="4" w:space="0" w:color="000000"/>
               <w:left w:val="single" w:sz="4" w:space="0" w:color="000000"/>
@@ -3654,7 +3696,7 @@
         <w:trPr/>
         <w:tc>
           <w:tcPr>
-            <w:tcW w:w="2199" w:type="dxa"/>
+            <w:tcW w:w="2198" w:type="dxa"/>
             <w:tcBorders>
               <w:top w:val="single" w:sz="4" w:space="0" w:color="000000"/>
               <w:left w:val="single" w:sz="4" w:space="0" w:color="000000"/>
@@ -3676,7 +3718,7 @@
         </w:tc>
         <w:tc>
           <w:tcPr>
-            <w:tcW w:w="3401" w:type="dxa"/>
+            <w:tcW w:w="3402" w:type="dxa"/>
             <w:tcBorders>
               <w:top w:val="single" w:sz="4" w:space="0" w:color="000000"/>
               <w:left w:val="single" w:sz="4" w:space="0" w:color="000000"/>
@@ -3735,7 +3777,7 @@
         <w:trPr/>
         <w:tc>
           <w:tcPr>
-            <w:tcW w:w="2199" w:type="dxa"/>
+            <w:tcW w:w="2198" w:type="dxa"/>
             <w:tcBorders>
               <w:top w:val="single" w:sz="4" w:space="0" w:color="000000"/>
               <w:left w:val="single" w:sz="4" w:space="0" w:color="000000"/>
@@ -3757,7 +3799,7 @@
         </w:tc>
         <w:tc>
           <w:tcPr>
-            <w:tcW w:w="3401" w:type="dxa"/>
+            <w:tcW w:w="3402" w:type="dxa"/>
             <w:tcBorders>
               <w:top w:val="single" w:sz="4" w:space="0" w:color="000000"/>
               <w:left w:val="single" w:sz="4" w:space="0" w:color="000000"/>
@@ -3816,7 +3858,7 @@
         <w:trPr/>
         <w:tc>
           <w:tcPr>
-            <w:tcW w:w="2199" w:type="dxa"/>
+            <w:tcW w:w="2198" w:type="dxa"/>
             <w:tcBorders>
               <w:top w:val="single" w:sz="4" w:space="0" w:color="000000"/>
               <w:left w:val="single" w:sz="4" w:space="0" w:color="000000"/>
@@ -3838,7 +3880,7 @@
         </w:tc>
         <w:tc>
           <w:tcPr>
-            <w:tcW w:w="3401" w:type="dxa"/>
+            <w:tcW w:w="3402" w:type="dxa"/>
             <w:tcBorders>
               <w:top w:val="single" w:sz="4" w:space="0" w:color="000000"/>
               <w:left w:val="single" w:sz="4" w:space="0" w:color="000000"/>
@@ -3897,7 +3939,7 @@
         <w:trPr/>
         <w:tc>
           <w:tcPr>
-            <w:tcW w:w="2199" w:type="dxa"/>
+            <w:tcW w:w="2198" w:type="dxa"/>
             <w:tcBorders>
               <w:top w:val="single" w:sz="4" w:space="0" w:color="000000"/>
               <w:left w:val="single" w:sz="4" w:space="0" w:color="000000"/>
@@ -3919,7 +3961,7 @@
         </w:tc>
         <w:tc>
           <w:tcPr>
-            <w:tcW w:w="3401" w:type="dxa"/>
+            <w:tcW w:w="3402" w:type="dxa"/>
             <w:tcBorders>
               <w:top w:val="single" w:sz="4" w:space="0" w:color="000000"/>
               <w:left w:val="single" w:sz="4" w:space="0" w:color="000000"/>
@@ -3978,7 +4020,7 @@
         <w:trPr/>
         <w:tc>
           <w:tcPr>
-            <w:tcW w:w="2199" w:type="dxa"/>
+            <w:tcW w:w="2198" w:type="dxa"/>
             <w:tcBorders>
               <w:top w:val="single" w:sz="4" w:space="0" w:color="000000"/>
               <w:left w:val="single" w:sz="4" w:space="0" w:color="000000"/>
@@ -4000,7 +4042,7 @@
         </w:tc>
         <w:tc>
           <w:tcPr>
-            <w:tcW w:w="3401" w:type="dxa"/>
+            <w:tcW w:w="3402" w:type="dxa"/>
             <w:tcBorders>
               <w:top w:val="single" w:sz="4" w:space="0" w:color="000000"/>
               <w:left w:val="single" w:sz="4" w:space="0" w:color="000000"/>
@@ -4059,7 +4101,7 @@
         <w:trPr/>
         <w:tc>
           <w:tcPr>
-            <w:tcW w:w="2199" w:type="dxa"/>
+            <w:tcW w:w="2198" w:type="dxa"/>
             <w:tcBorders>
               <w:top w:val="single" w:sz="4" w:space="0" w:color="000000"/>
               <w:left w:val="single" w:sz="4" w:space="0" w:color="000000"/>
@@ -4081,7 +4123,7 @@
         </w:tc>
         <w:tc>
           <w:tcPr>
-            <w:tcW w:w="3401" w:type="dxa"/>
+            <w:tcW w:w="3402" w:type="dxa"/>
             <w:tcBorders>
               <w:top w:val="single" w:sz="4" w:space="0" w:color="000000"/>
               <w:left w:val="single" w:sz="4" w:space="0" w:color="000000"/>
@@ -4140,7 +4182,7 @@
         <w:trPr/>
         <w:tc>
           <w:tcPr>
-            <w:tcW w:w="2199" w:type="dxa"/>
+            <w:tcW w:w="2198" w:type="dxa"/>
             <w:tcBorders>
               <w:top w:val="single" w:sz="4" w:space="0" w:color="000000"/>
               <w:left w:val="single" w:sz="4" w:space="0" w:color="000000"/>
@@ -4162,7 +4204,7 @@
         </w:tc>
         <w:tc>
           <w:tcPr>
-            <w:tcW w:w="3401" w:type="dxa"/>
+            <w:tcW w:w="3402" w:type="dxa"/>
             <w:tcBorders>
               <w:top w:val="single" w:sz="4" w:space="0" w:color="000000"/>
               <w:left w:val="single" w:sz="4" w:space="0" w:color="000000"/>
@@ -4221,7 +4263,7 @@
         <w:trPr/>
         <w:tc>
           <w:tcPr>
-            <w:tcW w:w="2199" w:type="dxa"/>
+            <w:tcW w:w="2198" w:type="dxa"/>
             <w:tcBorders>
               <w:top w:val="single" w:sz="4" w:space="0" w:color="000000"/>
               <w:left w:val="single" w:sz="4" w:space="0" w:color="000000"/>
@@ -4243,7 +4285,7 @@
         </w:tc>
         <w:tc>
           <w:tcPr>
-            <w:tcW w:w="3401" w:type="dxa"/>
+            <w:tcW w:w="3402" w:type="dxa"/>
             <w:tcBorders>
               <w:top w:val="single" w:sz="4" w:space="0" w:color="000000"/>
               <w:left w:val="single" w:sz="4" w:space="0" w:color="000000"/>
@@ -5534,7 +5576,7 @@
       <w:pgNumType w:fmt="decimal"/>
       <w:formProt w:val="false"/>
       <w:textDirection w:val="lrTb"/>
-      <w:docGrid w:type="default" w:linePitch="360" w:charSpace="6143"/>
+      <w:docGrid w:type="default" w:linePitch="360" w:charSpace="5938"/>
     </w:sectPr>
   </w:body>
 </w:document>
@@ -5562,6 +5604,7 @@
     <w:qFormat/>
     <w:pPr>
       <w:widowControl/>
+      <w:suppressAutoHyphens w:val="true"/>
       <w:bidi w:val="0"/>
       <w:spacing w:before="0" w:after="0"/>
       <w:jc w:val="left"/>
@@ -5780,6 +5823,7 @@
     <w:qFormat/>
     <w:pPr>
       <w:widowControl/>
+      <w:suppressAutoHyphens w:val="true"/>
       <w:bidi w:val="0"/>
       <w:spacing w:before="0" w:after="0"/>
       <w:jc w:val="left"/>
@@ -5800,6 +5844,7 @@
     <w:qFormat/>
     <w:pPr>
       <w:widowControl/>
+      <w:suppressAutoHyphens w:val="true"/>
       <w:bidi w:val="0"/>
       <w:spacing w:before="0" w:after="0"/>
       <w:jc w:val="left"/>

</xml_diff>

<commit_message>
fill: what should NOT change the answer
</commit_message>
<xml_diff>
--- a/forms/A2_form.docx
+++ b/forms/A2_form.docx
@@ -1440,12 +1440,259 @@
           </w:tcPr>
           <w:p>
             <w:pPr>
-              <w:pStyle w:val="Normal"/>
-              <w:spacing w:before="0" w:after="80"/>
-              <w:rPr/>
-            </w:pPr>
-            <w:r>
-              <w:rPr/>
+              <w:pStyle w:val="BodyText"/>
+              <w:spacing w:before="0" w:after="80"/>
+              <w:rPr>
+                <w:b w:val="false"/>
+              </w:rPr>
+            </w:pPr>
+            <w:bookmarkStart w:id="1" w:name="docs-internal-guid-e4ac7d8a-7fff-fbf7-4d"/>
+            <w:bookmarkEnd w:id="1"/>
+            <w:r>
+              <w:rPr>
+                <w:rFonts w:ascii="Arial;sans-serif" w:hAnsi="Arial;sans-serif"/>
+                <w:b/>
+                <w:i w:val="false"/>
+                <w:caps w:val="false"/>
+                <w:smallCaps w:val="false"/>
+                <w:strike w:val="false"/>
+                <w:dstrike w:val="false"/>
+                <w:color w:val="000000"/>
+                <w:sz w:val="22"/>
+                <w:u w:val="none"/>
+                <w:effect w:val="none"/>
+                <w:shd w:fill="auto" w:val="clear"/>
+              </w:rPr>
+              <w:t>1. Page Position &amp; Layout Topology:</w:t>
+            </w:r>
+            <w:r>
+              <w:rPr>
+                <w:b w:val="false"/>
+                <w:caps w:val="false"/>
+                <w:smallCaps w:val="false"/>
+                <w:strike w:val="false"/>
+                <w:dstrike w:val="false"/>
+                <w:color w:val="000000"/>
+                <w:u w:val="none"/>
+                <w:effect w:val="none"/>
+                <w:shd w:fill="auto" w:val="clear"/>
+              </w:rPr>
+              <w:t xml:space="preserve"> </w:t>
+            </w:r>
+            <w:r>
+              <w:rPr>
+                <w:rFonts w:ascii="Arial;sans-serif" w:hAnsi="Arial;sans-serif"/>
+                <w:b w:val="false"/>
+                <w:i w:val="false"/>
+                <w:caps w:val="false"/>
+                <w:smallCaps w:val="false"/>
+                <w:strike w:val="false"/>
+                <w:dstrike w:val="false"/>
+                <w:color w:val="000000"/>
+                <w:sz w:val="22"/>
+                <w:u w:val="none"/>
+                <w:effect w:val="none"/>
+                <w:shd w:fill="auto" w:val="clear"/>
+              </w:rPr>
+              <w:t xml:space="preserve">The factual meaning of a physics definition or a chemical equation remains exactly the same whether it appears in a standard running paragraph, inside a cell of a multi-column table, or rotated as a label next to a circuit diagram. The layout detection and text extraction must be robust to </w:t>
+            </w:r>
+            <w:r>
+              <w:rPr>
+                <w:rFonts w:ascii="Arial;sans-serif" w:hAnsi="Arial;sans-serif"/>
+                <w:b/>
+                <w:i w:val="false"/>
+                <w:caps w:val="false"/>
+                <w:smallCaps w:val="false"/>
+                <w:strike w:val="false"/>
+                <w:dstrike w:val="false"/>
+                <w:color w:val="000000"/>
+                <w:sz w:val="22"/>
+                <w:u w:val="none"/>
+                <w:effect w:val="none"/>
+                <w:shd w:fill="auto" w:val="clear"/>
+              </w:rPr>
+              <w:t>where</w:t>
+            </w:r>
+            <w:r>
+              <w:rPr>
+                <w:b w:val="false"/>
+                <w:caps w:val="false"/>
+                <w:smallCaps w:val="false"/>
+                <w:strike w:val="false"/>
+                <w:dstrike w:val="false"/>
+                <w:color w:val="000000"/>
+                <w:u w:val="none"/>
+                <w:effect w:val="none"/>
+                <w:shd w:fill="auto" w:val="clear"/>
+              </w:rPr>
+              <w:t xml:space="preserve"> </w:t>
+            </w:r>
+            <w:r>
+              <w:rPr>
+                <w:rFonts w:ascii="Arial;sans-serif" w:hAnsi="Arial;sans-serif"/>
+                <w:b w:val="false"/>
+                <w:i w:val="false"/>
+                <w:caps w:val="false"/>
+                <w:smallCaps w:val="false"/>
+                <w:strike w:val="false"/>
+                <w:dstrike w:val="false"/>
+                <w:color w:val="000000"/>
+                <w:sz w:val="22"/>
+                <w:u w:val="none"/>
+                <w:effect w:val="none"/>
+                <w:shd w:fill="auto" w:val="clear"/>
+              </w:rPr>
+              <w:t>and how the text is geometrically placed on the page.</w:t>
+            </w:r>
+          </w:p>
+          <w:p>
+            <w:pPr>
+              <w:pStyle w:val="BodyText"/>
+              <w:bidi w:val="0"/>
+              <w:spacing w:lineRule="auto" w:line="331" w:before="0" w:after="80"/>
+              <w:ind w:hanging="0" w:left="0" w:right="0"/>
+              <w:rPr>
+                <w:b w:val="false"/>
+              </w:rPr>
+            </w:pPr>
+            <w:r>
+              <w:rPr>
+                <w:rFonts w:ascii="Arial;sans-serif" w:hAnsi="Arial;sans-serif"/>
+                <w:b/>
+                <w:i w:val="false"/>
+                <w:caps w:val="false"/>
+                <w:smallCaps w:val="false"/>
+                <w:strike w:val="false"/>
+                <w:dstrike w:val="false"/>
+                <w:color w:val="000000"/>
+                <w:sz w:val="22"/>
+                <w:u w:val="none"/>
+                <w:effect w:val="none"/>
+                <w:shd w:fill="auto" w:val="clear"/>
+              </w:rPr>
+              <w:t>2. Font Variations &amp; Scales:</w:t>
+            </w:r>
+            <w:r>
+              <w:rPr>
+                <w:b w:val="false"/>
+                <w:caps w:val="false"/>
+                <w:smallCaps w:val="false"/>
+                <w:strike w:val="false"/>
+                <w:dstrike w:val="false"/>
+                <w:color w:val="000000"/>
+                <w:u w:val="none"/>
+                <w:effect w:val="none"/>
+                <w:shd w:fill="auto" w:val="clear"/>
+              </w:rPr>
+              <w:t xml:space="preserve"> </w:t>
+            </w:r>
+            <w:r>
+              <w:rPr>
+                <w:rFonts w:ascii="Arial;sans-serif" w:hAnsi="Arial;sans-serif"/>
+                <w:b w:val="false"/>
+                <w:i w:val="false"/>
+                <w:caps w:val="false"/>
+                <w:smallCaps w:val="false"/>
+                <w:strike w:val="false"/>
+                <w:dstrike w:val="false"/>
+                <w:color w:val="000000"/>
+                <w:sz w:val="22"/>
+                <w:u w:val="none"/>
+                <w:effect w:val="none"/>
+                <w:shd w:fill="auto" w:val="clear"/>
+              </w:rPr>
+              <w:t>The books use different font sizes and weights for chapter headings, body text, and tiny sub/superscripts in formulas. The OCR model must accurately read the characters regardless of these scaling and styling differences.</w:t>
+            </w:r>
+          </w:p>
+          <w:p>
+            <w:pPr>
+              <w:pStyle w:val="BodyText"/>
+              <w:bidi w:val="0"/>
+              <w:spacing w:lineRule="auto" w:line="331" w:before="0" w:after="80"/>
+              <w:ind w:hanging="0" w:left="0" w:right="0"/>
+              <w:rPr/>
+            </w:pPr>
+            <w:r>
+              <w:rPr>
+                <w:rFonts w:ascii="Arial;sans-serif" w:hAnsi="Arial;sans-serif"/>
+                <w:b/>
+                <w:i w:val="false"/>
+                <w:caps w:val="false"/>
+                <w:smallCaps w:val="false"/>
+                <w:strike w:val="false"/>
+                <w:dstrike w:val="false"/>
+                <w:color w:val="000000"/>
+                <w:sz w:val="22"/>
+                <w:u w:val="none"/>
+                <w:effect w:val="none"/>
+                <w:shd w:fill="auto" w:val="clear"/>
+              </w:rPr>
+              <w:t>3. Proximity and Lack of Whitespace:</w:t>
+            </w:r>
+            <w:r>
+              <w:rPr>
+                <w:b w:val="false"/>
+                <w:caps w:val="false"/>
+                <w:smallCaps w:val="false"/>
+                <w:strike w:val="false"/>
+                <w:dstrike w:val="false"/>
+                <w:color w:val="000000"/>
+                <w:u w:val="none"/>
+                <w:effect w:val="none"/>
+                <w:shd w:fill="auto" w:val="clear"/>
+              </w:rPr>
+              <w:t xml:space="preserve"> </w:t>
+            </w:r>
+            <w:r>
+              <w:rPr>
+                <w:rFonts w:ascii="Arial;sans-serif" w:hAnsi="Arial;sans-serif"/>
+                <w:b w:val="false"/>
+                <w:i w:val="false"/>
+                <w:caps w:val="false"/>
+                <w:smallCaps w:val="false"/>
+                <w:strike w:val="false"/>
+                <w:dstrike w:val="false"/>
+                <w:color w:val="000000"/>
+                <w:sz w:val="22"/>
+                <w:u w:val="none"/>
+                <w:effect w:val="none"/>
+                <w:shd w:fill="auto" w:val="clear"/>
+              </w:rPr>
+              <w:t>The scientific meaning of a formula (like $H_2SO_4$) is invariant to whether it is padded with whitespace or bound tightly to a Bangla suffix (like "$H_2SO_4$-</w:t>
+            </w:r>
+            <w:r>
+              <w:rPr>
+                <w:rFonts w:cs="Arial;sans-serif"/>
+                <w:bCs w:val="false"/>
+                <w:iCs w:val="false"/>
+                <w:caps w:val="false"/>
+                <w:smallCaps w:val="false"/>
+                <w:strike w:val="false"/>
+                <w:dstrike w:val="false"/>
+                <w:color w:val="000000"/>
+                <w:szCs w:val="22"/>
+                <w:u w:val="none"/>
+                <w:effect w:val="none"/>
+                <w:shd w:fill="auto" w:val="clear"/>
+              </w:rPr>
+              <w:t>এর</w:t>
+            </w:r>
+            <w:r>
+              <w:rPr>
+                <w:rFonts w:ascii="Arial;sans-serif" w:hAnsi="Arial;sans-serif"/>
+                <w:b w:val="false"/>
+                <w:i w:val="false"/>
+                <w:caps w:val="false"/>
+                <w:smallCaps w:val="false"/>
+                <w:strike w:val="false"/>
+                <w:dstrike w:val="false"/>
+                <w:color w:val="000000"/>
+                <w:sz w:val="22"/>
+                <w:u w:val="none"/>
+                <w:effect w:val="none"/>
+                <w:shd w:fill="auto" w:val="clear"/>
+              </w:rPr>
+              <w:t>"). The sequence models must be robust to these missing token boundaries and not misinterpret the fused string.</w:t>
             </w:r>
           </w:p>
         </w:tc>

</xml_diff>

<commit_message>
layout detection comparison completed with the form being filled up for layout detection
</commit_message>
<xml_diff>
--- a/forms/A2_form.docx
+++ b/forms/A2_form.docx
@@ -228,10 +228,10 @@
         </w:tblCellMar>
       </w:tblPr>
       <w:tblGrid>
-        <w:gridCol w:w="1698"/>
-        <w:gridCol w:w="3001"/>
-        <w:gridCol w:w="2362"/>
-        <w:gridCol w:w="2298"/>
+        <w:gridCol w:w="1697"/>
+        <w:gridCol w:w="3002"/>
+        <w:gridCol w:w="2363"/>
+        <w:gridCol w:w="2297"/>
       </w:tblGrid>
       <w:tr>
         <w:trPr>
@@ -239,7 +239,7 @@
         </w:trPr>
         <w:tc>
           <w:tcPr>
-            <w:tcW w:w="1698" w:type="dxa"/>
+            <w:tcW w:w="1697" w:type="dxa"/>
             <w:tcBorders>
               <w:top w:val="single" w:sz="4" w:space="0" w:color="000000"/>
               <w:left w:val="single" w:sz="4" w:space="0" w:color="000000"/>
@@ -266,7 +266,7 @@
         </w:tc>
         <w:tc>
           <w:tcPr>
-            <w:tcW w:w="3001" w:type="dxa"/>
+            <w:tcW w:w="3002" w:type="dxa"/>
             <w:tcBorders>
               <w:top w:val="single" w:sz="4" w:space="0" w:color="000000"/>
               <w:left w:val="single" w:sz="4" w:space="0" w:color="000000"/>
@@ -293,7 +293,7 @@
         </w:tc>
         <w:tc>
           <w:tcPr>
-            <w:tcW w:w="2362" w:type="dxa"/>
+            <w:tcW w:w="2363" w:type="dxa"/>
             <w:tcBorders>
               <w:top w:val="single" w:sz="4" w:space="0" w:color="000000"/>
               <w:left w:val="single" w:sz="4" w:space="0" w:color="000000"/>
@@ -320,7 +320,7 @@
         </w:tc>
         <w:tc>
           <w:tcPr>
-            <w:tcW w:w="2298" w:type="dxa"/>
+            <w:tcW w:w="2297" w:type="dxa"/>
             <w:tcBorders>
               <w:top w:val="single" w:sz="4" w:space="0" w:color="000000"/>
               <w:left w:val="single" w:sz="4" w:space="0" w:color="000000"/>
@@ -350,7 +350,7 @@
         <w:trPr/>
         <w:tc>
           <w:tcPr>
-            <w:tcW w:w="1698" w:type="dxa"/>
+            <w:tcW w:w="1697" w:type="dxa"/>
             <w:tcBorders>
               <w:top w:val="single" w:sz="4" w:space="0" w:color="000000"/>
               <w:left w:val="single" w:sz="4" w:space="0" w:color="000000"/>
@@ -372,49 +372,49 @@
         </w:tc>
         <w:tc>
           <w:tcPr>
-            <w:tcW w:w="3001" w:type="dxa"/>
-            <w:tcBorders>
-              <w:top w:val="single" w:sz="4" w:space="0" w:color="000000"/>
-              <w:left w:val="single" w:sz="4" w:space="0" w:color="000000"/>
-              <w:bottom w:val="single" w:sz="4" w:space="0" w:color="000000"/>
-              <w:right w:val="single" w:sz="4" w:space="0" w:color="000000"/>
-            </w:tcBorders>
-          </w:tcPr>
-          <w:p>
-            <w:pPr>
-              <w:pStyle w:val="Normal"/>
-              <w:spacing w:before="0" w:after="80"/>
-              <w:rPr/>
-            </w:pPr>
-            <w:r>
-              <w:rPr/>
-            </w:r>
-          </w:p>
-        </w:tc>
-        <w:tc>
-          <w:tcPr>
-            <w:tcW w:w="2362" w:type="dxa"/>
-            <w:tcBorders>
-              <w:top w:val="single" w:sz="4" w:space="0" w:color="000000"/>
-              <w:left w:val="single" w:sz="4" w:space="0" w:color="000000"/>
-              <w:bottom w:val="single" w:sz="4" w:space="0" w:color="000000"/>
-              <w:right w:val="single" w:sz="4" w:space="0" w:color="000000"/>
-            </w:tcBorders>
-          </w:tcPr>
-          <w:p>
-            <w:pPr>
-              <w:pStyle w:val="Normal"/>
-              <w:spacing w:before="0" w:after="80"/>
-              <w:rPr/>
-            </w:pPr>
-            <w:r>
-              <w:rPr/>
-            </w:r>
-          </w:p>
-        </w:tc>
-        <w:tc>
-          <w:tcPr>
-            <w:tcW w:w="2298" w:type="dxa"/>
+            <w:tcW w:w="3002" w:type="dxa"/>
+            <w:tcBorders>
+              <w:top w:val="single" w:sz="4" w:space="0" w:color="000000"/>
+              <w:left w:val="single" w:sz="4" w:space="0" w:color="000000"/>
+              <w:bottom w:val="single" w:sz="4" w:space="0" w:color="000000"/>
+              <w:right w:val="single" w:sz="4" w:space="0" w:color="000000"/>
+            </w:tcBorders>
+          </w:tcPr>
+          <w:p>
+            <w:pPr>
+              <w:pStyle w:val="Normal"/>
+              <w:spacing w:before="0" w:after="80"/>
+              <w:rPr/>
+            </w:pPr>
+            <w:r>
+              <w:rPr/>
+            </w:r>
+          </w:p>
+        </w:tc>
+        <w:tc>
+          <w:tcPr>
+            <w:tcW w:w="2363" w:type="dxa"/>
+            <w:tcBorders>
+              <w:top w:val="single" w:sz="4" w:space="0" w:color="000000"/>
+              <w:left w:val="single" w:sz="4" w:space="0" w:color="000000"/>
+              <w:bottom w:val="single" w:sz="4" w:space="0" w:color="000000"/>
+              <w:right w:val="single" w:sz="4" w:space="0" w:color="000000"/>
+            </w:tcBorders>
+          </w:tcPr>
+          <w:p>
+            <w:pPr>
+              <w:pStyle w:val="Normal"/>
+              <w:spacing w:before="0" w:after="80"/>
+              <w:rPr/>
+            </w:pPr>
+            <w:r>
+              <w:rPr/>
+            </w:r>
+          </w:p>
+        </w:tc>
+        <w:tc>
+          <w:tcPr>
+            <w:tcW w:w="2297" w:type="dxa"/>
             <w:tcBorders>
               <w:top w:val="single" w:sz="4" w:space="0" w:color="000000"/>
               <w:left w:val="single" w:sz="4" w:space="0" w:color="000000"/>
@@ -438,7 +438,7 @@
         <w:trPr/>
         <w:tc>
           <w:tcPr>
-            <w:tcW w:w="1698" w:type="dxa"/>
+            <w:tcW w:w="1697" w:type="dxa"/>
             <w:tcBorders>
               <w:top w:val="single" w:sz="4" w:space="0" w:color="000000"/>
               <w:left w:val="single" w:sz="4" w:space="0" w:color="000000"/>
@@ -460,49 +460,49 @@
         </w:tc>
         <w:tc>
           <w:tcPr>
-            <w:tcW w:w="3001" w:type="dxa"/>
-            <w:tcBorders>
-              <w:top w:val="single" w:sz="4" w:space="0" w:color="000000"/>
-              <w:left w:val="single" w:sz="4" w:space="0" w:color="000000"/>
-              <w:bottom w:val="single" w:sz="4" w:space="0" w:color="000000"/>
-              <w:right w:val="single" w:sz="4" w:space="0" w:color="000000"/>
-            </w:tcBorders>
-          </w:tcPr>
-          <w:p>
-            <w:pPr>
-              <w:pStyle w:val="Normal"/>
-              <w:spacing w:before="0" w:after="80"/>
-              <w:rPr/>
-            </w:pPr>
-            <w:r>
-              <w:rPr/>
-            </w:r>
-          </w:p>
-        </w:tc>
-        <w:tc>
-          <w:tcPr>
-            <w:tcW w:w="2362" w:type="dxa"/>
-            <w:tcBorders>
-              <w:top w:val="single" w:sz="4" w:space="0" w:color="000000"/>
-              <w:left w:val="single" w:sz="4" w:space="0" w:color="000000"/>
-              <w:bottom w:val="single" w:sz="4" w:space="0" w:color="000000"/>
-              <w:right w:val="single" w:sz="4" w:space="0" w:color="000000"/>
-            </w:tcBorders>
-          </w:tcPr>
-          <w:p>
-            <w:pPr>
-              <w:pStyle w:val="Normal"/>
-              <w:spacing w:before="0" w:after="80"/>
-              <w:rPr/>
-            </w:pPr>
-            <w:r>
-              <w:rPr/>
-            </w:r>
-          </w:p>
-        </w:tc>
-        <w:tc>
-          <w:tcPr>
-            <w:tcW w:w="2298" w:type="dxa"/>
+            <w:tcW w:w="3002" w:type="dxa"/>
+            <w:tcBorders>
+              <w:top w:val="single" w:sz="4" w:space="0" w:color="000000"/>
+              <w:left w:val="single" w:sz="4" w:space="0" w:color="000000"/>
+              <w:bottom w:val="single" w:sz="4" w:space="0" w:color="000000"/>
+              <w:right w:val="single" w:sz="4" w:space="0" w:color="000000"/>
+            </w:tcBorders>
+          </w:tcPr>
+          <w:p>
+            <w:pPr>
+              <w:pStyle w:val="Normal"/>
+              <w:spacing w:before="0" w:after="80"/>
+              <w:rPr/>
+            </w:pPr>
+            <w:r>
+              <w:rPr/>
+            </w:r>
+          </w:p>
+        </w:tc>
+        <w:tc>
+          <w:tcPr>
+            <w:tcW w:w="2363" w:type="dxa"/>
+            <w:tcBorders>
+              <w:top w:val="single" w:sz="4" w:space="0" w:color="000000"/>
+              <w:left w:val="single" w:sz="4" w:space="0" w:color="000000"/>
+              <w:bottom w:val="single" w:sz="4" w:space="0" w:color="000000"/>
+              <w:right w:val="single" w:sz="4" w:space="0" w:color="000000"/>
+            </w:tcBorders>
+          </w:tcPr>
+          <w:p>
+            <w:pPr>
+              <w:pStyle w:val="Normal"/>
+              <w:spacing w:before="0" w:after="80"/>
+              <w:rPr/>
+            </w:pPr>
+            <w:r>
+              <w:rPr/>
+            </w:r>
+          </w:p>
+        </w:tc>
+        <w:tc>
+          <w:tcPr>
+            <w:tcW w:w="2297" w:type="dxa"/>
             <w:tcBorders>
               <w:top w:val="single" w:sz="4" w:space="0" w:color="000000"/>
               <w:left w:val="single" w:sz="4" w:space="0" w:color="000000"/>
@@ -526,7 +526,7 @@
         <w:trPr/>
         <w:tc>
           <w:tcPr>
-            <w:tcW w:w="1698" w:type="dxa"/>
+            <w:tcW w:w="1697" w:type="dxa"/>
             <w:tcBorders>
               <w:top w:val="single" w:sz="4" w:space="0" w:color="000000"/>
               <w:left w:val="single" w:sz="4" w:space="0" w:color="000000"/>
@@ -548,49 +548,49 @@
         </w:tc>
         <w:tc>
           <w:tcPr>
-            <w:tcW w:w="3001" w:type="dxa"/>
-            <w:tcBorders>
-              <w:top w:val="single" w:sz="4" w:space="0" w:color="000000"/>
-              <w:left w:val="single" w:sz="4" w:space="0" w:color="000000"/>
-              <w:bottom w:val="single" w:sz="4" w:space="0" w:color="000000"/>
-              <w:right w:val="single" w:sz="4" w:space="0" w:color="000000"/>
-            </w:tcBorders>
-          </w:tcPr>
-          <w:p>
-            <w:pPr>
-              <w:pStyle w:val="Normal"/>
-              <w:spacing w:before="0" w:after="80"/>
-              <w:rPr/>
-            </w:pPr>
-            <w:r>
-              <w:rPr/>
-            </w:r>
-          </w:p>
-        </w:tc>
-        <w:tc>
-          <w:tcPr>
-            <w:tcW w:w="2362" w:type="dxa"/>
-            <w:tcBorders>
-              <w:top w:val="single" w:sz="4" w:space="0" w:color="000000"/>
-              <w:left w:val="single" w:sz="4" w:space="0" w:color="000000"/>
-              <w:bottom w:val="single" w:sz="4" w:space="0" w:color="000000"/>
-              <w:right w:val="single" w:sz="4" w:space="0" w:color="000000"/>
-            </w:tcBorders>
-          </w:tcPr>
-          <w:p>
-            <w:pPr>
-              <w:pStyle w:val="Normal"/>
-              <w:spacing w:before="0" w:after="80"/>
-              <w:rPr/>
-            </w:pPr>
-            <w:r>
-              <w:rPr/>
-            </w:r>
-          </w:p>
-        </w:tc>
-        <w:tc>
-          <w:tcPr>
-            <w:tcW w:w="2298" w:type="dxa"/>
+            <w:tcW w:w="3002" w:type="dxa"/>
+            <w:tcBorders>
+              <w:top w:val="single" w:sz="4" w:space="0" w:color="000000"/>
+              <w:left w:val="single" w:sz="4" w:space="0" w:color="000000"/>
+              <w:bottom w:val="single" w:sz="4" w:space="0" w:color="000000"/>
+              <w:right w:val="single" w:sz="4" w:space="0" w:color="000000"/>
+            </w:tcBorders>
+          </w:tcPr>
+          <w:p>
+            <w:pPr>
+              <w:pStyle w:val="Normal"/>
+              <w:spacing w:before="0" w:after="80"/>
+              <w:rPr/>
+            </w:pPr>
+            <w:r>
+              <w:rPr/>
+            </w:r>
+          </w:p>
+        </w:tc>
+        <w:tc>
+          <w:tcPr>
+            <w:tcW w:w="2363" w:type="dxa"/>
+            <w:tcBorders>
+              <w:top w:val="single" w:sz="4" w:space="0" w:color="000000"/>
+              <w:left w:val="single" w:sz="4" w:space="0" w:color="000000"/>
+              <w:bottom w:val="single" w:sz="4" w:space="0" w:color="000000"/>
+              <w:right w:val="single" w:sz="4" w:space="0" w:color="000000"/>
+            </w:tcBorders>
+          </w:tcPr>
+          <w:p>
+            <w:pPr>
+              <w:pStyle w:val="Normal"/>
+              <w:spacing w:before="0" w:after="80"/>
+              <w:rPr/>
+            </w:pPr>
+            <w:r>
+              <w:rPr/>
+            </w:r>
+          </w:p>
+        </w:tc>
+        <w:tc>
+          <w:tcPr>
+            <w:tcW w:w="2297" w:type="dxa"/>
             <w:tcBorders>
               <w:top w:val="single" w:sz="4" w:space="0" w:color="000000"/>
               <w:left w:val="single" w:sz="4" w:space="0" w:color="000000"/>
@@ -1327,14 +1327,7 @@
                 <w:b/>
                 <w:bCs/>
               </w:rPr>
-              <w:t xml:space="preserve">2. </w:t>
-            </w:r>
-            <w:r>
-              <w:rPr>
-                <w:b/>
-                <w:bCs/>
-              </w:rPr>
-              <w:t>High-Density Conjuncts (</w:t>
+              <w:t>2. High-Density Conjuncts (</w:t>
             </w:r>
             <w:r>
               <w:rPr>
@@ -1367,14 +1360,7 @@
                 <w:b/>
                 <w:bCs/>
               </w:rPr>
-              <w:t xml:space="preserve">3. </w:t>
-            </w:r>
-            <w:r>
-              <w:rPr>
-                <w:b/>
-                <w:bCs/>
-              </w:rPr>
-              <w:t>Domain-Specific Context:</w:t>
+              <w:t>3. Domain-Specific Context:</w:t>
             </w:r>
             <w:r>
               <w:rPr/>
@@ -1751,8 +1737,8 @@
         </w:tblCellMar>
       </w:tblPr>
       <w:tblGrid>
-        <w:gridCol w:w="1698"/>
-        <w:gridCol w:w="2902"/>
+        <w:gridCol w:w="1697"/>
+        <w:gridCol w:w="2903"/>
         <w:gridCol w:w="3199"/>
         <w:gridCol w:w="1560"/>
       </w:tblGrid>
@@ -1762,7 +1748,7 @@
         </w:trPr>
         <w:tc>
           <w:tcPr>
-            <w:tcW w:w="1698" w:type="dxa"/>
+            <w:tcW w:w="1697" w:type="dxa"/>
             <w:tcBorders>
               <w:top w:val="single" w:sz="4" w:space="0" w:color="000000"/>
               <w:left w:val="single" w:sz="4" w:space="0" w:color="000000"/>
@@ -1789,7 +1775,7 @@
         </w:tc>
         <w:tc>
           <w:tcPr>
-            <w:tcW w:w="2902" w:type="dxa"/>
+            <w:tcW w:w="2903" w:type="dxa"/>
             <w:tcBorders>
               <w:top w:val="single" w:sz="4" w:space="0" w:color="000000"/>
               <w:left w:val="single" w:sz="4" w:space="0" w:color="000000"/>
@@ -1873,7 +1859,7 @@
         <w:trPr/>
         <w:tc>
           <w:tcPr>
-            <w:tcW w:w="1698" w:type="dxa"/>
+            <w:tcW w:w="1697" w:type="dxa"/>
             <w:tcBorders>
               <w:top w:val="single" w:sz="4" w:space="0" w:color="000000"/>
               <w:left w:val="single" w:sz="4" w:space="0" w:color="000000"/>
@@ -1895,7 +1881,7 @@
         </w:tc>
         <w:tc>
           <w:tcPr>
-            <w:tcW w:w="2902" w:type="dxa"/>
+            <w:tcW w:w="2903" w:type="dxa"/>
             <w:tcBorders>
               <w:top w:val="single" w:sz="4" w:space="0" w:color="000000"/>
               <w:left w:val="single" w:sz="4" w:space="0" w:color="000000"/>
@@ -1968,7 +1954,7 @@
         <w:trPr/>
         <w:tc>
           <w:tcPr>
-            <w:tcW w:w="1698" w:type="dxa"/>
+            <w:tcW w:w="1697" w:type="dxa"/>
             <w:tcBorders>
               <w:top w:val="single" w:sz="4" w:space="0" w:color="000000"/>
               <w:left w:val="single" w:sz="4" w:space="0" w:color="000000"/>
@@ -1990,7 +1976,547 @@
         </w:tc>
         <w:tc>
           <w:tcPr>
-            <w:tcW w:w="2902" w:type="dxa"/>
+            <w:tcW w:w="2903" w:type="dxa"/>
+            <w:tcBorders>
+              <w:top w:val="single" w:sz="4" w:space="0" w:color="000000"/>
+              <w:left w:val="single" w:sz="4" w:space="0" w:color="000000"/>
+              <w:bottom w:val="single" w:sz="4" w:space="0" w:color="000000"/>
+              <w:right w:val="single" w:sz="4" w:space="0" w:color="000000"/>
+            </w:tcBorders>
+          </w:tcPr>
+          <w:p>
+            <w:pPr>
+              <w:pStyle w:val="BodyText"/>
+              <w:spacing w:before="0" w:after="80"/>
+              <w:rPr>
+                <w:b w:val="false"/>
+              </w:rPr>
+            </w:pPr>
+            <w:bookmarkStart w:id="2" w:name="docs-internal-guid-52421522-7fff-2a18-12"/>
+            <w:bookmarkEnd w:id="2"/>
+            <w:r>
+              <w:rPr>
+                <w:rFonts w:ascii="Arial;sans-serif" w:hAnsi="Arial;sans-serif"/>
+                <w:b w:val="false"/>
+                <w:i w:val="false"/>
+                <w:iCs/>
+                <w:caps w:val="false"/>
+                <w:smallCaps w:val="false"/>
+                <w:strike w:val="false"/>
+                <w:dstrike w:val="false"/>
+                <w:color w:val="595959"/>
+                <w:sz w:val="18"/>
+                <w:szCs w:val="18"/>
+                <w:u w:val="none"/>
+                <w:effect w:val="none"/>
+                <w:shd w:fill="auto" w:val="clear"/>
+              </w:rPr>
+              <w:t xml:space="preserve">1.  </w:t>
+            </w:r>
+            <w:r>
+              <w:rPr>
+                <w:rFonts w:ascii="Arial;sans-serif" w:hAnsi="Arial;sans-serif"/>
+                <w:b/>
+                <w:i w:val="false"/>
+                <w:iCs/>
+                <w:caps w:val="false"/>
+                <w:smallCaps w:val="false"/>
+                <w:strike w:val="false"/>
+                <w:dstrike w:val="false"/>
+                <w:color w:val="595959"/>
+                <w:sz w:val="18"/>
+                <w:szCs w:val="18"/>
+                <w:u w:val="none"/>
+                <w:effect w:val="none"/>
+                <w:shd w:fill="auto" w:val="clear"/>
+              </w:rPr>
+              <w:t>Heuristic (uniform-block segmentation):</w:t>
+            </w:r>
+            <w:r>
+              <w:rPr>
+                <w:b w:val="false"/>
+                <w:i/>
+                <w:iCs/>
+                <w:caps w:val="false"/>
+                <w:smallCaps w:val="false"/>
+                <w:strike w:val="false"/>
+                <w:dstrike w:val="false"/>
+                <w:color w:val="595959"/>
+                <w:sz w:val="18"/>
+                <w:szCs w:val="18"/>
+                <w:u w:val="none"/>
+                <w:effect w:val="none"/>
+                <w:shd w:fill="auto" w:val="clear"/>
+              </w:rPr>
+              <w:t xml:space="preserve"> </w:t>
+            </w:r>
+            <w:r>
+              <w:rPr>
+                <w:rFonts w:ascii="Arial;sans-serif" w:hAnsi="Arial;sans-serif"/>
+                <w:b w:val="false"/>
+                <w:i w:val="false"/>
+                <w:iCs/>
+                <w:caps w:val="false"/>
+                <w:smallCaps w:val="false"/>
+                <w:strike w:val="false"/>
+                <w:dstrike w:val="false"/>
+                <w:color w:val="595959"/>
+                <w:sz w:val="18"/>
+                <w:szCs w:val="18"/>
+                <w:u w:val="none"/>
+                <w:effect w:val="none"/>
+                <w:shd w:fill="auto" w:val="clear"/>
+              </w:rPr>
+              <w:t>treats the entire page as a single text block. On Physics p. 61, this collapsed the six-column experiment table header into one scrambled string `(cm) (cm) h/L (s) (m/s)` with the table body reduced to bare row numbers — complete failure on structured content.</w:t>
+            </w:r>
+          </w:p>
+          <w:p>
+            <w:pPr>
+              <w:pStyle w:val="BodyText"/>
+              <w:bidi w:val="0"/>
+              <w:spacing w:lineRule="auto" w:line="331" w:before="0" w:after="80"/>
+              <w:ind w:hanging="0" w:left="0" w:right="0"/>
+              <w:rPr/>
+            </w:pPr>
+            <w:r>
+              <w:rPr>
+                <w:rFonts w:ascii="Arial;sans-serif" w:hAnsi="Arial;sans-serif"/>
+                <w:b w:val="false"/>
+                <w:i w:val="false"/>
+                <w:caps w:val="false"/>
+                <w:smallCaps w:val="false"/>
+                <w:strike w:val="false"/>
+                <w:dstrike w:val="false"/>
+                <w:color w:val="595959"/>
+                <w:sz w:val="18"/>
+                <w:u w:val="none"/>
+                <w:effect w:val="none"/>
+                <w:shd w:fill="auto" w:val="clear"/>
+              </w:rPr>
+              <w:t xml:space="preserve">2. </w:t>
+            </w:r>
+            <w:r>
+              <w:rPr>
+                <w:rFonts w:ascii="Arial;sans-serif" w:hAnsi="Arial;sans-serif"/>
+                <w:b/>
+                <w:i w:val="false"/>
+                <w:caps w:val="false"/>
+                <w:smallCaps w:val="false"/>
+                <w:strike w:val="false"/>
+                <w:dstrike w:val="false"/>
+                <w:color w:val="595959"/>
+                <w:sz w:val="18"/>
+                <w:u w:val="none"/>
+                <w:effect w:val="none"/>
+                <w:shd w:fill="auto" w:val="clear"/>
+              </w:rPr>
+              <w:t>Object detection model (YOLO11 fine-tuned on DocLayNet):</w:t>
+            </w:r>
+            <w:r>
+              <w:rPr>
+                <w:b w:val="false"/>
+                <w:caps w:val="false"/>
+                <w:smallCaps w:val="false"/>
+                <w:strike w:val="false"/>
+                <w:dstrike w:val="false"/>
+                <w:color w:val="595959"/>
+                <w:u w:val="none"/>
+                <w:effect w:val="none"/>
+                <w:shd w:fill="auto" w:val="clear"/>
+              </w:rPr>
+              <w:t xml:space="preserve"> </w:t>
+            </w:r>
+            <w:r>
+              <w:rPr>
+                <w:rFonts w:ascii="Arial;sans-serif" w:hAnsi="Arial;sans-serif"/>
+                <w:b w:val="false"/>
+                <w:i w:val="false"/>
+                <w:caps w:val="false"/>
+                <w:smallCaps w:val="false"/>
+                <w:strike w:val="false"/>
+                <w:dstrike w:val="false"/>
+                <w:color w:val="595959"/>
+                <w:sz w:val="18"/>
+                <w:u w:val="none"/>
+                <w:effect w:val="none"/>
+                <w:shd w:fill="auto" w:val="clear"/>
+              </w:rPr>
+              <w:t>draws semantic bounding boxes around distinct page regions — Text, Table, Figure, Title, Formula — before any OCR is run.</w:t>
+            </w:r>
+          </w:p>
+        </w:tc>
+        <w:tc>
+          <w:tcPr>
+            <w:tcW w:w="3199" w:type="dxa"/>
+            <w:tcBorders>
+              <w:top w:val="single" w:sz="4" w:space="0" w:color="000000"/>
+              <w:left w:val="single" w:sz="4" w:space="0" w:color="000000"/>
+              <w:bottom w:val="single" w:sz="4" w:space="0" w:color="000000"/>
+              <w:right w:val="single" w:sz="4" w:space="0" w:color="000000"/>
+            </w:tcBorders>
+          </w:tcPr>
+          <w:p>
+            <w:pPr>
+              <w:pStyle w:val="BodyText"/>
+              <w:spacing w:before="0" w:after="80"/>
+              <w:rPr>
+                <w:b w:val="false"/>
+              </w:rPr>
+            </w:pPr>
+            <w:bookmarkStart w:id="3" w:name="docs-internal-guid-2180b03c-7fff-3b66-df"/>
+            <w:bookmarkEnd w:id="3"/>
+            <w:r>
+              <w:rPr>
+                <w:rFonts w:ascii="Arial;sans-serif" w:hAnsi="Arial;sans-serif"/>
+                <w:b/>
+                <w:i w:val="false"/>
+                <w:caps w:val="false"/>
+                <w:smallCaps w:val="false"/>
+                <w:strike w:val="false"/>
+                <w:dstrike w:val="false"/>
+                <w:color w:val="000000"/>
+                <w:sz w:val="22"/>
+                <w:u w:val="none"/>
+                <w:effect w:val="none"/>
+                <w:shd w:fill="auto" w:val="clear"/>
+              </w:rPr>
+              <w:t>Choice:</w:t>
+            </w:r>
+            <w:r>
+              <w:rPr>
+                <w:b w:val="false"/>
+                <w:caps w:val="false"/>
+                <w:smallCaps w:val="false"/>
+                <w:strike w:val="false"/>
+                <w:dstrike w:val="false"/>
+                <w:color w:val="000000"/>
+                <w:u w:val="none"/>
+                <w:effect w:val="none"/>
+                <w:shd w:fill="auto" w:val="clear"/>
+              </w:rPr>
+              <w:t xml:space="preserve"> </w:t>
+            </w:r>
+            <w:r>
+              <w:rPr>
+                <w:rFonts w:ascii="Arial;sans-serif" w:hAnsi="Arial;sans-serif"/>
+                <w:b w:val="false"/>
+                <w:i w:val="false"/>
+                <w:caps w:val="false"/>
+                <w:smallCaps w:val="false"/>
+                <w:strike w:val="false"/>
+                <w:dstrike w:val="false"/>
+                <w:color w:val="000000"/>
+                <w:sz w:val="22"/>
+                <w:u w:val="none"/>
+                <w:effect w:val="none"/>
+                <w:shd w:fill="auto" w:val="clear"/>
+              </w:rPr>
+              <w:t>YOLO11 nano fine-tuned on DocLayNet (`Armaggheddon/yolo11-document-layout`)</w:t>
+            </w:r>
+          </w:p>
+          <w:p>
+            <w:pPr>
+              <w:pStyle w:val="BodyText"/>
+              <w:bidi w:val="0"/>
+              <w:spacing w:lineRule="auto" w:line="331" w:before="0" w:after="80"/>
+              <w:ind w:hanging="0" w:left="0" w:right="0"/>
+              <w:rPr>
+                <w:rFonts w:ascii="Arial;sans-serif" w:hAnsi="Arial;sans-serif"/>
+                <w:b/>
+                <w:i w:val="false"/>
+                <w:caps w:val="false"/>
+                <w:smallCaps w:val="false"/>
+                <w:strike w:val="false"/>
+                <w:dstrike w:val="false"/>
+                <w:color w:val="000000"/>
+                <w:sz w:val="22"/>
+                <w:u w:val="none"/>
+                <w:effect w:val="none"/>
+                <w:shd w:fill="auto" w:val="clear"/>
+              </w:rPr>
+            </w:pPr>
+            <w:r>
+              <w:rPr/>
+            </w:r>
+          </w:p>
+          <w:p>
+            <w:pPr>
+              <w:pStyle w:val="BodyText"/>
+              <w:bidi w:val="0"/>
+              <w:spacing w:lineRule="auto" w:line="331" w:before="0" w:after="80"/>
+              <w:ind w:hanging="0" w:left="0" w:right="0"/>
+              <w:rPr/>
+            </w:pPr>
+            <w:r>
+              <w:rPr>
+                <w:rFonts w:ascii="Arial;sans-serif" w:hAnsi="Arial;sans-serif"/>
+                <w:b/>
+                <w:i w:val="false"/>
+                <w:caps w:val="false"/>
+                <w:smallCaps w:val="false"/>
+                <w:strike w:val="false"/>
+                <w:dstrike w:val="false"/>
+                <w:color w:val="000000"/>
+                <w:sz w:val="22"/>
+                <w:u w:val="none"/>
+                <w:effect w:val="none"/>
+                <w:shd w:fill="auto" w:val="clear"/>
+              </w:rPr>
+              <w:t>Why:</w:t>
+            </w:r>
+          </w:p>
+          <w:p>
+            <w:pPr>
+              <w:pStyle w:val="BodyText"/>
+              <w:bidi w:val="0"/>
+              <w:spacing w:lineRule="auto" w:line="331" w:before="0" w:after="80"/>
+              <w:ind w:hanging="0" w:left="0" w:right="0"/>
+              <w:rPr>
+                <w:b w:val="false"/>
+              </w:rPr>
+            </w:pPr>
+            <w:r>
+              <w:rPr>
+                <w:rFonts w:ascii="Arial;sans-serif" w:hAnsi="Arial;sans-serif"/>
+                <w:b w:val="false"/>
+                <w:i w:val="false"/>
+                <w:caps w:val="false"/>
+                <w:smallCaps w:val="false"/>
+                <w:strike w:val="false"/>
+                <w:dstrike w:val="false"/>
+                <w:color w:val="000000"/>
+                <w:sz w:val="22"/>
+                <w:u w:val="none"/>
+                <w:effect w:val="none"/>
+                <w:shd w:fill="auto" w:val="clear"/>
+              </w:rPr>
+              <w:t>We tested both options on several pages spanning all three books, covering a deliberate mix of plain prose, multi-column tables, figures with embedded labels, and heading-dense pages. Some example page numbers : Biology p.20, p.80, p.150,</w:t>
+              <w:br/>
+              <w:t>Chemistry p.15, p.100, p.262,</w:t>
+              <w:br/>
+              <w:t>Physics p.10, p.61, p.192.</w:t>
+            </w:r>
+          </w:p>
+          <w:p>
+            <w:pPr>
+              <w:pStyle w:val="BodyText"/>
+              <w:rPr/>
+            </w:pPr>
+            <w:r>
+              <w:rPr/>
+            </w:r>
+          </w:p>
+          <w:p>
+            <w:pPr>
+              <w:pStyle w:val="BodyText"/>
+              <w:bidi w:val="0"/>
+              <w:spacing w:lineRule="auto" w:line="331" w:before="0" w:after="80"/>
+              <w:ind w:hanging="0" w:left="0" w:right="0"/>
+              <w:rPr>
+                <w:rFonts w:ascii="Arial;sans-serif" w:hAnsi="Arial;sans-serif"/>
+                <w:b w:val="false"/>
+                <w:i w:val="false"/>
+                <w:caps w:val="false"/>
+                <w:smallCaps w:val="false"/>
+                <w:strike w:val="false"/>
+                <w:dstrike w:val="false"/>
+                <w:color w:val="000000"/>
+                <w:sz w:val="22"/>
+                <w:u w:val="none"/>
+                <w:effect w:val="none"/>
+                <w:shd w:fill="auto" w:val="clear"/>
+              </w:rPr>
+            </w:pPr>
+            <w:r>
+              <w:rPr>
+                <w:rFonts w:ascii="Arial;sans-serif" w:hAnsi="Arial;sans-serif"/>
+                <w:b w:val="false"/>
+                <w:i w:val="false"/>
+                <w:caps w:val="false"/>
+                <w:smallCaps w:val="false"/>
+                <w:strike w:val="false"/>
+                <w:dstrike w:val="false"/>
+                <w:color w:val="000000"/>
+                <w:sz w:val="22"/>
+                <w:u w:val="none"/>
+                <w:effect w:val="none"/>
+                <w:shd w:fill="auto" w:val="clear"/>
+              </w:rPr>
+              <w:t>The heuristic baseline drew a single bounding box over the entire page in every case — providing zero semantic segmentation. On Physics p.61, this collapsed the six-column experiment table into a scrambled single-line string; on Chemistry p.262, circuit diagram labels bled directly into body text.</w:t>
+            </w:r>
+          </w:p>
+          <w:p>
+            <w:pPr>
+              <w:pStyle w:val="BodyText"/>
+              <w:rPr/>
+            </w:pPr>
+            <w:r>
+              <w:rPr/>
+            </w:r>
+          </w:p>
+          <w:p>
+            <w:pPr>
+              <w:pStyle w:val="BodyText"/>
+              <w:bidi w:val="0"/>
+              <w:spacing w:lineRule="auto" w:line="331" w:before="0" w:after="80"/>
+              <w:ind w:hanging="0" w:left="0" w:right="0"/>
+              <w:rPr>
+                <w:rFonts w:ascii="Arial;sans-serif" w:hAnsi="Arial;sans-serif"/>
+                <w:b w:val="false"/>
+                <w:i w:val="false"/>
+                <w:caps w:val="false"/>
+                <w:smallCaps w:val="false"/>
+                <w:strike w:val="false"/>
+                <w:dstrike w:val="false"/>
+                <w:color w:val="000000"/>
+                <w:sz w:val="22"/>
+                <w:u w:val="none"/>
+                <w:effect w:val="none"/>
+                <w:shd w:fill="auto" w:val="clear"/>
+              </w:rPr>
+            </w:pPr>
+            <w:r>
+              <w:rPr>
+                <w:rFonts w:ascii="Arial;sans-serif" w:hAnsi="Arial;sans-serif"/>
+                <w:b w:val="false"/>
+                <w:i w:val="false"/>
+                <w:caps w:val="false"/>
+                <w:smallCaps w:val="false"/>
+                <w:strike w:val="false"/>
+                <w:dstrike w:val="false"/>
+                <w:color w:val="000000"/>
+                <w:sz w:val="22"/>
+                <w:u w:val="none"/>
+                <w:effect w:val="none"/>
+                <w:shd w:fill="auto" w:val="clear"/>
+              </w:rPr>
+              <w:t>YOLO11-DocLayNet correctly separated headings, text blocks, tables, and figures on almost all of the pages tested. On bio_p080 it missed one of two figures, and on bio_p020 it missed a small text block — both minor recall gaps rather than catastrophic failures. The model's core strength — correctly isolating tables so they are not read as horizontal line noise, and isolating figure regions so embedded Bangla labels do not corrupt body text — held consistently across all pages and all three books.</w:t>
+            </w:r>
+          </w:p>
+          <w:p>
+            <w:pPr>
+              <w:pStyle w:val="BodyText"/>
+              <w:rPr/>
+            </w:pPr>
+            <w:r>
+              <w:rPr/>
+            </w:r>
+          </w:p>
+          <w:p>
+            <w:pPr>
+              <w:pStyle w:val="BodyText"/>
+              <w:bidi w:val="0"/>
+              <w:spacing w:lineRule="auto" w:line="331" w:before="0" w:after="80"/>
+              <w:ind w:hanging="0" w:left="0" w:right="0"/>
+              <w:rPr/>
+            </w:pPr>
+            <w:r>
+              <w:rPr>
+                <w:rFonts w:ascii="Arial;sans-serif" w:hAnsi="Arial;sans-serif"/>
+                <w:b w:val="false"/>
+                <w:i w:val="false"/>
+                <w:caps w:val="false"/>
+                <w:smallCaps w:val="false"/>
+                <w:strike w:val="false"/>
+                <w:dstrike w:val="false"/>
+                <w:color w:val="000000"/>
+                <w:sz w:val="22"/>
+                <w:u w:val="none"/>
+                <w:effect w:val="none"/>
+                <w:shd w:fill="auto" w:val="clear"/>
+              </w:rPr>
+              <w:t>The heuristic produces structurally corrupt OCR input; YOLO11-DocLayNet produces clean, semantically meaningful region crops. Given this evidence, we chose YOLO11-DocLayNet as our layout stage.</w:t>
+            </w:r>
+          </w:p>
+        </w:tc>
+        <w:tc>
+          <w:tcPr>
+            <w:tcW w:w="1560" w:type="dxa"/>
+            <w:tcBorders>
+              <w:top w:val="single" w:sz="4" w:space="0" w:color="000000"/>
+              <w:left w:val="single" w:sz="4" w:space="0" w:color="000000"/>
+              <w:bottom w:val="single" w:sz="4" w:space="0" w:color="000000"/>
+              <w:right w:val="single" w:sz="4" w:space="0" w:color="000000"/>
+            </w:tcBorders>
+          </w:tcPr>
+          <w:p>
+            <w:pPr>
+              <w:pStyle w:val="Normal"/>
+              <w:spacing w:before="0" w:after="80"/>
+              <w:rPr>
+                <w:rFonts w:ascii="Arial;sans-serif" w:hAnsi="Arial;sans-serif"/>
+                <w:b w:val="false"/>
+                <w:i w:val="false"/>
+                <w:caps w:val="false"/>
+                <w:smallCaps w:val="false"/>
+                <w:strike w:val="false"/>
+                <w:dstrike w:val="false"/>
+                <w:color w:val="000000"/>
+                <w:sz w:val="22"/>
+                <w:u w:val="none"/>
+                <w:effect w:val="none"/>
+                <w:shd w:fill="auto" w:val="clear"/>
+              </w:rPr>
+            </w:pPr>
+            <w:bookmarkStart w:id="4" w:name="docs-internal-guid-8ceffbe4-7fff-eb6e-56"/>
+            <w:bookmarkEnd w:id="4"/>
+            <w:r>
+              <w:rPr>
+                <w:rFonts w:ascii="Arial;sans-serif" w:hAnsi="Arial;sans-serif"/>
+                <w:b w:val="false"/>
+                <w:i w:val="false"/>
+                <w:caps w:val="false"/>
+                <w:smallCaps w:val="false"/>
+                <w:strike w:val="false"/>
+                <w:dstrike w:val="false"/>
+                <w:color w:val="000000"/>
+                <w:sz w:val="22"/>
+                <w:u w:val="none"/>
+                <w:effect w:val="none"/>
+                <w:shd w:fill="auto" w:val="clear"/>
+              </w:rPr>
+              <w:t>Yes — we reproduce and adapt the published DocLayNet checkpoint.</w:t>
+            </w:r>
+          </w:p>
+          <w:p>
+            <w:pPr>
+              <w:pStyle w:val="Normal"/>
+              <w:spacing w:before="0" w:after="80"/>
+              <w:rPr/>
+            </w:pPr>
+            <w:r>
+              <w:rPr/>
+            </w:r>
+          </w:p>
+        </w:tc>
+      </w:tr>
+      <w:tr>
+        <w:trPr/>
+        <w:tc>
+          <w:tcPr>
+            <w:tcW w:w="1697" w:type="dxa"/>
+            <w:tcBorders>
+              <w:top w:val="single" w:sz="4" w:space="0" w:color="000000"/>
+              <w:left w:val="single" w:sz="4" w:space="0" w:color="000000"/>
+              <w:bottom w:val="single" w:sz="4" w:space="0" w:color="000000"/>
+              <w:right w:val="single" w:sz="4" w:space="0" w:color="000000"/>
+            </w:tcBorders>
+          </w:tcPr>
+          <w:p>
+            <w:pPr>
+              <w:pStyle w:val="Normal"/>
+              <w:spacing w:before="0" w:after="80"/>
+              <w:rPr/>
+            </w:pPr>
+            <w:r>
+              <w:rPr/>
+              <w:t>OCR / HTR</w:t>
+            </w:r>
+          </w:p>
+        </w:tc>
+        <w:tc>
+          <w:tcPr>
+            <w:tcW w:w="2903" w:type="dxa"/>
             <w:tcBorders>
               <w:top w:val="single" w:sz="4" w:space="0" w:color="000000"/>
               <w:left w:val="single" w:sz="4" w:space="0" w:color="000000"/>
@@ -2012,7 +2538,7 @@
                 <w:sz w:val="18"/>
                 <w:szCs w:val="18"/>
               </w:rPr>
-              <w:t>e.g. heuristic vs detection model</w:t>
+              <w:t>e.g. Tesseract vs TrOCR vs Donut</w:t>
             </w:r>
           </w:p>
         </w:tc>
@@ -2063,29 +2589,29 @@
         <w:trPr/>
         <w:tc>
           <w:tcPr>
-            <w:tcW w:w="1698" w:type="dxa"/>
-            <w:tcBorders>
-              <w:top w:val="single" w:sz="4" w:space="0" w:color="000000"/>
-              <w:left w:val="single" w:sz="4" w:space="0" w:color="000000"/>
-              <w:bottom w:val="single" w:sz="4" w:space="0" w:color="000000"/>
-              <w:right w:val="single" w:sz="4" w:space="0" w:color="000000"/>
-            </w:tcBorders>
-          </w:tcPr>
-          <w:p>
-            <w:pPr>
-              <w:pStyle w:val="Normal"/>
-              <w:spacing w:before="0" w:after="80"/>
-              <w:rPr/>
-            </w:pPr>
-            <w:r>
-              <w:rPr/>
-              <w:t>OCR / HTR</w:t>
-            </w:r>
-          </w:p>
-        </w:tc>
-        <w:tc>
-          <w:tcPr>
-            <w:tcW w:w="2902" w:type="dxa"/>
+            <w:tcW w:w="1697" w:type="dxa"/>
+            <w:tcBorders>
+              <w:top w:val="single" w:sz="4" w:space="0" w:color="000000"/>
+              <w:left w:val="single" w:sz="4" w:space="0" w:color="000000"/>
+              <w:bottom w:val="single" w:sz="4" w:space="0" w:color="000000"/>
+              <w:right w:val="single" w:sz="4" w:space="0" w:color="000000"/>
+            </w:tcBorders>
+          </w:tcPr>
+          <w:p>
+            <w:pPr>
+              <w:pStyle w:val="Normal"/>
+              <w:spacing w:before="0" w:after="80"/>
+              <w:rPr/>
+            </w:pPr>
+            <w:r>
+              <w:rPr/>
+              <w:t>Chunking</w:t>
+            </w:r>
+          </w:p>
+        </w:tc>
+        <w:tc>
+          <w:tcPr>
+            <w:tcW w:w="2903" w:type="dxa"/>
             <w:tcBorders>
               <w:top w:val="single" w:sz="4" w:space="0" w:color="000000"/>
               <w:left w:val="single" w:sz="4" w:space="0" w:color="000000"/>
@@ -2107,7 +2633,7 @@
                 <w:sz w:val="18"/>
                 <w:szCs w:val="18"/>
               </w:rPr>
-              <w:t>e.g. Tesseract vs TrOCR vs Donut</w:t>
+              <w:t>e.g. fixed vs semantic; size/overlap</w:t>
             </w:r>
           </w:p>
         </w:tc>
@@ -2158,29 +2684,29 @@
         <w:trPr/>
         <w:tc>
           <w:tcPr>
-            <w:tcW w:w="1698" w:type="dxa"/>
-            <w:tcBorders>
-              <w:top w:val="single" w:sz="4" w:space="0" w:color="000000"/>
-              <w:left w:val="single" w:sz="4" w:space="0" w:color="000000"/>
-              <w:bottom w:val="single" w:sz="4" w:space="0" w:color="000000"/>
-              <w:right w:val="single" w:sz="4" w:space="0" w:color="000000"/>
-            </w:tcBorders>
-          </w:tcPr>
-          <w:p>
-            <w:pPr>
-              <w:pStyle w:val="Normal"/>
-              <w:spacing w:before="0" w:after="80"/>
-              <w:rPr/>
-            </w:pPr>
-            <w:r>
-              <w:rPr/>
-              <w:t>Chunking</w:t>
-            </w:r>
-          </w:p>
-        </w:tc>
-        <w:tc>
-          <w:tcPr>
-            <w:tcW w:w="2902" w:type="dxa"/>
+            <w:tcW w:w="1697" w:type="dxa"/>
+            <w:tcBorders>
+              <w:top w:val="single" w:sz="4" w:space="0" w:color="000000"/>
+              <w:left w:val="single" w:sz="4" w:space="0" w:color="000000"/>
+              <w:bottom w:val="single" w:sz="4" w:space="0" w:color="000000"/>
+              <w:right w:val="single" w:sz="4" w:space="0" w:color="000000"/>
+            </w:tcBorders>
+          </w:tcPr>
+          <w:p>
+            <w:pPr>
+              <w:pStyle w:val="Normal"/>
+              <w:spacing w:before="0" w:after="80"/>
+              <w:rPr/>
+            </w:pPr>
+            <w:r>
+              <w:rPr/>
+              <w:t>Embedding</w:t>
+            </w:r>
+          </w:p>
+        </w:tc>
+        <w:tc>
+          <w:tcPr>
+            <w:tcW w:w="2903" w:type="dxa"/>
             <w:tcBorders>
               <w:top w:val="single" w:sz="4" w:space="0" w:color="000000"/>
               <w:left w:val="single" w:sz="4" w:space="0" w:color="000000"/>
@@ -2202,7 +2728,7 @@
                 <w:sz w:val="18"/>
                 <w:szCs w:val="18"/>
               </w:rPr>
-              <w:t>e.g. fixed vs semantic; size/overlap</w:t>
+              <w:t>e.g. which sentence-embedding model</w:t>
             </w:r>
           </w:p>
         </w:tc>
@@ -2253,102 +2779,7 @@
         <w:trPr/>
         <w:tc>
           <w:tcPr>
-            <w:tcW w:w="1698" w:type="dxa"/>
-            <w:tcBorders>
-              <w:top w:val="single" w:sz="4" w:space="0" w:color="000000"/>
-              <w:left w:val="single" w:sz="4" w:space="0" w:color="000000"/>
-              <w:bottom w:val="single" w:sz="4" w:space="0" w:color="000000"/>
-              <w:right w:val="single" w:sz="4" w:space="0" w:color="000000"/>
-            </w:tcBorders>
-          </w:tcPr>
-          <w:p>
-            <w:pPr>
-              <w:pStyle w:val="Normal"/>
-              <w:spacing w:before="0" w:after="80"/>
-              <w:rPr/>
-            </w:pPr>
-            <w:r>
-              <w:rPr/>
-              <w:t>Embedding</w:t>
-            </w:r>
-          </w:p>
-        </w:tc>
-        <w:tc>
-          <w:tcPr>
-            <w:tcW w:w="2902" w:type="dxa"/>
-            <w:tcBorders>
-              <w:top w:val="single" w:sz="4" w:space="0" w:color="000000"/>
-              <w:left w:val="single" w:sz="4" w:space="0" w:color="000000"/>
-              <w:bottom w:val="single" w:sz="4" w:space="0" w:color="000000"/>
-              <w:right w:val="single" w:sz="4" w:space="0" w:color="000000"/>
-            </w:tcBorders>
-          </w:tcPr>
-          <w:p>
-            <w:pPr>
-              <w:pStyle w:val="Normal"/>
-              <w:spacing w:before="0" w:after="80"/>
-              <w:rPr/>
-            </w:pPr>
-            <w:r>
-              <w:rPr>
-                <w:i/>
-                <w:iCs/>
-                <w:color w:val="595959"/>
-                <w:sz w:val="18"/>
-                <w:szCs w:val="18"/>
-              </w:rPr>
-              <w:t>e.g. which sentence-embedding model</w:t>
-            </w:r>
-          </w:p>
-        </w:tc>
-        <w:tc>
-          <w:tcPr>
-            <w:tcW w:w="3199" w:type="dxa"/>
-            <w:tcBorders>
-              <w:top w:val="single" w:sz="4" w:space="0" w:color="000000"/>
-              <w:left w:val="single" w:sz="4" w:space="0" w:color="000000"/>
-              <w:bottom w:val="single" w:sz="4" w:space="0" w:color="000000"/>
-              <w:right w:val="single" w:sz="4" w:space="0" w:color="000000"/>
-            </w:tcBorders>
-          </w:tcPr>
-          <w:p>
-            <w:pPr>
-              <w:pStyle w:val="Normal"/>
-              <w:spacing w:before="0" w:after="80"/>
-              <w:rPr/>
-            </w:pPr>
-            <w:r>
-              <w:rPr/>
-            </w:r>
-          </w:p>
-        </w:tc>
-        <w:tc>
-          <w:tcPr>
-            <w:tcW w:w="1560" w:type="dxa"/>
-            <w:tcBorders>
-              <w:top w:val="single" w:sz="4" w:space="0" w:color="000000"/>
-              <w:left w:val="single" w:sz="4" w:space="0" w:color="000000"/>
-              <w:bottom w:val="single" w:sz="4" w:space="0" w:color="000000"/>
-              <w:right w:val="single" w:sz="4" w:space="0" w:color="000000"/>
-            </w:tcBorders>
-          </w:tcPr>
-          <w:p>
-            <w:pPr>
-              <w:pStyle w:val="Normal"/>
-              <w:spacing w:before="0" w:after="80"/>
-              <w:rPr/>
-            </w:pPr>
-            <w:r>
-              <w:rPr/>
-            </w:r>
-          </w:p>
-        </w:tc>
-      </w:tr>
-      <w:tr>
-        <w:trPr/>
-        <w:tc>
-          <w:tcPr>
-            <w:tcW w:w="1698" w:type="dxa"/>
+            <w:tcW w:w="1697" w:type="dxa"/>
             <w:tcBorders>
               <w:top w:val="single" w:sz="4" w:space="0" w:color="000000"/>
               <w:left w:val="single" w:sz="4" w:space="0" w:color="000000"/>
@@ -2370,7 +2801,7 @@
         </w:tc>
         <w:tc>
           <w:tcPr>
-            <w:tcW w:w="2902" w:type="dxa"/>
+            <w:tcW w:w="2903" w:type="dxa"/>
             <w:tcBorders>
               <w:top w:val="single" w:sz="4" w:space="0" w:color="000000"/>
               <w:left w:val="single" w:sz="4" w:space="0" w:color="000000"/>
@@ -3851,15 +4282,15 @@
         </w:tblCellMar>
       </w:tblPr>
       <w:tblGrid>
-        <w:gridCol w:w="2198"/>
-        <w:gridCol w:w="3402"/>
+        <w:gridCol w:w="2197"/>
+        <w:gridCol w:w="3403"/>
         <w:gridCol w:w="3760"/>
       </w:tblGrid>
       <w:tr>
         <w:trPr/>
         <w:tc>
           <w:tcPr>
-            <w:tcW w:w="2198" w:type="dxa"/>
+            <w:tcW w:w="2197" w:type="dxa"/>
             <w:tcBorders>
               <w:top w:val="single" w:sz="4" w:space="0" w:color="000000"/>
               <w:left w:val="single" w:sz="4" w:space="0" w:color="000000"/>
@@ -3886,7 +4317,7 @@
         </w:tc>
         <w:tc>
           <w:tcPr>
-            <w:tcW w:w="3402" w:type="dxa"/>
+            <w:tcW w:w="3403" w:type="dxa"/>
             <w:tcBorders>
               <w:top w:val="single" w:sz="4" w:space="0" w:color="000000"/>
               <w:left w:val="single" w:sz="4" w:space="0" w:color="000000"/>
@@ -3943,7 +4374,7 @@
         <w:trPr/>
         <w:tc>
           <w:tcPr>
-            <w:tcW w:w="2198" w:type="dxa"/>
+            <w:tcW w:w="2197" w:type="dxa"/>
             <w:tcBorders>
               <w:top w:val="single" w:sz="4" w:space="0" w:color="000000"/>
               <w:left w:val="single" w:sz="4" w:space="0" w:color="000000"/>
@@ -3965,7 +4396,7 @@
         </w:tc>
         <w:tc>
           <w:tcPr>
-            <w:tcW w:w="3402" w:type="dxa"/>
+            <w:tcW w:w="3403" w:type="dxa"/>
             <w:tcBorders>
               <w:top w:val="single" w:sz="4" w:space="0" w:color="000000"/>
               <w:left w:val="single" w:sz="4" w:space="0" w:color="000000"/>
@@ -4024,7 +4455,7 @@
         <w:trPr/>
         <w:tc>
           <w:tcPr>
-            <w:tcW w:w="2198" w:type="dxa"/>
+            <w:tcW w:w="2197" w:type="dxa"/>
             <w:tcBorders>
               <w:top w:val="single" w:sz="4" w:space="0" w:color="000000"/>
               <w:left w:val="single" w:sz="4" w:space="0" w:color="000000"/>
@@ -4046,7 +4477,7 @@
         </w:tc>
         <w:tc>
           <w:tcPr>
-            <w:tcW w:w="3402" w:type="dxa"/>
+            <w:tcW w:w="3403" w:type="dxa"/>
             <w:tcBorders>
               <w:top w:val="single" w:sz="4" w:space="0" w:color="000000"/>
               <w:left w:val="single" w:sz="4" w:space="0" w:color="000000"/>
@@ -4105,7 +4536,7 @@
         <w:trPr/>
         <w:tc>
           <w:tcPr>
-            <w:tcW w:w="2198" w:type="dxa"/>
+            <w:tcW w:w="2197" w:type="dxa"/>
             <w:tcBorders>
               <w:top w:val="single" w:sz="4" w:space="0" w:color="000000"/>
               <w:left w:val="single" w:sz="4" w:space="0" w:color="000000"/>
@@ -4127,7 +4558,7 @@
         </w:tc>
         <w:tc>
           <w:tcPr>
-            <w:tcW w:w="3402" w:type="dxa"/>
+            <w:tcW w:w="3403" w:type="dxa"/>
             <w:tcBorders>
               <w:top w:val="single" w:sz="4" w:space="0" w:color="000000"/>
               <w:left w:val="single" w:sz="4" w:space="0" w:color="000000"/>
@@ -4186,7 +4617,7 @@
         <w:trPr/>
         <w:tc>
           <w:tcPr>
-            <w:tcW w:w="2198" w:type="dxa"/>
+            <w:tcW w:w="2197" w:type="dxa"/>
             <w:tcBorders>
               <w:top w:val="single" w:sz="4" w:space="0" w:color="000000"/>
               <w:left w:val="single" w:sz="4" w:space="0" w:color="000000"/>
@@ -4208,7 +4639,7 @@
         </w:tc>
         <w:tc>
           <w:tcPr>
-            <w:tcW w:w="3402" w:type="dxa"/>
+            <w:tcW w:w="3403" w:type="dxa"/>
             <w:tcBorders>
               <w:top w:val="single" w:sz="4" w:space="0" w:color="000000"/>
               <w:left w:val="single" w:sz="4" w:space="0" w:color="000000"/>
@@ -4267,7 +4698,7 @@
         <w:trPr/>
         <w:tc>
           <w:tcPr>
-            <w:tcW w:w="2198" w:type="dxa"/>
+            <w:tcW w:w="2197" w:type="dxa"/>
             <w:tcBorders>
               <w:top w:val="single" w:sz="4" w:space="0" w:color="000000"/>
               <w:left w:val="single" w:sz="4" w:space="0" w:color="000000"/>
@@ -4289,7 +4720,7 @@
         </w:tc>
         <w:tc>
           <w:tcPr>
-            <w:tcW w:w="3402" w:type="dxa"/>
+            <w:tcW w:w="3403" w:type="dxa"/>
             <w:tcBorders>
               <w:top w:val="single" w:sz="4" w:space="0" w:color="000000"/>
               <w:left w:val="single" w:sz="4" w:space="0" w:color="000000"/>
@@ -4348,7 +4779,7 @@
         <w:trPr/>
         <w:tc>
           <w:tcPr>
-            <w:tcW w:w="2198" w:type="dxa"/>
+            <w:tcW w:w="2197" w:type="dxa"/>
             <w:tcBorders>
               <w:top w:val="single" w:sz="4" w:space="0" w:color="000000"/>
               <w:left w:val="single" w:sz="4" w:space="0" w:color="000000"/>
@@ -4370,7 +4801,7 @@
         </w:tc>
         <w:tc>
           <w:tcPr>
-            <w:tcW w:w="3402" w:type="dxa"/>
+            <w:tcW w:w="3403" w:type="dxa"/>
             <w:tcBorders>
               <w:top w:val="single" w:sz="4" w:space="0" w:color="000000"/>
               <w:left w:val="single" w:sz="4" w:space="0" w:color="000000"/>
@@ -4429,7 +4860,7 @@
         <w:trPr/>
         <w:tc>
           <w:tcPr>
-            <w:tcW w:w="2198" w:type="dxa"/>
+            <w:tcW w:w="2197" w:type="dxa"/>
             <w:tcBorders>
               <w:top w:val="single" w:sz="4" w:space="0" w:color="000000"/>
               <w:left w:val="single" w:sz="4" w:space="0" w:color="000000"/>
@@ -4451,7 +4882,7 @@
         </w:tc>
         <w:tc>
           <w:tcPr>
-            <w:tcW w:w="3402" w:type="dxa"/>
+            <w:tcW w:w="3403" w:type="dxa"/>
             <w:tcBorders>
               <w:top w:val="single" w:sz="4" w:space="0" w:color="000000"/>
               <w:left w:val="single" w:sz="4" w:space="0" w:color="000000"/>
@@ -4510,7 +4941,7 @@
         <w:trPr/>
         <w:tc>
           <w:tcPr>
-            <w:tcW w:w="2198" w:type="dxa"/>
+            <w:tcW w:w="2197" w:type="dxa"/>
             <w:tcBorders>
               <w:top w:val="single" w:sz="4" w:space="0" w:color="000000"/>
               <w:left w:val="single" w:sz="4" w:space="0" w:color="000000"/>
@@ -4532,7 +4963,7 @@
         </w:tc>
         <w:tc>
           <w:tcPr>
-            <w:tcW w:w="3402" w:type="dxa"/>
+            <w:tcW w:w="3403" w:type="dxa"/>
             <w:tcBorders>
               <w:top w:val="single" w:sz="4" w:space="0" w:color="000000"/>
               <w:left w:val="single" w:sz="4" w:space="0" w:color="000000"/>
@@ -5823,7 +6254,7 @@
       <w:pgNumType w:fmt="decimal"/>
       <w:formProt w:val="false"/>
       <w:textDirection w:val="lrTb"/>
-      <w:docGrid w:type="default" w:linePitch="360" w:charSpace="5938"/>
+      <w:docGrid w:type="default" w:linePitch="360" w:charSpace="5734"/>
     </w:sectPr>
   </w:body>
 </w:document>

</xml_diff>

<commit_message>
OCR compared, form updated
</commit_message>
<xml_diff>
--- a/forms/A2_form.docx
+++ b/forms/A2_form.docx
@@ -2526,19 +2526,148 @@
           </w:tcPr>
           <w:p>
             <w:pPr>
-              <w:pStyle w:val="Normal"/>
-              <w:spacing w:before="0" w:after="80"/>
-              <w:rPr/>
-            </w:pPr>
-            <w:r>
-              <w:rPr>
-                <w:i/>
-                <w:iCs/>
+              <w:pStyle w:val="BodyText"/>
+              <w:spacing w:before="0" w:after="80"/>
+              <w:rPr>
+                <w:rFonts w:ascii="Arial;sans-serif" w:hAnsi="Arial;sans-serif"/>
+                <w:b w:val="false"/>
+                <w:i w:val="false"/>
+                <w:i w:val="false"/>
+                <w:iCs w:val="false"/>
+                <w:caps w:val="false"/>
+                <w:smallCaps w:val="false"/>
+                <w:strike w:val="false"/>
+                <w:dstrike w:val="false"/>
                 <w:color w:val="595959"/>
                 <w:sz w:val="18"/>
-                <w:szCs w:val="18"/>
-              </w:rPr>
-              <w:t>e.g. Tesseract vs TrOCR vs Donut</w:t>
+                <w:u w:val="none"/>
+                <w:effect w:val="none"/>
+                <w:shd w:fill="auto" w:val="clear"/>
+              </w:rPr>
+            </w:pPr>
+            <w:bookmarkStart w:id="5" w:name="docs-internal-guid-e427ee9a-7fff-dd4d-77"/>
+            <w:bookmarkEnd w:id="5"/>
+            <w:r>
+              <w:rPr>
+                <w:rFonts w:ascii="Arial;sans-serif" w:hAnsi="Arial;sans-serif"/>
+                <w:b w:val="false"/>
+                <w:i w:val="false"/>
+                <w:iCs w:val="false"/>
+                <w:caps w:val="false"/>
+                <w:smallCaps w:val="false"/>
+                <w:strike w:val="false"/>
+                <w:dstrike w:val="false"/>
+                <w:color w:val="595959"/>
+                <w:sz w:val="18"/>
+                <w:u w:val="none"/>
+                <w:effect w:val="none"/>
+                <w:shd w:fill="auto" w:val="clear"/>
+              </w:rPr>
+              <w:t>1. Tesseract (ben+eng, OEM 3, PSM 6)</w:t>
+            </w:r>
+          </w:p>
+          <w:p>
+            <w:pPr>
+              <w:pStyle w:val="BodyText"/>
+              <w:bidi w:val="0"/>
+              <w:spacing w:lineRule="auto" w:line="331" w:before="0" w:after="80"/>
+              <w:ind w:hanging="0" w:left="0" w:right="0"/>
+              <w:rPr>
+                <w:rFonts w:ascii="Arial;sans-serif" w:hAnsi="Arial;sans-serif"/>
+                <w:b w:val="false"/>
+                <w:i w:val="false"/>
+                <w:caps w:val="false"/>
+                <w:smallCaps w:val="false"/>
+                <w:strike w:val="false"/>
+                <w:dstrike w:val="false"/>
+                <w:color w:val="595959"/>
+                <w:sz w:val="18"/>
+                <w:u w:val="none"/>
+                <w:effect w:val="none"/>
+                <w:shd w:fill="auto" w:val="clear"/>
+              </w:rPr>
+            </w:pPr>
+            <w:r>
+              <w:rPr>
+                <w:rFonts w:ascii="Arial;sans-serif" w:hAnsi="Arial;sans-serif"/>
+                <w:b w:val="false"/>
+                <w:i w:val="false"/>
+                <w:caps w:val="false"/>
+                <w:smallCaps w:val="false"/>
+                <w:strike w:val="false"/>
+                <w:dstrike w:val="false"/>
+                <w:color w:val="595959"/>
+                <w:sz w:val="18"/>
+                <w:u w:val="none"/>
+                <w:effect w:val="none"/>
+                <w:shd w:fill="auto" w:val="clear"/>
+              </w:rPr>
+              <w:t>2. EasyOCR (bn+en)</w:t>
+            </w:r>
+          </w:p>
+          <w:p>
+            <w:pPr>
+              <w:pStyle w:val="BodyText"/>
+              <w:bidi w:val="0"/>
+              <w:spacing w:lineRule="auto" w:line="331" w:before="0" w:after="80"/>
+              <w:ind w:hanging="0" w:left="0" w:right="0"/>
+              <w:rPr>
+                <w:rFonts w:ascii="Arial;sans-serif" w:hAnsi="Arial;sans-serif"/>
+                <w:b w:val="false"/>
+                <w:i w:val="false"/>
+                <w:caps w:val="false"/>
+                <w:smallCaps w:val="false"/>
+                <w:strike w:val="false"/>
+                <w:dstrike w:val="false"/>
+                <w:color w:val="595959"/>
+                <w:sz w:val="18"/>
+                <w:u w:val="none"/>
+                <w:effect w:val="none"/>
+                <w:shd w:fill="auto" w:val="clear"/>
+              </w:rPr>
+            </w:pPr>
+            <w:r>
+              <w:rPr>
+                <w:rFonts w:ascii="Arial;sans-serif" w:hAnsi="Arial;sans-serif"/>
+                <w:b w:val="false"/>
+                <w:i w:val="false"/>
+                <w:caps w:val="false"/>
+                <w:smallCaps w:val="false"/>
+                <w:strike w:val="false"/>
+                <w:dstrike w:val="false"/>
+                <w:color w:val="595959"/>
+                <w:sz w:val="18"/>
+                <w:u w:val="none"/>
+                <w:effect w:val="none"/>
+                <w:shd w:fill="auto" w:val="clear"/>
+              </w:rPr>
+              <w:t>3. TrOCR (`microsoft/trocr-base-printed`)</w:t>
+            </w:r>
+          </w:p>
+          <w:p>
+            <w:pPr>
+              <w:pStyle w:val="BodyText"/>
+              <w:bidi w:val="0"/>
+              <w:spacing w:lineRule="auto" w:line="331" w:before="0" w:after="80"/>
+              <w:ind w:hanging="0" w:left="0" w:right="0"/>
+              <w:rPr/>
+            </w:pPr>
+            <w:r>
+              <w:rPr>
+                <w:rFonts w:ascii="Arial;sans-serif" w:hAnsi="Arial;sans-serif"/>
+                <w:b w:val="false"/>
+                <w:i w:val="false"/>
+                <w:caps w:val="false"/>
+                <w:smallCaps w:val="false"/>
+                <w:strike w:val="false"/>
+                <w:dstrike w:val="false"/>
+                <w:color w:val="595959"/>
+                <w:sz w:val="18"/>
+                <w:u w:val="none"/>
+                <w:effect w:val="none"/>
+                <w:shd w:fill="auto" w:val="clear"/>
+              </w:rPr>
+              <w:t>4. Donut (`naver-clova-ix/donut-base`)</w:t>
             </w:r>
           </w:p>
         </w:tc>
@@ -2554,12 +2683,469 @@
           </w:tcPr>
           <w:p>
             <w:pPr>
-              <w:pStyle w:val="Normal"/>
-              <w:spacing w:before="0" w:after="80"/>
-              <w:rPr/>
-            </w:pPr>
-            <w:r>
-              <w:rPr/>
+              <w:pStyle w:val="BodyText"/>
+              <w:spacing w:before="0" w:after="80"/>
+              <w:rPr>
+                <w:b w:val="false"/>
+              </w:rPr>
+            </w:pPr>
+            <w:bookmarkStart w:id="6" w:name="docs-internal-guid-e21d0c96-7fff-5389-f9"/>
+            <w:bookmarkEnd w:id="6"/>
+            <w:r>
+              <w:rPr>
+                <w:rFonts w:ascii="Arial;sans-serif" w:hAnsi="Arial;sans-serif"/>
+                <w:b/>
+                <w:i w:val="false"/>
+                <w:caps w:val="false"/>
+                <w:smallCaps w:val="false"/>
+                <w:strike w:val="false"/>
+                <w:dstrike w:val="false"/>
+                <w:color w:val="000000"/>
+                <w:sz w:val="22"/>
+                <w:u w:val="none"/>
+                <w:effect w:val="none"/>
+                <w:shd w:fill="auto" w:val="clear"/>
+              </w:rPr>
+              <w:t xml:space="preserve">Choice: </w:t>
+            </w:r>
+            <w:r>
+              <w:rPr>
+                <w:rFonts w:ascii="Arial;sans-serif" w:hAnsi="Arial;sans-serif"/>
+                <w:b w:val="false"/>
+                <w:i w:val="false"/>
+                <w:caps w:val="false"/>
+                <w:smallCaps w:val="false"/>
+                <w:strike w:val="false"/>
+                <w:dstrike w:val="false"/>
+                <w:color w:val="000000"/>
+                <w:sz w:val="22"/>
+                <w:u w:val="none"/>
+                <w:effect w:val="none"/>
+                <w:shd w:fill="auto" w:val="clear"/>
+              </w:rPr>
+              <w:t>EasyOCR (bn+en)</w:t>
+            </w:r>
+          </w:p>
+          <w:p>
+            <w:pPr>
+              <w:pStyle w:val="BodyText"/>
+              <w:bidi w:val="0"/>
+              <w:ind w:left="0"/>
+              <w:jc w:val="left"/>
+              <w:rPr/>
+            </w:pPr>
+            <w:r>
+              <w:rPr/>
+            </w:r>
+          </w:p>
+          <w:p>
+            <w:pPr>
+              <w:pStyle w:val="BodyText"/>
+              <w:bidi w:val="0"/>
+              <w:spacing w:lineRule="auto" w:line="331" w:before="0" w:after="80"/>
+              <w:ind w:hanging="0" w:left="0" w:right="0"/>
+              <w:jc w:val="left"/>
+              <w:rPr>
+                <w:rFonts w:ascii="Arial;sans-serif" w:hAnsi="Arial;sans-serif"/>
+                <w:b/>
+                <w:i w:val="false"/>
+                <w:caps w:val="false"/>
+                <w:smallCaps w:val="false"/>
+                <w:strike w:val="false"/>
+                <w:dstrike w:val="false"/>
+                <w:color w:val="000000"/>
+                <w:sz w:val="22"/>
+                <w:u w:val="none"/>
+                <w:effect w:val="none"/>
+                <w:shd w:fill="auto" w:val="clear"/>
+              </w:rPr>
+            </w:pPr>
+            <w:r>
+              <w:rPr>
+                <w:rFonts w:ascii="Arial;sans-serif" w:hAnsi="Arial;sans-serif"/>
+                <w:b/>
+                <w:i w:val="false"/>
+                <w:caps w:val="false"/>
+                <w:smallCaps w:val="false"/>
+                <w:strike w:val="false"/>
+                <w:dstrike w:val="false"/>
+                <w:color w:val="000000"/>
+                <w:sz w:val="22"/>
+                <w:u w:val="none"/>
+                <w:effect w:val="none"/>
+                <w:shd w:fill="auto" w:val="clear"/>
+              </w:rPr>
+              <w:t>Why:</w:t>
+            </w:r>
+          </w:p>
+          <w:p>
+            <w:pPr>
+              <w:pStyle w:val="BodyText"/>
+              <w:bidi w:val="0"/>
+              <w:spacing w:lineRule="auto" w:line="331" w:before="0" w:after="80"/>
+              <w:ind w:hanging="0" w:left="0" w:right="0"/>
+              <w:jc w:val="left"/>
+              <w:rPr>
+                <w:rFonts w:ascii="Arial;sans-serif" w:hAnsi="Arial;sans-serif"/>
+                <w:b w:val="false"/>
+                <w:i w:val="false"/>
+                <w:caps w:val="false"/>
+                <w:smallCaps w:val="false"/>
+                <w:strike w:val="false"/>
+                <w:dstrike w:val="false"/>
+                <w:color w:val="000000"/>
+                <w:sz w:val="22"/>
+                <w:u w:val="none"/>
+                <w:effect w:val="none"/>
+                <w:shd w:fill="auto" w:val="clear"/>
+              </w:rPr>
+            </w:pPr>
+            <w:r>
+              <w:rPr>
+                <w:rFonts w:ascii="Arial;sans-serif" w:hAnsi="Arial;sans-serif"/>
+                <w:b w:val="false"/>
+                <w:i w:val="false"/>
+                <w:caps w:val="false"/>
+                <w:smallCaps w:val="false"/>
+                <w:strike w:val="false"/>
+                <w:dstrike w:val="false"/>
+                <w:color w:val="000000"/>
+                <w:sz w:val="22"/>
+                <w:u w:val="none"/>
+                <w:effect w:val="none"/>
+                <w:shd w:fill="auto" w:val="clear"/>
+              </w:rPr>
+              <w:t>We tested all four tools on several pages across all three books, covering plain Bangla prose, code-mixed lines (Bangla + English + Latin variables), and chemical reaction notation.</w:t>
+            </w:r>
+          </w:p>
+          <w:p>
+            <w:pPr>
+              <w:pStyle w:val="BodyText"/>
+              <w:bidi w:val="0"/>
+              <w:ind w:left="0"/>
+              <w:jc w:val="left"/>
+              <w:rPr/>
+            </w:pPr>
+            <w:r>
+              <w:rPr/>
+            </w:r>
+          </w:p>
+          <w:p>
+            <w:pPr>
+              <w:pStyle w:val="BodyText"/>
+              <w:bidi w:val="0"/>
+              <w:spacing w:lineRule="auto" w:line="331" w:before="0" w:after="80"/>
+              <w:ind w:hanging="0" w:left="0" w:right="0"/>
+              <w:jc w:val="left"/>
+              <w:rPr>
+                <w:b w:val="false"/>
+              </w:rPr>
+            </w:pPr>
+            <w:r>
+              <w:rPr>
+                <w:rFonts w:ascii="Arial;sans-serif" w:hAnsi="Arial;sans-serif"/>
+                <w:b/>
+                <w:i w:val="false"/>
+                <w:caps w:val="false"/>
+                <w:smallCaps w:val="false"/>
+                <w:strike w:val="false"/>
+                <w:dstrike w:val="false"/>
+                <w:color w:val="000000"/>
+                <w:sz w:val="22"/>
+                <w:u w:val="none"/>
+                <w:effect w:val="none"/>
+                <w:shd w:fill="auto" w:val="clear"/>
+              </w:rPr>
+              <w:t xml:space="preserve">Tesseract (ben+eng): </w:t>
+            </w:r>
+            <w:r>
+              <w:rPr>
+                <w:rFonts w:ascii="Arial;sans-serif" w:hAnsi="Arial;sans-serif"/>
+                <w:b w:val="false"/>
+                <w:i w:val="false"/>
+                <w:caps w:val="false"/>
+                <w:smallCaps w:val="false"/>
+                <w:strike w:val="false"/>
+                <w:dstrike w:val="false"/>
+                <w:color w:val="000000"/>
+                <w:sz w:val="22"/>
+                <w:u w:val="none"/>
+                <w:effect w:val="none"/>
+                <w:shd w:fill="auto" w:val="clear"/>
+              </w:rPr>
+              <w:t>Strong on pure Bangla prose and preserves paragraph structure (newlines). However, it systematically fails on the code-mixed content that defines our corpus — it replaces English words and Latin symbols with numbers and produces ~50% error on chemical reaction notation. This is a fundamental limitation, not a configuration issue.</w:t>
+            </w:r>
+          </w:p>
+          <w:p>
+            <w:pPr>
+              <w:pStyle w:val="BodyText"/>
+              <w:bidi w:val="0"/>
+              <w:ind w:left="0"/>
+              <w:jc w:val="left"/>
+              <w:rPr/>
+            </w:pPr>
+            <w:r>
+              <w:rPr/>
+            </w:r>
+          </w:p>
+          <w:p>
+            <w:pPr>
+              <w:pStyle w:val="BodyText"/>
+              <w:bidi w:val="0"/>
+              <w:spacing w:lineRule="auto" w:line="331" w:before="0" w:after="80"/>
+              <w:ind w:hanging="0" w:left="0" w:right="0"/>
+              <w:jc w:val="left"/>
+              <w:rPr>
+                <w:b w:val="false"/>
+              </w:rPr>
+            </w:pPr>
+            <w:r>
+              <w:rPr>
+                <w:rFonts w:ascii="Arial;sans-serif" w:hAnsi="Arial;sans-serif"/>
+                <w:b/>
+                <w:i w:val="false"/>
+                <w:caps w:val="false"/>
+                <w:smallCaps w:val="false"/>
+                <w:strike w:val="false"/>
+                <w:dstrike w:val="false"/>
+                <w:color w:val="000000"/>
+                <w:sz w:val="22"/>
+                <w:u w:val="none"/>
+                <w:effect w:val="none"/>
+                <w:shd w:fill="auto" w:val="clear"/>
+              </w:rPr>
+              <w:t>EasyOCR (bn+en)</w:t>
+            </w:r>
+            <w:r>
+              <w:rPr>
+                <w:rFonts w:ascii="Arial;sans-serif" w:hAnsi="Arial;sans-serif"/>
+                <w:b w:val="false"/>
+                <w:i w:val="false"/>
+                <w:caps w:val="false"/>
+                <w:smallCaps w:val="false"/>
+                <w:strike w:val="false"/>
+                <w:dstrike w:val="false"/>
+                <w:color w:val="000000"/>
+                <w:sz w:val="22"/>
+                <w:u w:val="none"/>
+                <w:effect w:val="none"/>
+                <w:shd w:fill="auto" w:val="clear"/>
+              </w:rPr>
+              <w:t>: Most accurate across all page types. Handles Bangla prose, conjuncts, English words, Latin variable names, and chemical notation correctly across all tested pages. One structural weakness: does not insert newline breaks between paragraphs. This is acceptable — the downstream chunking stage can handle sentence-level splitting without relying on newlines.</w:t>
+            </w:r>
+          </w:p>
+          <w:p>
+            <w:pPr>
+              <w:pStyle w:val="BodyText"/>
+              <w:bidi w:val="0"/>
+              <w:ind w:left="0"/>
+              <w:jc w:val="left"/>
+              <w:rPr/>
+            </w:pPr>
+            <w:r>
+              <w:rPr/>
+            </w:r>
+          </w:p>
+          <w:p>
+            <w:pPr>
+              <w:pStyle w:val="BodyText"/>
+              <w:bidi w:val="0"/>
+              <w:spacing w:lineRule="auto" w:line="331" w:before="0" w:after="80"/>
+              <w:ind w:hanging="0" w:left="0" w:right="0"/>
+              <w:jc w:val="left"/>
+              <w:rPr>
+                <w:b w:val="false"/>
+              </w:rPr>
+            </w:pPr>
+            <w:r>
+              <w:rPr>
+                <w:rFonts w:ascii="Arial;sans-serif" w:hAnsi="Arial;sans-serif"/>
+                <w:b/>
+                <w:i w:val="false"/>
+                <w:caps w:val="false"/>
+                <w:smallCaps w:val="false"/>
+                <w:strike w:val="false"/>
+                <w:dstrike w:val="false"/>
+                <w:color w:val="000000"/>
+                <w:sz w:val="22"/>
+                <w:u w:val="none"/>
+                <w:effect w:val="none"/>
+                <w:shd w:fill="auto" w:val="clear"/>
+              </w:rPr>
+              <w:t>TrOCR (`microsoft/trocr-base-printed`):</w:t>
+            </w:r>
+            <w:r>
+              <w:rPr>
+                <w:b w:val="false"/>
+                <w:caps w:val="false"/>
+                <w:smallCaps w:val="false"/>
+                <w:strike w:val="false"/>
+                <w:dstrike w:val="false"/>
+                <w:color w:val="000000"/>
+                <w:u w:val="none"/>
+                <w:effect w:val="none"/>
+                <w:shd w:fill="auto" w:val="clear"/>
+              </w:rPr>
+              <w:t xml:space="preserve"> </w:t>
+            </w:r>
+            <w:r>
+              <w:rPr>
+                <w:rFonts w:ascii="Arial;sans-serif" w:hAnsi="Arial;sans-serif"/>
+                <w:b w:val="false"/>
+                <w:i w:val="false"/>
+                <w:caps w:val="false"/>
+                <w:smallCaps w:val="false"/>
+                <w:strike w:val="false"/>
+                <w:dstrike w:val="false"/>
+                <w:color w:val="000000"/>
+                <w:sz w:val="22"/>
+                <w:u w:val="none"/>
+                <w:effect w:val="none"/>
+                <w:shd w:fill="auto" w:val="clear"/>
+              </w:rPr>
+              <w:t>Trained exclusively on English printed text. Produced single-word English output on every Bangla page tested. No Bangla-capable public checkpoint exists. Rejected.</w:t>
+            </w:r>
+          </w:p>
+          <w:p>
+            <w:pPr>
+              <w:pStyle w:val="BodyText"/>
+              <w:bidi w:val="0"/>
+              <w:ind w:left="0"/>
+              <w:jc w:val="left"/>
+              <w:rPr/>
+            </w:pPr>
+            <w:r>
+              <w:rPr/>
+            </w:r>
+          </w:p>
+          <w:p>
+            <w:pPr>
+              <w:pStyle w:val="BodyText"/>
+              <w:bidi w:val="0"/>
+              <w:spacing w:lineRule="auto" w:line="331" w:before="0" w:after="80"/>
+              <w:ind w:hanging="0" w:left="0" w:right="0"/>
+              <w:jc w:val="left"/>
+              <w:rPr>
+                <w:b w:val="false"/>
+              </w:rPr>
+            </w:pPr>
+            <w:r>
+              <w:rPr>
+                <w:rFonts w:ascii="Arial;sans-serif" w:hAnsi="Arial;sans-serif"/>
+                <w:b/>
+                <w:i w:val="false"/>
+                <w:caps w:val="false"/>
+                <w:smallCaps w:val="false"/>
+                <w:strike w:val="false"/>
+                <w:dstrike w:val="false"/>
+                <w:color w:val="000000"/>
+                <w:sz w:val="22"/>
+                <w:u w:val="none"/>
+                <w:effect w:val="none"/>
+                <w:shd w:fill="auto" w:val="clear"/>
+              </w:rPr>
+              <w:t>Donut (`naver-clova-ix/donut-base`):</w:t>
+            </w:r>
+            <w:r>
+              <w:rPr>
+                <w:b w:val="false"/>
+                <w:caps w:val="false"/>
+                <w:smallCaps w:val="false"/>
+                <w:strike w:val="false"/>
+                <w:dstrike w:val="false"/>
+                <w:color w:val="000000"/>
+                <w:u w:val="none"/>
+                <w:effect w:val="none"/>
+                <w:shd w:fill="auto" w:val="clear"/>
+              </w:rPr>
+              <w:t xml:space="preserve"> </w:t>
+            </w:r>
+            <w:r>
+              <w:rPr>
+                <w:rFonts w:ascii="Arial;sans-serif" w:hAnsi="Arial;sans-serif"/>
+                <w:b w:val="false"/>
+                <w:i w:val="false"/>
+                <w:caps w:val="false"/>
+                <w:smallCaps w:val="false"/>
+                <w:strike w:val="false"/>
+                <w:dstrike w:val="false"/>
+                <w:color w:val="000000"/>
+                <w:sz w:val="22"/>
+                <w:u w:val="none"/>
+                <w:effect w:val="none"/>
+                <w:shd w:fill="auto" w:val="clear"/>
+              </w:rPr>
+              <w:t>Trained on English and Korean only — no Bangla support. Architecturally misaligned: it is a task-conditioned structured-extraction model, not a raw text transcriber. Additionally, breaking dependency conflicts with current `transformers` versions prevent reliable reproduction. Rejected.</w:t>
+            </w:r>
+          </w:p>
+          <w:p>
+            <w:pPr>
+              <w:pStyle w:val="BodyText"/>
+              <w:bidi w:val="0"/>
+              <w:ind w:left="0"/>
+              <w:jc w:val="left"/>
+              <w:rPr/>
+            </w:pPr>
+            <w:r>
+              <w:rPr/>
+            </w:r>
+          </w:p>
+          <w:p>
+            <w:pPr>
+              <w:pStyle w:val="BodyText"/>
+              <w:bidi w:val="0"/>
+              <w:spacing w:lineRule="auto" w:line="331" w:before="0" w:after="80"/>
+              <w:ind w:hanging="0" w:left="0" w:right="0"/>
+              <w:jc w:val="left"/>
+              <w:rPr/>
+            </w:pPr>
+            <w:r>
+              <w:rPr>
+                <w:rFonts w:ascii="Arial;sans-serif" w:hAnsi="Arial;sans-serif"/>
+                <w:b/>
+                <w:i w:val="false"/>
+                <w:caps w:val="false"/>
+                <w:smallCaps w:val="false"/>
+                <w:strike w:val="false"/>
+                <w:dstrike w:val="false"/>
+                <w:color w:val="000000"/>
+                <w:sz w:val="22"/>
+                <w:u w:val="none"/>
+                <w:effect w:val="none"/>
+                <w:shd w:fill="auto" w:val="clear"/>
+              </w:rPr>
+              <w:t>EasyOCR was chosen</w:t>
+            </w:r>
+            <w:r>
+              <w:rPr>
+                <w:b w:val="false"/>
+                <w:caps w:val="false"/>
+                <w:smallCaps w:val="false"/>
+                <w:strike w:val="false"/>
+                <w:dstrike w:val="false"/>
+                <w:color w:val="000000"/>
+                <w:u w:val="none"/>
+                <w:effect w:val="none"/>
+                <w:shd w:fill="auto" w:val="clear"/>
+              </w:rPr>
+              <w:t xml:space="preserve"> </w:t>
+            </w:r>
+            <w:r>
+              <w:rPr>
+                <w:rFonts w:ascii="Arial;sans-serif" w:hAnsi="Arial;sans-serif"/>
+                <w:b w:val="false"/>
+                <w:i w:val="false"/>
+                <w:caps w:val="false"/>
+                <w:smallCaps w:val="false"/>
+                <w:strike w:val="false"/>
+                <w:dstrike w:val="false"/>
+                <w:color w:val="000000"/>
+                <w:sz w:val="22"/>
+                <w:u w:val="none"/>
+                <w:effect w:val="none"/>
+                <w:shd w:fill="auto" w:val="clear"/>
+              </w:rPr>
+              <w:t>because it is the only tested tool that correctly handles our corpus's defining characteristic — code-mixed Bangla+Latin+English content — with acceptable accuracy across all three books.</w:t>
             </w:r>
           </w:p>
         </w:tc>
@@ -2573,6 +3159,45 @@
               <w:right w:val="single" w:sz="4" w:space="0" w:color="000000"/>
             </w:tcBorders>
           </w:tcPr>
+          <w:p>
+            <w:pPr>
+              <w:pStyle w:val="Normal"/>
+              <w:spacing w:before="0" w:after="80"/>
+              <w:rPr>
+                <w:rFonts w:ascii="Arial;sans-serif" w:hAnsi="Arial;sans-serif"/>
+                <w:b w:val="false"/>
+                <w:i w:val="false"/>
+                <w:caps w:val="false"/>
+                <w:smallCaps w:val="false"/>
+                <w:strike w:val="false"/>
+                <w:dstrike w:val="false"/>
+                <w:color w:val="000000"/>
+                <w:sz w:val="22"/>
+                <w:u w:val="none"/>
+                <w:effect w:val="none"/>
+                <w:shd w:fill="auto" w:val="clear"/>
+              </w:rPr>
+            </w:pPr>
+            <w:bookmarkStart w:id="7" w:name="docs-internal-guid-92ffc3bc-7fff-9cc5-b8"/>
+            <w:bookmarkEnd w:id="7"/>
+            <w:r>
+              <w:rPr>
+                <w:rFonts w:ascii="Arial;sans-serif" w:hAnsi="Arial;sans-serif"/>
+                <w:b w:val="false"/>
+                <w:i w:val="false"/>
+                <w:caps w:val="false"/>
+                <w:smallCaps w:val="false"/>
+                <w:strike w:val="false"/>
+                <w:dstrike w:val="false"/>
+                <w:color w:val="000000"/>
+                <w:sz w:val="22"/>
+                <w:u w:val="none"/>
+                <w:effect w:val="none"/>
+                <w:shd w:fill="auto" w:val="clear"/>
+              </w:rPr>
+              <w:t>Yes — we reproduce and adapt the published CRNN-based recognition method by using the pre-trained `bn+en` EasyOCR model.</w:t>
+            </w:r>
+          </w:p>
           <w:p>
             <w:pPr>
               <w:pStyle w:val="Normal"/>

</xml_diff>

<commit_message>
Chunking comparison completed and form updated accordingly
</commit_message>
<xml_diff>
--- a/forms/A2_form.docx
+++ b/forms/A2_form.docx
@@ -228,10 +228,10 @@
         </w:tblCellMar>
       </w:tblPr>
       <w:tblGrid>
-        <w:gridCol w:w="1697"/>
-        <w:gridCol w:w="3002"/>
-        <w:gridCol w:w="2363"/>
-        <w:gridCol w:w="2297"/>
+        <w:gridCol w:w="1696"/>
+        <w:gridCol w:w="3003"/>
+        <w:gridCol w:w="2364"/>
+        <w:gridCol w:w="2296"/>
       </w:tblGrid>
       <w:tr>
         <w:trPr>
@@ -239,7 +239,7 @@
         </w:trPr>
         <w:tc>
           <w:tcPr>
-            <w:tcW w:w="1697" w:type="dxa"/>
+            <w:tcW w:w="1696" w:type="dxa"/>
             <w:tcBorders>
               <w:top w:val="single" w:sz="4" w:space="0" w:color="000000"/>
               <w:left w:val="single" w:sz="4" w:space="0" w:color="000000"/>
@@ -266,7 +266,7 @@
         </w:tc>
         <w:tc>
           <w:tcPr>
-            <w:tcW w:w="3002" w:type="dxa"/>
+            <w:tcW w:w="3003" w:type="dxa"/>
             <w:tcBorders>
               <w:top w:val="single" w:sz="4" w:space="0" w:color="000000"/>
               <w:left w:val="single" w:sz="4" w:space="0" w:color="000000"/>
@@ -293,7 +293,7 @@
         </w:tc>
         <w:tc>
           <w:tcPr>
-            <w:tcW w:w="2363" w:type="dxa"/>
+            <w:tcW w:w="2364" w:type="dxa"/>
             <w:tcBorders>
               <w:top w:val="single" w:sz="4" w:space="0" w:color="000000"/>
               <w:left w:val="single" w:sz="4" w:space="0" w:color="000000"/>
@@ -320,7 +320,7 @@
         </w:tc>
         <w:tc>
           <w:tcPr>
-            <w:tcW w:w="2297" w:type="dxa"/>
+            <w:tcW w:w="2296" w:type="dxa"/>
             <w:tcBorders>
               <w:top w:val="single" w:sz="4" w:space="0" w:color="000000"/>
               <w:left w:val="single" w:sz="4" w:space="0" w:color="000000"/>
@@ -350,7 +350,7 @@
         <w:trPr/>
         <w:tc>
           <w:tcPr>
-            <w:tcW w:w="1697" w:type="dxa"/>
+            <w:tcW w:w="1696" w:type="dxa"/>
             <w:tcBorders>
               <w:top w:val="single" w:sz="4" w:space="0" w:color="000000"/>
               <w:left w:val="single" w:sz="4" w:space="0" w:color="000000"/>
@@ -372,49 +372,49 @@
         </w:tc>
         <w:tc>
           <w:tcPr>
-            <w:tcW w:w="3002" w:type="dxa"/>
-            <w:tcBorders>
-              <w:top w:val="single" w:sz="4" w:space="0" w:color="000000"/>
-              <w:left w:val="single" w:sz="4" w:space="0" w:color="000000"/>
-              <w:bottom w:val="single" w:sz="4" w:space="0" w:color="000000"/>
-              <w:right w:val="single" w:sz="4" w:space="0" w:color="000000"/>
-            </w:tcBorders>
-          </w:tcPr>
-          <w:p>
-            <w:pPr>
-              <w:pStyle w:val="Normal"/>
-              <w:spacing w:before="0" w:after="80"/>
-              <w:rPr/>
-            </w:pPr>
-            <w:r>
-              <w:rPr/>
-            </w:r>
-          </w:p>
-        </w:tc>
-        <w:tc>
-          <w:tcPr>
-            <w:tcW w:w="2363" w:type="dxa"/>
-            <w:tcBorders>
-              <w:top w:val="single" w:sz="4" w:space="0" w:color="000000"/>
-              <w:left w:val="single" w:sz="4" w:space="0" w:color="000000"/>
-              <w:bottom w:val="single" w:sz="4" w:space="0" w:color="000000"/>
-              <w:right w:val="single" w:sz="4" w:space="0" w:color="000000"/>
-            </w:tcBorders>
-          </w:tcPr>
-          <w:p>
-            <w:pPr>
-              <w:pStyle w:val="Normal"/>
-              <w:spacing w:before="0" w:after="80"/>
-              <w:rPr/>
-            </w:pPr>
-            <w:r>
-              <w:rPr/>
-            </w:r>
-          </w:p>
-        </w:tc>
-        <w:tc>
-          <w:tcPr>
-            <w:tcW w:w="2297" w:type="dxa"/>
+            <w:tcW w:w="3003" w:type="dxa"/>
+            <w:tcBorders>
+              <w:top w:val="single" w:sz="4" w:space="0" w:color="000000"/>
+              <w:left w:val="single" w:sz="4" w:space="0" w:color="000000"/>
+              <w:bottom w:val="single" w:sz="4" w:space="0" w:color="000000"/>
+              <w:right w:val="single" w:sz="4" w:space="0" w:color="000000"/>
+            </w:tcBorders>
+          </w:tcPr>
+          <w:p>
+            <w:pPr>
+              <w:pStyle w:val="Normal"/>
+              <w:spacing w:before="0" w:after="80"/>
+              <w:rPr/>
+            </w:pPr>
+            <w:r>
+              <w:rPr/>
+            </w:r>
+          </w:p>
+        </w:tc>
+        <w:tc>
+          <w:tcPr>
+            <w:tcW w:w="2364" w:type="dxa"/>
+            <w:tcBorders>
+              <w:top w:val="single" w:sz="4" w:space="0" w:color="000000"/>
+              <w:left w:val="single" w:sz="4" w:space="0" w:color="000000"/>
+              <w:bottom w:val="single" w:sz="4" w:space="0" w:color="000000"/>
+              <w:right w:val="single" w:sz="4" w:space="0" w:color="000000"/>
+            </w:tcBorders>
+          </w:tcPr>
+          <w:p>
+            <w:pPr>
+              <w:pStyle w:val="Normal"/>
+              <w:spacing w:before="0" w:after="80"/>
+              <w:rPr/>
+            </w:pPr>
+            <w:r>
+              <w:rPr/>
+            </w:r>
+          </w:p>
+        </w:tc>
+        <w:tc>
+          <w:tcPr>
+            <w:tcW w:w="2296" w:type="dxa"/>
             <w:tcBorders>
               <w:top w:val="single" w:sz="4" w:space="0" w:color="000000"/>
               <w:left w:val="single" w:sz="4" w:space="0" w:color="000000"/>
@@ -438,7 +438,7 @@
         <w:trPr/>
         <w:tc>
           <w:tcPr>
-            <w:tcW w:w="1697" w:type="dxa"/>
+            <w:tcW w:w="1696" w:type="dxa"/>
             <w:tcBorders>
               <w:top w:val="single" w:sz="4" w:space="0" w:color="000000"/>
               <w:left w:val="single" w:sz="4" w:space="0" w:color="000000"/>
@@ -460,49 +460,49 @@
         </w:tc>
         <w:tc>
           <w:tcPr>
-            <w:tcW w:w="3002" w:type="dxa"/>
-            <w:tcBorders>
-              <w:top w:val="single" w:sz="4" w:space="0" w:color="000000"/>
-              <w:left w:val="single" w:sz="4" w:space="0" w:color="000000"/>
-              <w:bottom w:val="single" w:sz="4" w:space="0" w:color="000000"/>
-              <w:right w:val="single" w:sz="4" w:space="0" w:color="000000"/>
-            </w:tcBorders>
-          </w:tcPr>
-          <w:p>
-            <w:pPr>
-              <w:pStyle w:val="Normal"/>
-              <w:spacing w:before="0" w:after="80"/>
-              <w:rPr/>
-            </w:pPr>
-            <w:r>
-              <w:rPr/>
-            </w:r>
-          </w:p>
-        </w:tc>
-        <w:tc>
-          <w:tcPr>
-            <w:tcW w:w="2363" w:type="dxa"/>
-            <w:tcBorders>
-              <w:top w:val="single" w:sz="4" w:space="0" w:color="000000"/>
-              <w:left w:val="single" w:sz="4" w:space="0" w:color="000000"/>
-              <w:bottom w:val="single" w:sz="4" w:space="0" w:color="000000"/>
-              <w:right w:val="single" w:sz="4" w:space="0" w:color="000000"/>
-            </w:tcBorders>
-          </w:tcPr>
-          <w:p>
-            <w:pPr>
-              <w:pStyle w:val="Normal"/>
-              <w:spacing w:before="0" w:after="80"/>
-              <w:rPr/>
-            </w:pPr>
-            <w:r>
-              <w:rPr/>
-            </w:r>
-          </w:p>
-        </w:tc>
-        <w:tc>
-          <w:tcPr>
-            <w:tcW w:w="2297" w:type="dxa"/>
+            <w:tcW w:w="3003" w:type="dxa"/>
+            <w:tcBorders>
+              <w:top w:val="single" w:sz="4" w:space="0" w:color="000000"/>
+              <w:left w:val="single" w:sz="4" w:space="0" w:color="000000"/>
+              <w:bottom w:val="single" w:sz="4" w:space="0" w:color="000000"/>
+              <w:right w:val="single" w:sz="4" w:space="0" w:color="000000"/>
+            </w:tcBorders>
+          </w:tcPr>
+          <w:p>
+            <w:pPr>
+              <w:pStyle w:val="Normal"/>
+              <w:spacing w:before="0" w:after="80"/>
+              <w:rPr/>
+            </w:pPr>
+            <w:r>
+              <w:rPr/>
+            </w:r>
+          </w:p>
+        </w:tc>
+        <w:tc>
+          <w:tcPr>
+            <w:tcW w:w="2364" w:type="dxa"/>
+            <w:tcBorders>
+              <w:top w:val="single" w:sz="4" w:space="0" w:color="000000"/>
+              <w:left w:val="single" w:sz="4" w:space="0" w:color="000000"/>
+              <w:bottom w:val="single" w:sz="4" w:space="0" w:color="000000"/>
+              <w:right w:val="single" w:sz="4" w:space="0" w:color="000000"/>
+            </w:tcBorders>
+          </w:tcPr>
+          <w:p>
+            <w:pPr>
+              <w:pStyle w:val="Normal"/>
+              <w:spacing w:before="0" w:after="80"/>
+              <w:rPr/>
+            </w:pPr>
+            <w:r>
+              <w:rPr/>
+            </w:r>
+          </w:p>
+        </w:tc>
+        <w:tc>
+          <w:tcPr>
+            <w:tcW w:w="2296" w:type="dxa"/>
             <w:tcBorders>
               <w:top w:val="single" w:sz="4" w:space="0" w:color="000000"/>
               <w:left w:val="single" w:sz="4" w:space="0" w:color="000000"/>
@@ -526,7 +526,7 @@
         <w:trPr/>
         <w:tc>
           <w:tcPr>
-            <w:tcW w:w="1697" w:type="dxa"/>
+            <w:tcW w:w="1696" w:type="dxa"/>
             <w:tcBorders>
               <w:top w:val="single" w:sz="4" w:space="0" w:color="000000"/>
               <w:left w:val="single" w:sz="4" w:space="0" w:color="000000"/>
@@ -548,49 +548,49 @@
         </w:tc>
         <w:tc>
           <w:tcPr>
-            <w:tcW w:w="3002" w:type="dxa"/>
-            <w:tcBorders>
-              <w:top w:val="single" w:sz="4" w:space="0" w:color="000000"/>
-              <w:left w:val="single" w:sz="4" w:space="0" w:color="000000"/>
-              <w:bottom w:val="single" w:sz="4" w:space="0" w:color="000000"/>
-              <w:right w:val="single" w:sz="4" w:space="0" w:color="000000"/>
-            </w:tcBorders>
-          </w:tcPr>
-          <w:p>
-            <w:pPr>
-              <w:pStyle w:val="Normal"/>
-              <w:spacing w:before="0" w:after="80"/>
-              <w:rPr/>
-            </w:pPr>
-            <w:r>
-              <w:rPr/>
-            </w:r>
-          </w:p>
-        </w:tc>
-        <w:tc>
-          <w:tcPr>
-            <w:tcW w:w="2363" w:type="dxa"/>
-            <w:tcBorders>
-              <w:top w:val="single" w:sz="4" w:space="0" w:color="000000"/>
-              <w:left w:val="single" w:sz="4" w:space="0" w:color="000000"/>
-              <w:bottom w:val="single" w:sz="4" w:space="0" w:color="000000"/>
-              <w:right w:val="single" w:sz="4" w:space="0" w:color="000000"/>
-            </w:tcBorders>
-          </w:tcPr>
-          <w:p>
-            <w:pPr>
-              <w:pStyle w:val="Normal"/>
-              <w:spacing w:before="0" w:after="80"/>
-              <w:rPr/>
-            </w:pPr>
-            <w:r>
-              <w:rPr/>
-            </w:r>
-          </w:p>
-        </w:tc>
-        <w:tc>
-          <w:tcPr>
-            <w:tcW w:w="2297" w:type="dxa"/>
+            <w:tcW w:w="3003" w:type="dxa"/>
+            <w:tcBorders>
+              <w:top w:val="single" w:sz="4" w:space="0" w:color="000000"/>
+              <w:left w:val="single" w:sz="4" w:space="0" w:color="000000"/>
+              <w:bottom w:val="single" w:sz="4" w:space="0" w:color="000000"/>
+              <w:right w:val="single" w:sz="4" w:space="0" w:color="000000"/>
+            </w:tcBorders>
+          </w:tcPr>
+          <w:p>
+            <w:pPr>
+              <w:pStyle w:val="Normal"/>
+              <w:spacing w:before="0" w:after="80"/>
+              <w:rPr/>
+            </w:pPr>
+            <w:r>
+              <w:rPr/>
+            </w:r>
+          </w:p>
+        </w:tc>
+        <w:tc>
+          <w:tcPr>
+            <w:tcW w:w="2364" w:type="dxa"/>
+            <w:tcBorders>
+              <w:top w:val="single" w:sz="4" w:space="0" w:color="000000"/>
+              <w:left w:val="single" w:sz="4" w:space="0" w:color="000000"/>
+              <w:bottom w:val="single" w:sz="4" w:space="0" w:color="000000"/>
+              <w:right w:val="single" w:sz="4" w:space="0" w:color="000000"/>
+            </w:tcBorders>
+          </w:tcPr>
+          <w:p>
+            <w:pPr>
+              <w:pStyle w:val="Normal"/>
+              <w:spacing w:before="0" w:after="80"/>
+              <w:rPr/>
+            </w:pPr>
+            <w:r>
+              <w:rPr/>
+            </w:r>
+          </w:p>
+        </w:tc>
+        <w:tc>
+          <w:tcPr>
+            <w:tcW w:w="2296" w:type="dxa"/>
             <w:tcBorders>
               <w:top w:val="single" w:sz="4" w:space="0" w:color="000000"/>
               <w:left w:val="single" w:sz="4" w:space="0" w:color="000000"/>
@@ -1737,8 +1737,8 @@
         </w:tblCellMar>
       </w:tblPr>
       <w:tblGrid>
-        <w:gridCol w:w="1697"/>
-        <w:gridCol w:w="2903"/>
+        <w:gridCol w:w="1696"/>
+        <w:gridCol w:w="2904"/>
         <w:gridCol w:w="3199"/>
         <w:gridCol w:w="1560"/>
       </w:tblGrid>
@@ -1748,7 +1748,7 @@
         </w:trPr>
         <w:tc>
           <w:tcPr>
-            <w:tcW w:w="1697" w:type="dxa"/>
+            <w:tcW w:w="1696" w:type="dxa"/>
             <w:tcBorders>
               <w:top w:val="single" w:sz="4" w:space="0" w:color="000000"/>
               <w:left w:val="single" w:sz="4" w:space="0" w:color="000000"/>
@@ -1775,7 +1775,7 @@
         </w:tc>
         <w:tc>
           <w:tcPr>
-            <w:tcW w:w="2903" w:type="dxa"/>
+            <w:tcW w:w="2904" w:type="dxa"/>
             <w:tcBorders>
               <w:top w:val="single" w:sz="4" w:space="0" w:color="000000"/>
               <w:left w:val="single" w:sz="4" w:space="0" w:color="000000"/>
@@ -1859,7 +1859,7 @@
         <w:trPr/>
         <w:tc>
           <w:tcPr>
-            <w:tcW w:w="1697" w:type="dxa"/>
+            <w:tcW w:w="1696" w:type="dxa"/>
             <w:tcBorders>
               <w:top w:val="single" w:sz="4" w:space="0" w:color="000000"/>
               <w:left w:val="single" w:sz="4" w:space="0" w:color="000000"/>
@@ -1881,7 +1881,7 @@
         </w:tc>
         <w:tc>
           <w:tcPr>
-            <w:tcW w:w="2903" w:type="dxa"/>
+            <w:tcW w:w="2904" w:type="dxa"/>
             <w:tcBorders>
               <w:top w:val="single" w:sz="4" w:space="0" w:color="000000"/>
               <w:left w:val="single" w:sz="4" w:space="0" w:color="000000"/>
@@ -1954,7 +1954,7 @@
         <w:trPr/>
         <w:tc>
           <w:tcPr>
-            <w:tcW w:w="1697" w:type="dxa"/>
+            <w:tcW w:w="1696" w:type="dxa"/>
             <w:tcBorders>
               <w:top w:val="single" w:sz="4" w:space="0" w:color="000000"/>
               <w:left w:val="single" w:sz="4" w:space="0" w:color="000000"/>
@@ -1976,7 +1976,7 @@
         </w:tc>
         <w:tc>
           <w:tcPr>
-            <w:tcW w:w="2903" w:type="dxa"/>
+            <w:tcW w:w="2904" w:type="dxa"/>
             <w:tcBorders>
               <w:top w:val="single" w:sz="4" w:space="0" w:color="000000"/>
               <w:left w:val="single" w:sz="4" w:space="0" w:color="000000"/>
@@ -2224,6 +2224,7 @@
                 <w:rFonts w:ascii="Arial;sans-serif" w:hAnsi="Arial;sans-serif"/>
                 <w:b/>
                 <w:i w:val="false"/>
+                <w:i w:val="false"/>
                 <w:caps w:val="false"/>
                 <w:smallCaps w:val="false"/>
                 <w:strike w:val="false"/>
@@ -2236,7 +2237,20 @@
               </w:rPr>
             </w:pPr>
             <w:r>
-              <w:rPr/>
+              <w:rPr>
+                <w:rFonts w:ascii="Arial;sans-serif" w:hAnsi="Arial;sans-serif"/>
+                <w:b/>
+                <w:i w:val="false"/>
+                <w:caps w:val="false"/>
+                <w:smallCaps w:val="false"/>
+                <w:strike w:val="false"/>
+                <w:dstrike w:val="false"/>
+                <w:color w:val="000000"/>
+                <w:sz w:val="22"/>
+                <w:u w:val="none"/>
+                <w:effect w:val="none"/>
+                <w:shd w:fill="auto" w:val="clear"/>
+              </w:rPr>
             </w:r>
           </w:p>
           <w:p>
@@ -2316,6 +2330,7 @@
                 <w:rFonts w:ascii="Arial;sans-serif" w:hAnsi="Arial;sans-serif"/>
                 <w:b w:val="false"/>
                 <w:i w:val="false"/>
+                <w:i w:val="false"/>
                 <w:caps w:val="false"/>
                 <w:smallCaps w:val="false"/>
                 <w:strike w:val="false"/>
@@ -2364,6 +2379,7 @@
                 <w:rFonts w:ascii="Arial;sans-serif" w:hAnsi="Arial;sans-serif"/>
                 <w:b w:val="false"/>
                 <w:i w:val="false"/>
+                <w:i w:val="false"/>
                 <w:caps w:val="false"/>
                 <w:smallCaps w:val="false"/>
                 <w:strike w:val="false"/>
@@ -2447,6 +2463,7 @@
                 <w:rFonts w:ascii="Arial;sans-serif" w:hAnsi="Arial;sans-serif"/>
                 <w:b w:val="false"/>
                 <w:i w:val="false"/>
+                <w:i w:val="false"/>
                 <w:caps w:val="false"/>
                 <w:smallCaps w:val="false"/>
                 <w:strike w:val="false"/>
@@ -2494,7 +2511,7 @@
         <w:trPr/>
         <w:tc>
           <w:tcPr>
-            <w:tcW w:w="1697" w:type="dxa"/>
+            <w:tcW w:w="1696" w:type="dxa"/>
             <w:tcBorders>
               <w:top w:val="single" w:sz="4" w:space="0" w:color="000000"/>
               <w:left w:val="single" w:sz="4" w:space="0" w:color="000000"/>
@@ -2516,7 +2533,7 @@
         </w:tc>
         <w:tc>
           <w:tcPr>
-            <w:tcW w:w="2903" w:type="dxa"/>
+            <w:tcW w:w="2904" w:type="dxa"/>
             <w:tcBorders>
               <w:top w:val="single" w:sz="4" w:space="0" w:color="000000"/>
               <w:left w:val="single" w:sz="4" w:space="0" w:color="000000"/>
@@ -2576,6 +2593,7 @@
                 <w:rFonts w:ascii="Arial;sans-serif" w:hAnsi="Arial;sans-serif"/>
                 <w:b w:val="false"/>
                 <w:i w:val="false"/>
+                <w:i w:val="false"/>
                 <w:caps w:val="false"/>
                 <w:smallCaps w:val="false"/>
                 <w:strike w:val="false"/>
@@ -2614,6 +2632,7 @@
               <w:rPr>
                 <w:rFonts w:ascii="Arial;sans-serif" w:hAnsi="Arial;sans-serif"/>
                 <w:b w:val="false"/>
+                <w:i w:val="false"/>
                 <w:i w:val="false"/>
                 <w:caps w:val="false"/>
                 <w:smallCaps w:val="false"/>
@@ -2749,6 +2768,7 @@
                 <w:rFonts w:ascii="Arial;sans-serif" w:hAnsi="Arial;sans-serif"/>
                 <w:b/>
                 <w:i w:val="false"/>
+                <w:i w:val="false"/>
                 <w:caps w:val="false"/>
                 <w:smallCaps w:val="false"/>
                 <w:strike w:val="false"/>
@@ -2789,6 +2809,7 @@
                 <w:rFonts w:ascii="Arial;sans-serif" w:hAnsi="Arial;sans-serif"/>
                 <w:b w:val="false"/>
                 <w:i w:val="false"/>
+                <w:i w:val="false"/>
                 <w:caps w:val="false"/>
                 <w:smallCaps w:val="false"/>
                 <w:strike w:val="false"/>
@@ -3167,6 +3188,7 @@
                 <w:rFonts w:ascii="Arial;sans-serif" w:hAnsi="Arial;sans-serif"/>
                 <w:b w:val="false"/>
                 <w:i w:val="false"/>
+                <w:i w:val="false"/>
                 <w:caps w:val="false"/>
                 <w:smallCaps w:val="false"/>
                 <w:strike w:val="false"/>
@@ -3214,7 +3236,7 @@
         <w:trPr/>
         <w:tc>
           <w:tcPr>
-            <w:tcW w:w="1697" w:type="dxa"/>
+            <w:tcW w:w="1696" w:type="dxa"/>
             <w:tcBorders>
               <w:top w:val="single" w:sz="4" w:space="0" w:color="000000"/>
               <w:left w:val="single" w:sz="4" w:space="0" w:color="000000"/>
@@ -3236,7 +3258,665 @@
         </w:tc>
         <w:tc>
           <w:tcPr>
-            <w:tcW w:w="2903" w:type="dxa"/>
+            <w:tcW w:w="2904" w:type="dxa"/>
+            <w:tcBorders>
+              <w:top w:val="single" w:sz="4" w:space="0" w:color="000000"/>
+              <w:left w:val="single" w:sz="4" w:space="0" w:color="000000"/>
+              <w:bottom w:val="single" w:sz="4" w:space="0" w:color="000000"/>
+              <w:right w:val="single" w:sz="4" w:space="0" w:color="000000"/>
+            </w:tcBorders>
+          </w:tcPr>
+          <w:p>
+            <w:pPr>
+              <w:pStyle w:val="BodyText"/>
+              <w:spacing w:before="0" w:after="80"/>
+              <w:rPr>
+                <w:b w:val="false"/>
+              </w:rPr>
+            </w:pPr>
+            <w:bookmarkStart w:id="8" w:name="docs-internal-guid-28b6f053-7fff-d4cf-78"/>
+            <w:bookmarkEnd w:id="8"/>
+            <w:r>
+              <w:rPr>
+                <w:rFonts w:ascii="Arial;sans-serif" w:hAnsi="Arial;sans-serif"/>
+                <w:b/>
+                <w:i w:val="false"/>
+                <w:iCs/>
+                <w:caps w:val="false"/>
+                <w:smallCaps w:val="false"/>
+                <w:strike w:val="false"/>
+                <w:dstrike w:val="false"/>
+                <w:color w:val="595959"/>
+                <w:sz w:val="18"/>
+                <w:szCs w:val="18"/>
+                <w:u w:val="none"/>
+                <w:effect w:val="none"/>
+                <w:shd w:fill="auto" w:val="clear"/>
+              </w:rPr>
+              <w:t>1. Fixed-size / sliding window chunking</w:t>
+            </w:r>
+            <w:r>
+              <w:rPr>
+                <w:b w:val="false"/>
+                <w:i/>
+                <w:iCs/>
+                <w:caps w:val="false"/>
+                <w:smallCaps w:val="false"/>
+                <w:strike w:val="false"/>
+                <w:dstrike w:val="false"/>
+                <w:color w:val="595959"/>
+                <w:sz w:val="18"/>
+                <w:szCs w:val="18"/>
+                <w:u w:val="none"/>
+                <w:effect w:val="none"/>
+                <w:shd w:fill="auto" w:val="clear"/>
+              </w:rPr>
+              <w:t xml:space="preserve"> </w:t>
+            </w:r>
+            <w:r>
+              <w:rPr>
+                <w:rFonts w:ascii="Arial;sans-serif" w:hAnsi="Arial;sans-serif"/>
+                <w:b w:val="false"/>
+                <w:i w:val="false"/>
+                <w:iCs/>
+                <w:caps w:val="false"/>
+                <w:smallCaps w:val="false"/>
+                <w:strike w:val="false"/>
+                <w:dstrike w:val="false"/>
+                <w:color w:val="595959"/>
+                <w:sz w:val="18"/>
+                <w:szCs w:val="18"/>
+                <w:u w:val="none"/>
+                <w:effect w:val="none"/>
+                <w:shd w:fill="auto" w:val="clear"/>
+              </w:rPr>
+              <w:t>(e.g., LangChain `RecursiveCharacterTextSplitter`)</w:t>
+            </w:r>
+          </w:p>
+          <w:p>
+            <w:pPr>
+              <w:pStyle w:val="BodyText"/>
+              <w:bidi w:val="0"/>
+              <w:spacing w:lineRule="auto" w:line="331" w:before="0" w:after="80"/>
+              <w:ind w:hanging="0" w:left="0" w:right="0"/>
+              <w:rPr/>
+            </w:pPr>
+            <w:r>
+              <w:rPr>
+                <w:rFonts w:ascii="Arial;sans-serif" w:hAnsi="Arial;sans-serif"/>
+                <w:b/>
+                <w:i w:val="false"/>
+                <w:caps w:val="false"/>
+                <w:smallCaps w:val="false"/>
+                <w:strike w:val="false"/>
+                <w:dstrike w:val="false"/>
+                <w:color w:val="595959"/>
+                <w:sz w:val="18"/>
+                <w:u w:val="none"/>
+                <w:effect w:val="none"/>
+                <w:shd w:fill="auto" w:val="clear"/>
+              </w:rPr>
+              <w:t>2.</w:t>
+            </w:r>
+            <w:r>
+              <w:rPr>
+                <w:b w:val="false"/>
+                <w:caps w:val="false"/>
+                <w:smallCaps w:val="false"/>
+                <w:strike w:val="false"/>
+                <w:dstrike w:val="false"/>
+                <w:color w:val="595959"/>
+                <w:u w:val="none"/>
+                <w:effect w:val="none"/>
+                <w:shd w:fill="auto" w:val="clear"/>
+              </w:rPr>
+              <w:t xml:space="preserve"> </w:t>
+            </w:r>
+            <w:r>
+              <w:rPr>
+                <w:rFonts w:ascii="Arial;sans-serif" w:hAnsi="Arial;sans-serif"/>
+                <w:b/>
+                <w:i w:val="false"/>
+                <w:caps w:val="false"/>
+                <w:smallCaps w:val="false"/>
+                <w:strike w:val="false"/>
+                <w:dstrike w:val="false"/>
+                <w:color w:val="595959"/>
+                <w:sz w:val="18"/>
+                <w:u w:val="none"/>
+                <w:effect w:val="none"/>
+                <w:shd w:fill="auto" w:val="clear"/>
+              </w:rPr>
+              <w:t>Sentence-boundary semantic chunking</w:t>
+            </w:r>
+            <w:r>
+              <w:rPr>
+                <w:b w:val="false"/>
+                <w:caps w:val="false"/>
+                <w:smallCaps w:val="false"/>
+                <w:strike w:val="false"/>
+                <w:dstrike w:val="false"/>
+                <w:color w:val="595959"/>
+                <w:u w:val="none"/>
+                <w:effect w:val="none"/>
+                <w:shd w:fill="auto" w:val="clear"/>
+              </w:rPr>
+              <w:t xml:space="preserve"> </w:t>
+            </w:r>
+            <w:r>
+              <w:rPr>
+                <w:rFonts w:ascii="Arial;sans-serif" w:hAnsi="Arial;sans-serif"/>
+                <w:b w:val="false"/>
+                <w:i w:val="false"/>
+                <w:caps w:val="false"/>
+                <w:smallCaps w:val="false"/>
+                <w:strike w:val="false"/>
+                <w:dstrike w:val="false"/>
+                <w:color w:val="595959"/>
+                <w:sz w:val="18"/>
+                <w:u w:val="none"/>
+                <w:effect w:val="none"/>
+                <w:shd w:fill="auto" w:val="clear"/>
+              </w:rPr>
+              <w:t>(splits on Bangla danda `</w:t>
+            </w:r>
+            <w:r>
+              <w:rPr>
+                <w:rFonts w:cs="Arial;sans-serif"/>
+                <w:bCs w:val="false"/>
+                <w:iCs w:val="false"/>
+                <w:caps w:val="false"/>
+                <w:smallCaps w:val="false"/>
+                <w:strike w:val="false"/>
+                <w:dstrike w:val="false"/>
+                <w:color w:val="595959"/>
+                <w:szCs w:val="18"/>
+                <w:u w:val="none"/>
+                <w:effect w:val="none"/>
+                <w:shd w:fill="auto" w:val="clear"/>
+              </w:rPr>
+              <w:t>।</w:t>
+            </w:r>
+            <w:r>
+              <w:rPr>
+                <w:rFonts w:ascii="Arial;sans-serif" w:hAnsi="Arial;sans-serif"/>
+                <w:b w:val="false"/>
+                <w:i w:val="false"/>
+                <w:caps w:val="false"/>
+                <w:smallCaps w:val="false"/>
+                <w:strike w:val="false"/>
+                <w:dstrike w:val="false"/>
+                <w:color w:val="595959"/>
+                <w:sz w:val="18"/>
+                <w:u w:val="none"/>
+                <w:effect w:val="none"/>
+                <w:shd w:fill="auto" w:val="clear"/>
+              </w:rPr>
+              <w:t>`, pipe `|` as OCR fallback, newlines, and Latin punctuation; groups sentences into size-bounded windows with overlap)</w:t>
+            </w:r>
+          </w:p>
+          <w:p>
+            <w:pPr>
+              <w:pStyle w:val="BodyText"/>
+              <w:spacing w:before="0" w:after="140"/>
+              <w:rPr/>
+            </w:pPr>
+            <w:r>
+              <w:rPr/>
+              <w:br/>
+            </w:r>
+          </w:p>
+        </w:tc>
+        <w:tc>
+          <w:tcPr>
+            <w:tcW w:w="3199" w:type="dxa"/>
+            <w:tcBorders>
+              <w:top w:val="single" w:sz="4" w:space="0" w:color="000000"/>
+              <w:left w:val="single" w:sz="4" w:space="0" w:color="000000"/>
+              <w:bottom w:val="single" w:sz="4" w:space="0" w:color="000000"/>
+              <w:right w:val="single" w:sz="4" w:space="0" w:color="000000"/>
+            </w:tcBorders>
+          </w:tcPr>
+          <w:p>
+            <w:pPr>
+              <w:pStyle w:val="BodyText"/>
+              <w:spacing w:before="0" w:after="80"/>
+              <w:rPr>
+                <w:b w:val="false"/>
+              </w:rPr>
+            </w:pPr>
+            <w:bookmarkStart w:id="9" w:name="docs-internal-guid-35ebb9ed-7fff-24c4-e5"/>
+            <w:bookmarkEnd w:id="9"/>
+            <w:r>
+              <w:rPr>
+                <w:rFonts w:ascii="Arial;sans-serif" w:hAnsi="Arial;sans-serif"/>
+                <w:b/>
+                <w:i w:val="false"/>
+                <w:caps w:val="false"/>
+                <w:smallCaps w:val="false"/>
+                <w:strike w:val="false"/>
+                <w:dstrike w:val="false"/>
+                <w:color w:val="000000"/>
+                <w:sz w:val="22"/>
+                <w:u w:val="none"/>
+                <w:effect w:val="none"/>
+                <w:shd w:fill="auto" w:val="clear"/>
+              </w:rPr>
+              <w:t>Choice:</w:t>
+            </w:r>
+            <w:r>
+              <w:rPr>
+                <w:b w:val="false"/>
+                <w:caps w:val="false"/>
+                <w:smallCaps w:val="false"/>
+                <w:strike w:val="false"/>
+                <w:dstrike w:val="false"/>
+                <w:color w:val="000000"/>
+                <w:u w:val="none"/>
+                <w:effect w:val="none"/>
+                <w:shd w:fill="auto" w:val="clear"/>
+              </w:rPr>
+              <w:t xml:space="preserve"> </w:t>
+            </w:r>
+            <w:r>
+              <w:rPr>
+                <w:rFonts w:ascii="Arial;sans-serif" w:hAnsi="Arial;sans-serif"/>
+                <w:b w:val="false"/>
+                <w:i w:val="false"/>
+                <w:caps w:val="false"/>
+                <w:smallCaps w:val="false"/>
+                <w:strike w:val="false"/>
+                <w:dstrike w:val="false"/>
+                <w:color w:val="000000"/>
+                <w:sz w:val="22"/>
+                <w:u w:val="none"/>
+                <w:effect w:val="none"/>
+                <w:shd w:fill="auto" w:val="clear"/>
+              </w:rPr>
+              <w:t>Sentence-boundary semantic chunking (Bonus task E4)</w:t>
+            </w:r>
+          </w:p>
+          <w:p>
+            <w:pPr>
+              <w:pStyle w:val="BodyText"/>
+              <w:bidi w:val="0"/>
+              <w:ind w:left="0"/>
+              <w:jc w:val="left"/>
+              <w:rPr/>
+            </w:pPr>
+            <w:r>
+              <w:rPr/>
+            </w:r>
+          </w:p>
+          <w:p>
+            <w:pPr>
+              <w:pStyle w:val="BodyText"/>
+              <w:bidi w:val="0"/>
+              <w:spacing w:lineRule="auto" w:line="331" w:before="0" w:after="80"/>
+              <w:ind w:hanging="0" w:left="0" w:right="0"/>
+              <w:jc w:val="left"/>
+              <w:rPr>
+                <w:rFonts w:ascii="Arial;sans-serif" w:hAnsi="Arial;sans-serif"/>
+                <w:b/>
+                <w:i w:val="false"/>
+                <w:caps w:val="false"/>
+                <w:smallCaps w:val="false"/>
+                <w:strike w:val="false"/>
+                <w:dstrike w:val="false"/>
+                <w:color w:val="000000"/>
+                <w:sz w:val="22"/>
+                <w:u w:val="none"/>
+                <w:effect w:val="none"/>
+                <w:shd w:fill="auto" w:val="clear"/>
+              </w:rPr>
+            </w:pPr>
+            <w:r>
+              <w:rPr>
+                <w:rFonts w:ascii="Arial;sans-serif" w:hAnsi="Arial;sans-serif"/>
+                <w:b/>
+                <w:i w:val="false"/>
+                <w:caps w:val="false"/>
+                <w:smallCaps w:val="false"/>
+                <w:strike w:val="false"/>
+                <w:dstrike w:val="false"/>
+                <w:color w:val="000000"/>
+                <w:sz w:val="22"/>
+                <w:u w:val="none"/>
+                <w:effect w:val="none"/>
+                <w:shd w:fill="auto" w:val="clear"/>
+              </w:rPr>
+              <w:t>Why:</w:t>
+            </w:r>
+          </w:p>
+          <w:p>
+            <w:pPr>
+              <w:pStyle w:val="BodyText"/>
+              <w:bidi w:val="0"/>
+              <w:ind w:left="0"/>
+              <w:jc w:val="left"/>
+              <w:rPr/>
+            </w:pPr>
+            <w:r>
+              <w:rPr/>
+            </w:r>
+          </w:p>
+          <w:p>
+            <w:pPr>
+              <w:pStyle w:val="BodyText"/>
+              <w:bidi w:val="0"/>
+              <w:spacing w:lineRule="auto" w:line="331" w:before="0" w:after="80"/>
+              <w:ind w:hanging="0" w:left="0" w:right="0"/>
+              <w:jc w:val="left"/>
+              <w:rPr>
+                <w:b w:val="false"/>
+              </w:rPr>
+            </w:pPr>
+            <w:r>
+              <w:rPr>
+                <w:rFonts w:ascii="Arial;sans-serif" w:hAnsi="Arial;sans-serif"/>
+                <w:b/>
+                <w:i w:val="false"/>
+                <w:caps w:val="false"/>
+                <w:smallCaps w:val="false"/>
+                <w:strike w:val="false"/>
+                <w:dstrike w:val="false"/>
+                <w:color w:val="000000"/>
+                <w:sz w:val="22"/>
+                <w:u w:val="none"/>
+                <w:effect w:val="none"/>
+                <w:shd w:fill="auto" w:val="clear"/>
+              </w:rPr>
+              <w:t>Fixed-size / sliding window:</w:t>
+            </w:r>
+            <w:r>
+              <w:rPr>
+                <w:b w:val="false"/>
+                <w:caps w:val="false"/>
+                <w:smallCaps w:val="false"/>
+                <w:strike w:val="false"/>
+                <w:dstrike w:val="false"/>
+                <w:color w:val="000000"/>
+                <w:u w:val="none"/>
+                <w:effect w:val="none"/>
+                <w:shd w:fill="auto" w:val="clear"/>
+              </w:rPr>
+              <w:t xml:space="preserve"> </w:t>
+            </w:r>
+            <w:r>
+              <w:rPr>
+                <w:rFonts w:ascii="Arial;sans-serif" w:hAnsi="Arial;sans-serif"/>
+                <w:b w:val="false"/>
+                <w:i w:val="false"/>
+                <w:caps w:val="false"/>
+                <w:smallCaps w:val="false"/>
+                <w:strike w:val="false"/>
+                <w:dstrike w:val="false"/>
+                <w:color w:val="000000"/>
+                <w:sz w:val="22"/>
+                <w:u w:val="none"/>
+                <w:effect w:val="none"/>
+                <w:shd w:fill="auto" w:val="clear"/>
+              </w:rPr>
+              <w:t>Splits strictly at a character count regardless of content. For our corpus, this is doubly harmful: (1) EasyOCR (our chosen OCR) outputs text as one block without paragraph breaks, so a fixed-size splitter cuts arbitrarily mid-sentence, destroying the semantic unit that a retriever needs to match against a question; (2) pages with headings and body text mixed together get their content blended across chunk boundaries.</w:t>
+            </w:r>
+          </w:p>
+          <w:p>
+            <w:pPr>
+              <w:pStyle w:val="BodyText"/>
+              <w:bidi w:val="0"/>
+              <w:ind w:left="0"/>
+              <w:jc w:val="left"/>
+              <w:rPr/>
+            </w:pPr>
+            <w:r>
+              <w:rPr/>
+            </w:r>
+          </w:p>
+          <w:p>
+            <w:pPr>
+              <w:pStyle w:val="BodyText"/>
+              <w:bidi w:val="0"/>
+              <w:spacing w:lineRule="auto" w:line="331" w:before="0" w:after="80"/>
+              <w:ind w:hanging="0" w:left="0" w:right="0"/>
+              <w:jc w:val="left"/>
+              <w:rPr/>
+            </w:pPr>
+            <w:r>
+              <w:rPr>
+                <w:rFonts w:ascii="Arial;sans-serif" w:hAnsi="Arial;sans-serif"/>
+                <w:b/>
+                <w:i w:val="false"/>
+                <w:caps w:val="false"/>
+                <w:smallCaps w:val="false"/>
+                <w:strike w:val="false"/>
+                <w:dstrike w:val="false"/>
+                <w:color w:val="000000"/>
+                <w:sz w:val="22"/>
+                <w:u w:val="none"/>
+                <w:effect w:val="none"/>
+                <w:shd w:fill="auto" w:val="clear"/>
+              </w:rPr>
+              <w:t>Semantic chunking (chosen):</w:t>
+            </w:r>
+            <w:r>
+              <w:rPr>
+                <w:b w:val="false"/>
+                <w:caps w:val="false"/>
+                <w:smallCaps w:val="false"/>
+                <w:strike w:val="false"/>
+                <w:dstrike w:val="false"/>
+                <w:color w:val="000000"/>
+                <w:u w:val="none"/>
+                <w:effect w:val="none"/>
+                <w:shd w:fill="auto" w:val="clear"/>
+              </w:rPr>
+              <w:t xml:space="preserve"> </w:t>
+            </w:r>
+            <w:r>
+              <w:rPr>
+                <w:rFonts w:ascii="Arial;sans-serif" w:hAnsi="Arial;sans-serif"/>
+                <w:b w:val="false"/>
+                <w:i w:val="false"/>
+                <w:caps w:val="false"/>
+                <w:smallCaps w:val="false"/>
+                <w:strike w:val="false"/>
+                <w:dstrike w:val="false"/>
+                <w:color w:val="000000"/>
+                <w:sz w:val="22"/>
+                <w:u w:val="none"/>
+                <w:effect w:val="none"/>
+                <w:shd w:fill="auto" w:val="clear"/>
+              </w:rPr>
+              <w:t>Splits at natural sentence boundaries — Bangla danda `</w:t>
+            </w:r>
+            <w:r>
+              <w:rPr>
+                <w:rFonts w:cs="Arial;sans-serif"/>
+                <w:bCs w:val="false"/>
+                <w:iCs w:val="false"/>
+                <w:caps w:val="false"/>
+                <w:smallCaps w:val="false"/>
+                <w:strike w:val="false"/>
+                <w:dstrike w:val="false"/>
+                <w:color w:val="000000"/>
+                <w:szCs w:val="22"/>
+                <w:u w:val="none"/>
+                <w:effect w:val="none"/>
+                <w:shd w:fill="auto" w:val="clear"/>
+              </w:rPr>
+              <w:t>।</w:t>
+            </w:r>
+            <w:r>
+              <w:rPr>
+                <w:rFonts w:ascii="Arial;sans-serif" w:hAnsi="Arial;sans-serif"/>
+                <w:b w:val="false"/>
+                <w:i w:val="false"/>
+                <w:caps w:val="false"/>
+                <w:smallCaps w:val="false"/>
+                <w:strike w:val="false"/>
+                <w:dstrike w:val="false"/>
+                <w:color w:val="000000"/>
+                <w:sz w:val="22"/>
+                <w:u w:val="none"/>
+                <w:effect w:val="none"/>
+                <w:shd w:fill="auto" w:val="clear"/>
+              </w:rPr>
+              <w:t>`, Latin punctuation `. ! ?`, and newlines — then groups sentences greedily into size-bounded windows with overlap. This is our assigned Bonus task (E4). It directly solves two corpus-specific problems: it does not rely on the OCR engine to output newlines (which EasyOCR does not), and it never cuts mid-sentence so each chunk holds a complete, coherent thought that an embedding model can encode meaningfully. A pipe character `|` (common OCR substitution for `</w:t>
+            </w:r>
+            <w:r>
+              <w:rPr>
+                <w:rFonts w:cs="Arial;sans-serif"/>
+                <w:bCs w:val="false"/>
+                <w:iCs w:val="false"/>
+                <w:caps w:val="false"/>
+                <w:smallCaps w:val="false"/>
+                <w:strike w:val="false"/>
+                <w:dstrike w:val="false"/>
+                <w:color w:val="000000"/>
+                <w:szCs w:val="22"/>
+                <w:u w:val="none"/>
+                <w:effect w:val="none"/>
+                <w:shd w:fill="auto" w:val="clear"/>
+              </w:rPr>
+              <w:t>।</w:t>
+            </w:r>
+            <w:r>
+              <w:rPr>
+                <w:rFonts w:ascii="Arial;sans-serif" w:hAnsi="Arial;sans-serif"/>
+                <w:b w:val="false"/>
+                <w:i w:val="false"/>
+                <w:caps w:val="false"/>
+                <w:smallCaps w:val="false"/>
+                <w:strike w:val="false"/>
+                <w:dstrike w:val="false"/>
+                <w:color w:val="000000"/>
+                <w:sz w:val="22"/>
+                <w:u w:val="none"/>
+                <w:effect w:val="none"/>
+                <w:shd w:fill="auto" w:val="clear"/>
+              </w:rPr>
+              <w:t>`) and a word-boundary hard fallback are included to handle OCR inaccuracies.</w:t>
+            </w:r>
+          </w:p>
+          <w:p>
+            <w:pPr>
+              <w:pStyle w:val="Normal"/>
+              <w:spacing w:before="0" w:after="80"/>
+              <w:rPr/>
+            </w:pPr>
+            <w:r>
+              <w:rPr/>
+            </w:r>
+          </w:p>
+        </w:tc>
+        <w:tc>
+          <w:tcPr>
+            <w:tcW w:w="1560" w:type="dxa"/>
+            <w:tcBorders>
+              <w:top w:val="single" w:sz="4" w:space="0" w:color="000000"/>
+              <w:left w:val="single" w:sz="4" w:space="0" w:color="000000"/>
+              <w:bottom w:val="single" w:sz="4" w:space="0" w:color="000000"/>
+              <w:right w:val="single" w:sz="4" w:space="0" w:color="000000"/>
+            </w:tcBorders>
+          </w:tcPr>
+          <w:p>
+            <w:pPr>
+              <w:pStyle w:val="Normal"/>
+              <w:spacing w:before="0" w:after="80"/>
+              <w:rPr>
+                <w:b w:val="false"/>
+              </w:rPr>
+            </w:pPr>
+            <w:bookmarkStart w:id="10" w:name="docs-internal-guid-05bd4095-7fff-de72-a4"/>
+            <w:bookmarkEnd w:id="10"/>
+            <w:r>
+              <w:rPr>
+                <w:rFonts w:ascii="Arial;sans-serif" w:hAnsi="Arial;sans-serif"/>
+                <w:b/>
+                <w:i w:val="false"/>
+                <w:caps w:val="false"/>
+                <w:smallCaps w:val="false"/>
+                <w:strike w:val="false"/>
+                <w:dstrike w:val="false"/>
+                <w:color w:val="000000"/>
+                <w:sz w:val="22"/>
+                <w:u w:val="none"/>
+                <w:effect w:val="none"/>
+                <w:shd w:fill="auto" w:val="clear"/>
+              </w:rPr>
+              <w:t>No</w:t>
+            </w:r>
+            <w:r>
+              <w:rPr>
+                <w:b w:val="false"/>
+                <w:caps w:val="false"/>
+                <w:smallCaps w:val="false"/>
+                <w:strike w:val="false"/>
+                <w:dstrike w:val="false"/>
+                <w:color w:val="000000"/>
+                <w:u w:val="none"/>
+                <w:effect w:val="none"/>
+                <w:shd w:fill="auto" w:val="clear"/>
+              </w:rPr>
+              <w:t xml:space="preserve"> — </w:t>
+            </w:r>
+            <w:r>
+              <w:rPr>
+                <w:rFonts w:ascii="Arial;sans-serif" w:hAnsi="Arial;sans-serif"/>
+                <w:b w:val="false"/>
+                <w:i w:val="false"/>
+                <w:caps w:val="false"/>
+                <w:smallCaps w:val="false"/>
+                <w:strike w:val="false"/>
+                <w:dstrike w:val="false"/>
+                <w:color w:val="000000"/>
+                <w:sz w:val="22"/>
+                <w:u w:val="none"/>
+                <w:effect w:val="none"/>
+                <w:shd w:fill="auto" w:val="clear"/>
+              </w:rPr>
+              <w:t>implemented from scratch using Python regex and a greedy string-grouping algorithm to handle the corpus-specific punctuation marks (danda, pipe, Latin marks).</w:t>
+            </w:r>
+          </w:p>
+          <w:p>
+            <w:pPr>
+              <w:pStyle w:val="Normal"/>
+              <w:spacing w:before="0" w:after="80"/>
+              <w:rPr/>
+            </w:pPr>
+            <w:r>
+              <w:rPr/>
+            </w:r>
+          </w:p>
+        </w:tc>
+      </w:tr>
+      <w:tr>
+        <w:trPr/>
+        <w:tc>
+          <w:tcPr>
+            <w:tcW w:w="1696" w:type="dxa"/>
+            <w:tcBorders>
+              <w:top w:val="single" w:sz="4" w:space="0" w:color="000000"/>
+              <w:left w:val="single" w:sz="4" w:space="0" w:color="000000"/>
+              <w:bottom w:val="single" w:sz="4" w:space="0" w:color="000000"/>
+              <w:right w:val="single" w:sz="4" w:space="0" w:color="000000"/>
+            </w:tcBorders>
+          </w:tcPr>
+          <w:p>
+            <w:pPr>
+              <w:pStyle w:val="Normal"/>
+              <w:spacing w:before="0" w:after="80"/>
+              <w:rPr/>
+            </w:pPr>
+            <w:r>
+              <w:rPr/>
+              <w:t>Embedding</w:t>
+            </w:r>
+          </w:p>
+        </w:tc>
+        <w:tc>
+          <w:tcPr>
+            <w:tcW w:w="2904" w:type="dxa"/>
             <w:tcBorders>
               <w:top w:val="single" w:sz="4" w:space="0" w:color="000000"/>
               <w:left w:val="single" w:sz="4" w:space="0" w:color="000000"/>
@@ -3258,7 +3938,7 @@
                 <w:sz w:val="18"/>
                 <w:szCs w:val="18"/>
               </w:rPr>
-              <w:t>e.g. fixed vs semantic; size/overlap</w:t>
+              <w:t>e.g. which sentence-embedding model</w:t>
             </w:r>
           </w:p>
         </w:tc>
@@ -3309,102 +3989,7 @@
         <w:trPr/>
         <w:tc>
           <w:tcPr>
-            <w:tcW w:w="1697" w:type="dxa"/>
-            <w:tcBorders>
-              <w:top w:val="single" w:sz="4" w:space="0" w:color="000000"/>
-              <w:left w:val="single" w:sz="4" w:space="0" w:color="000000"/>
-              <w:bottom w:val="single" w:sz="4" w:space="0" w:color="000000"/>
-              <w:right w:val="single" w:sz="4" w:space="0" w:color="000000"/>
-            </w:tcBorders>
-          </w:tcPr>
-          <w:p>
-            <w:pPr>
-              <w:pStyle w:val="Normal"/>
-              <w:spacing w:before="0" w:after="80"/>
-              <w:rPr/>
-            </w:pPr>
-            <w:r>
-              <w:rPr/>
-              <w:t>Embedding</w:t>
-            </w:r>
-          </w:p>
-        </w:tc>
-        <w:tc>
-          <w:tcPr>
-            <w:tcW w:w="2903" w:type="dxa"/>
-            <w:tcBorders>
-              <w:top w:val="single" w:sz="4" w:space="0" w:color="000000"/>
-              <w:left w:val="single" w:sz="4" w:space="0" w:color="000000"/>
-              <w:bottom w:val="single" w:sz="4" w:space="0" w:color="000000"/>
-              <w:right w:val="single" w:sz="4" w:space="0" w:color="000000"/>
-            </w:tcBorders>
-          </w:tcPr>
-          <w:p>
-            <w:pPr>
-              <w:pStyle w:val="Normal"/>
-              <w:spacing w:before="0" w:after="80"/>
-              <w:rPr/>
-            </w:pPr>
-            <w:r>
-              <w:rPr>
-                <w:i/>
-                <w:iCs/>
-                <w:color w:val="595959"/>
-                <w:sz w:val="18"/>
-                <w:szCs w:val="18"/>
-              </w:rPr>
-              <w:t>e.g. which sentence-embedding model</w:t>
-            </w:r>
-          </w:p>
-        </w:tc>
-        <w:tc>
-          <w:tcPr>
-            <w:tcW w:w="3199" w:type="dxa"/>
-            <w:tcBorders>
-              <w:top w:val="single" w:sz="4" w:space="0" w:color="000000"/>
-              <w:left w:val="single" w:sz="4" w:space="0" w:color="000000"/>
-              <w:bottom w:val="single" w:sz="4" w:space="0" w:color="000000"/>
-              <w:right w:val="single" w:sz="4" w:space="0" w:color="000000"/>
-            </w:tcBorders>
-          </w:tcPr>
-          <w:p>
-            <w:pPr>
-              <w:pStyle w:val="Normal"/>
-              <w:spacing w:before="0" w:after="80"/>
-              <w:rPr/>
-            </w:pPr>
-            <w:r>
-              <w:rPr/>
-            </w:r>
-          </w:p>
-        </w:tc>
-        <w:tc>
-          <w:tcPr>
-            <w:tcW w:w="1560" w:type="dxa"/>
-            <w:tcBorders>
-              <w:top w:val="single" w:sz="4" w:space="0" w:color="000000"/>
-              <w:left w:val="single" w:sz="4" w:space="0" w:color="000000"/>
-              <w:bottom w:val="single" w:sz="4" w:space="0" w:color="000000"/>
-              <w:right w:val="single" w:sz="4" w:space="0" w:color="000000"/>
-            </w:tcBorders>
-          </w:tcPr>
-          <w:p>
-            <w:pPr>
-              <w:pStyle w:val="Normal"/>
-              <w:spacing w:before="0" w:after="80"/>
-              <w:rPr/>
-            </w:pPr>
-            <w:r>
-              <w:rPr/>
-            </w:r>
-          </w:p>
-        </w:tc>
-      </w:tr>
-      <w:tr>
-        <w:trPr/>
-        <w:tc>
-          <w:tcPr>
-            <w:tcW w:w="1697" w:type="dxa"/>
+            <w:tcW w:w="1696" w:type="dxa"/>
             <w:tcBorders>
               <w:top w:val="single" w:sz="4" w:space="0" w:color="000000"/>
               <w:left w:val="single" w:sz="4" w:space="0" w:color="000000"/>
@@ -3426,7 +4011,7 @@
         </w:tc>
         <w:tc>
           <w:tcPr>
-            <w:tcW w:w="2903" w:type="dxa"/>
+            <w:tcW w:w="2904" w:type="dxa"/>
             <w:tcBorders>
               <w:top w:val="single" w:sz="4" w:space="0" w:color="000000"/>
               <w:left w:val="single" w:sz="4" w:space="0" w:color="000000"/>
@@ -4907,15 +5492,15 @@
         </w:tblCellMar>
       </w:tblPr>
       <w:tblGrid>
-        <w:gridCol w:w="2197"/>
-        <w:gridCol w:w="3403"/>
+        <w:gridCol w:w="2196"/>
+        <w:gridCol w:w="3404"/>
         <w:gridCol w:w="3760"/>
       </w:tblGrid>
       <w:tr>
         <w:trPr/>
         <w:tc>
           <w:tcPr>
-            <w:tcW w:w="2197" w:type="dxa"/>
+            <w:tcW w:w="2196" w:type="dxa"/>
             <w:tcBorders>
               <w:top w:val="single" w:sz="4" w:space="0" w:color="000000"/>
               <w:left w:val="single" w:sz="4" w:space="0" w:color="000000"/>
@@ -4942,7 +5527,7 @@
         </w:tc>
         <w:tc>
           <w:tcPr>
-            <w:tcW w:w="3403" w:type="dxa"/>
+            <w:tcW w:w="3404" w:type="dxa"/>
             <w:tcBorders>
               <w:top w:val="single" w:sz="4" w:space="0" w:color="000000"/>
               <w:left w:val="single" w:sz="4" w:space="0" w:color="000000"/>
@@ -4999,7 +5584,7 @@
         <w:trPr/>
         <w:tc>
           <w:tcPr>
-            <w:tcW w:w="2197" w:type="dxa"/>
+            <w:tcW w:w="2196" w:type="dxa"/>
             <w:tcBorders>
               <w:top w:val="single" w:sz="4" w:space="0" w:color="000000"/>
               <w:left w:val="single" w:sz="4" w:space="0" w:color="000000"/>
@@ -5021,7 +5606,7 @@
         </w:tc>
         <w:tc>
           <w:tcPr>
-            <w:tcW w:w="3403" w:type="dxa"/>
+            <w:tcW w:w="3404" w:type="dxa"/>
             <w:tcBorders>
               <w:top w:val="single" w:sz="4" w:space="0" w:color="000000"/>
               <w:left w:val="single" w:sz="4" w:space="0" w:color="000000"/>
@@ -5080,7 +5665,7 @@
         <w:trPr/>
         <w:tc>
           <w:tcPr>
-            <w:tcW w:w="2197" w:type="dxa"/>
+            <w:tcW w:w="2196" w:type="dxa"/>
             <w:tcBorders>
               <w:top w:val="single" w:sz="4" w:space="0" w:color="000000"/>
               <w:left w:val="single" w:sz="4" w:space="0" w:color="000000"/>
@@ -5102,7 +5687,7 @@
         </w:tc>
         <w:tc>
           <w:tcPr>
-            <w:tcW w:w="3403" w:type="dxa"/>
+            <w:tcW w:w="3404" w:type="dxa"/>
             <w:tcBorders>
               <w:top w:val="single" w:sz="4" w:space="0" w:color="000000"/>
               <w:left w:val="single" w:sz="4" w:space="0" w:color="000000"/>
@@ -5161,7 +5746,7 @@
         <w:trPr/>
         <w:tc>
           <w:tcPr>
-            <w:tcW w:w="2197" w:type="dxa"/>
+            <w:tcW w:w="2196" w:type="dxa"/>
             <w:tcBorders>
               <w:top w:val="single" w:sz="4" w:space="0" w:color="000000"/>
               <w:left w:val="single" w:sz="4" w:space="0" w:color="000000"/>
@@ -5183,7 +5768,7 @@
         </w:tc>
         <w:tc>
           <w:tcPr>
-            <w:tcW w:w="3403" w:type="dxa"/>
+            <w:tcW w:w="3404" w:type="dxa"/>
             <w:tcBorders>
               <w:top w:val="single" w:sz="4" w:space="0" w:color="000000"/>
               <w:left w:val="single" w:sz="4" w:space="0" w:color="000000"/>
@@ -5242,7 +5827,7 @@
         <w:trPr/>
         <w:tc>
           <w:tcPr>
-            <w:tcW w:w="2197" w:type="dxa"/>
+            <w:tcW w:w="2196" w:type="dxa"/>
             <w:tcBorders>
               <w:top w:val="single" w:sz="4" w:space="0" w:color="000000"/>
               <w:left w:val="single" w:sz="4" w:space="0" w:color="000000"/>
@@ -5264,7 +5849,7 @@
         </w:tc>
         <w:tc>
           <w:tcPr>
-            <w:tcW w:w="3403" w:type="dxa"/>
+            <w:tcW w:w="3404" w:type="dxa"/>
             <w:tcBorders>
               <w:top w:val="single" w:sz="4" w:space="0" w:color="000000"/>
               <w:left w:val="single" w:sz="4" w:space="0" w:color="000000"/>
@@ -5323,7 +5908,7 @@
         <w:trPr/>
         <w:tc>
           <w:tcPr>
-            <w:tcW w:w="2197" w:type="dxa"/>
+            <w:tcW w:w="2196" w:type="dxa"/>
             <w:tcBorders>
               <w:top w:val="single" w:sz="4" w:space="0" w:color="000000"/>
               <w:left w:val="single" w:sz="4" w:space="0" w:color="000000"/>
@@ -5345,7 +5930,7 @@
         </w:tc>
         <w:tc>
           <w:tcPr>
-            <w:tcW w:w="3403" w:type="dxa"/>
+            <w:tcW w:w="3404" w:type="dxa"/>
             <w:tcBorders>
               <w:top w:val="single" w:sz="4" w:space="0" w:color="000000"/>
               <w:left w:val="single" w:sz="4" w:space="0" w:color="000000"/>
@@ -5404,7 +5989,7 @@
         <w:trPr/>
         <w:tc>
           <w:tcPr>
-            <w:tcW w:w="2197" w:type="dxa"/>
+            <w:tcW w:w="2196" w:type="dxa"/>
             <w:tcBorders>
               <w:top w:val="single" w:sz="4" w:space="0" w:color="000000"/>
               <w:left w:val="single" w:sz="4" w:space="0" w:color="000000"/>
@@ -5426,7 +6011,7 @@
         </w:tc>
         <w:tc>
           <w:tcPr>
-            <w:tcW w:w="3403" w:type="dxa"/>
+            <w:tcW w:w="3404" w:type="dxa"/>
             <w:tcBorders>
               <w:top w:val="single" w:sz="4" w:space="0" w:color="000000"/>
               <w:left w:val="single" w:sz="4" w:space="0" w:color="000000"/>
@@ -5485,7 +6070,7 @@
         <w:trPr/>
         <w:tc>
           <w:tcPr>
-            <w:tcW w:w="2197" w:type="dxa"/>
+            <w:tcW w:w="2196" w:type="dxa"/>
             <w:tcBorders>
               <w:top w:val="single" w:sz="4" w:space="0" w:color="000000"/>
               <w:left w:val="single" w:sz="4" w:space="0" w:color="000000"/>
@@ -5507,7 +6092,7 @@
         </w:tc>
         <w:tc>
           <w:tcPr>
-            <w:tcW w:w="3403" w:type="dxa"/>
+            <w:tcW w:w="3404" w:type="dxa"/>
             <w:tcBorders>
               <w:top w:val="single" w:sz="4" w:space="0" w:color="000000"/>
               <w:left w:val="single" w:sz="4" w:space="0" w:color="000000"/>
@@ -5566,7 +6151,7 @@
         <w:trPr/>
         <w:tc>
           <w:tcPr>
-            <w:tcW w:w="2197" w:type="dxa"/>
+            <w:tcW w:w="2196" w:type="dxa"/>
             <w:tcBorders>
               <w:top w:val="single" w:sz="4" w:space="0" w:color="000000"/>
               <w:left w:val="single" w:sz="4" w:space="0" w:color="000000"/>
@@ -5588,7 +6173,7 @@
         </w:tc>
         <w:tc>
           <w:tcPr>
-            <w:tcW w:w="3403" w:type="dxa"/>
+            <w:tcW w:w="3404" w:type="dxa"/>
             <w:tcBorders>
               <w:top w:val="single" w:sz="4" w:space="0" w:color="000000"/>
               <w:left w:val="single" w:sz="4" w:space="0" w:color="000000"/>

</xml_diff>

<commit_message>
Embedding comparison completed and form updated
</commit_message>
<xml_diff>
--- a/forms/A2_form.docx
+++ b/forms/A2_form.docx
@@ -3926,19 +3926,288 @@
           </w:tcPr>
           <w:p>
             <w:pPr>
-              <w:pStyle w:val="Normal"/>
-              <w:spacing w:before="0" w:after="80"/>
-              <w:rPr/>
-            </w:pPr>
-            <w:r>
-              <w:rPr>
+              <w:pStyle w:val="BodyText"/>
+              <w:spacing w:before="0" w:after="80"/>
+              <w:rPr>
+                <w:rFonts w:ascii="Arial;sans-serif" w:hAnsi="Arial;sans-serif"/>
+                <w:b w:val="false"/>
+                <w:i w:val="false"/>
+                <w:caps w:val="false"/>
+                <w:smallCaps w:val="false"/>
+                <w:strike w:val="false"/>
+                <w:dstrike w:val="false"/>
+                <w:color w:val="595959"/>
+                <w:sz w:val="18"/>
+                <w:u w:val="none"/>
+                <w:effect w:val="none"/>
+                <w:shd w:fill="auto" w:val="clear"/>
+              </w:rPr>
+            </w:pPr>
+            <w:bookmarkStart w:id="11" w:name="docs-internal-guid-4d2d991d-7fff-f539-d4"/>
+            <w:bookmarkEnd w:id="11"/>
+            <w:r>
+              <w:rPr>
+                <w:rFonts w:ascii="Arial;sans-serif" w:hAnsi="Arial;sans-serif"/>
+                <w:b w:val="false"/>
                 <w:i/>
                 <w:iCs/>
+                <w:caps w:val="false"/>
+                <w:smallCaps w:val="false"/>
+                <w:strike w:val="false"/>
+                <w:dstrike w:val="false"/>
                 <w:color w:val="595959"/>
                 <w:sz w:val="18"/>
                 <w:szCs w:val="18"/>
-              </w:rPr>
-              <w:t>e.g. which sentence-embedding model</w:t>
+                <w:u w:val="none"/>
+                <w:effect w:val="none"/>
+                <w:shd w:fill="auto" w:val="clear"/>
+              </w:rPr>
+              <w:t>We evaluated three multilingual embedding models to test their semantic retrieval capabilities on our Bangla text chunks:</w:t>
+            </w:r>
+          </w:p>
+          <w:p>
+            <w:pPr>
+              <w:pStyle w:val="BodyText"/>
+              <w:bidi w:val="0"/>
+              <w:spacing w:lineRule="auto" w:line="331" w:before="0" w:after="80"/>
+              <w:ind w:hanging="0" w:left="0" w:right="0"/>
+              <w:jc w:val="left"/>
+              <w:rPr>
+                <w:b w:val="false"/>
+              </w:rPr>
+            </w:pPr>
+            <w:r>
+              <w:rPr>
+                <w:rFonts w:ascii="Arial;sans-serif" w:hAnsi="Arial;sans-serif"/>
+                <w:b w:val="false"/>
+                <w:i w:val="false"/>
+                <w:caps w:val="false"/>
+                <w:smallCaps w:val="false"/>
+                <w:strike w:val="false"/>
+                <w:dstrike w:val="false"/>
+                <w:color w:val="595959"/>
+                <w:sz w:val="18"/>
+                <w:u w:val="none"/>
+                <w:effect w:val="none"/>
+                <w:shd w:fill="auto" w:val="clear"/>
+              </w:rPr>
+              <w:t xml:space="preserve">1. </w:t>
+            </w:r>
+            <w:r>
+              <w:rPr>
+                <w:rFonts w:ascii="Arial;sans-serif" w:hAnsi="Arial;sans-serif"/>
+                <w:b/>
+                <w:i w:val="false"/>
+                <w:caps w:val="false"/>
+                <w:smallCaps w:val="false"/>
+                <w:strike w:val="false"/>
+                <w:dstrike w:val="false"/>
+                <w:color w:val="595959"/>
+                <w:sz w:val="18"/>
+                <w:u w:val="none"/>
+                <w:effect w:val="none"/>
+                <w:shd w:fill="auto" w:val="clear"/>
+              </w:rPr>
+              <w:t>paraphrase-multilingual-MiniLM-L12-v2 (Lightweight multilingual baseline, ~120MB)</w:t>
+            </w:r>
+          </w:p>
+          <w:p>
+            <w:pPr>
+              <w:pStyle w:val="BodyText"/>
+              <w:bidi w:val="0"/>
+              <w:spacing w:lineRule="auto" w:line="331" w:before="0" w:after="80"/>
+              <w:ind w:hanging="0" w:left="0" w:right="0"/>
+              <w:jc w:val="left"/>
+              <w:rPr>
+                <w:b w:val="false"/>
+              </w:rPr>
+            </w:pPr>
+            <w:r>
+              <w:rPr>
+                <w:rFonts w:ascii="Arial;sans-serif" w:hAnsi="Arial;sans-serif"/>
+                <w:b w:val="false"/>
+                <w:i w:val="false"/>
+                <w:caps w:val="false"/>
+                <w:smallCaps w:val="false"/>
+                <w:strike w:val="false"/>
+                <w:dstrike w:val="false"/>
+                <w:color w:val="595959"/>
+                <w:sz w:val="18"/>
+                <w:u w:val="none"/>
+                <w:effect w:val="none"/>
+                <w:shd w:fill="auto" w:val="clear"/>
+              </w:rPr>
+              <w:t xml:space="preserve">2. </w:t>
+            </w:r>
+            <w:r>
+              <w:rPr>
+                <w:rFonts w:ascii="Arial;sans-serif" w:hAnsi="Arial;sans-serif"/>
+                <w:b/>
+                <w:i w:val="false"/>
+                <w:caps w:val="false"/>
+                <w:smallCaps w:val="false"/>
+                <w:strike w:val="false"/>
+                <w:dstrike w:val="false"/>
+                <w:color w:val="595959"/>
+                <w:sz w:val="18"/>
+                <w:u w:val="none"/>
+                <w:effect w:val="none"/>
+                <w:shd w:fill="auto" w:val="clear"/>
+              </w:rPr>
+              <w:t>sentence-transformers/LaBSE (Language-Agnostic BERT Sentence Embedding by Google, medium size)</w:t>
+            </w:r>
+          </w:p>
+          <w:p>
+            <w:pPr>
+              <w:pStyle w:val="BodyText"/>
+              <w:bidi w:val="0"/>
+              <w:spacing w:lineRule="auto" w:line="331" w:before="0" w:after="80"/>
+              <w:ind w:hanging="0" w:left="0" w:right="0"/>
+              <w:jc w:val="left"/>
+              <w:rPr>
+                <w:b w:val="false"/>
+              </w:rPr>
+            </w:pPr>
+            <w:r>
+              <w:rPr>
+                <w:rFonts w:ascii="Arial;sans-serif" w:hAnsi="Arial;sans-serif"/>
+                <w:b w:val="false"/>
+                <w:i w:val="false"/>
+                <w:caps w:val="false"/>
+                <w:smallCaps w:val="false"/>
+                <w:strike w:val="false"/>
+                <w:dstrike w:val="false"/>
+                <w:color w:val="595959"/>
+                <w:sz w:val="18"/>
+                <w:u w:val="none"/>
+                <w:effect w:val="none"/>
+                <w:shd w:fill="auto" w:val="clear"/>
+              </w:rPr>
+              <w:t xml:space="preserve">3. </w:t>
+            </w:r>
+            <w:r>
+              <w:rPr>
+                <w:rFonts w:ascii="Arial;sans-serif" w:hAnsi="Arial;sans-serif"/>
+                <w:b/>
+                <w:i w:val="false"/>
+                <w:caps w:val="false"/>
+                <w:smallCaps w:val="false"/>
+                <w:strike w:val="false"/>
+                <w:dstrike w:val="false"/>
+                <w:color w:val="595959"/>
+                <w:sz w:val="18"/>
+                <w:u w:val="none"/>
+                <w:effect w:val="none"/>
+                <w:shd w:fill="auto" w:val="clear"/>
+              </w:rPr>
+              <w:t>intfloat/multilingual-e5-large (State-of-the-art multilingual dense retriever, large size)</w:t>
+            </w:r>
+          </w:p>
+          <w:p>
+            <w:pPr>
+              <w:pStyle w:val="BodyText"/>
+              <w:bidi w:val="0"/>
+              <w:ind w:left="0"/>
+              <w:jc w:val="left"/>
+              <w:rPr/>
+            </w:pPr>
+            <w:r>
+              <w:rPr/>
+            </w:r>
+          </w:p>
+          <w:p>
+            <w:pPr>
+              <w:pStyle w:val="BodyText"/>
+              <w:bidi w:val="0"/>
+              <w:spacing w:lineRule="auto" w:line="331" w:before="0" w:after="80"/>
+              <w:ind w:hanging="0" w:left="0" w:right="0"/>
+              <w:jc w:val="left"/>
+              <w:rPr/>
+            </w:pPr>
+            <w:r>
+              <w:rPr>
+                <w:rFonts w:ascii="Arial;sans-serif" w:hAnsi="Arial;sans-serif"/>
+                <w:b w:val="false"/>
+                <w:i w:val="false"/>
+                <w:caps w:val="false"/>
+                <w:smallCaps w:val="false"/>
+                <w:strike w:val="false"/>
+                <w:dstrike w:val="false"/>
+                <w:color w:val="595959"/>
+                <w:sz w:val="18"/>
+                <w:u w:val="none"/>
+                <w:effect w:val="none"/>
+                <w:shd w:fill="auto" w:val="clear"/>
+              </w:rPr>
+              <w:t xml:space="preserve">We evaluated them using a custom test set of OCR-derived chunks across Physics, Chemistry, and Biology, testing both pure Bangla queries and cross-lingual/code-mixed queries (e.g., "cell </w:t>
+            </w:r>
+            <w:r>
+              <w:rPr>
+                <w:rFonts w:cs="Arial;sans-serif"/>
+                <w:bCs w:val="false"/>
+                <w:iCs w:val="false"/>
+                <w:caps w:val="false"/>
+                <w:smallCaps w:val="false"/>
+                <w:strike w:val="false"/>
+                <w:dstrike w:val="false"/>
+                <w:color w:val="595959"/>
+                <w:szCs w:val="18"/>
+                <w:u w:val="none"/>
+                <w:effect w:val="none"/>
+                <w:shd w:fill="auto" w:val="clear"/>
+              </w:rPr>
+              <w:t xml:space="preserve">এর </w:t>
+            </w:r>
+            <w:r>
+              <w:rPr>
+                <w:rFonts w:ascii="Arial;sans-serif" w:hAnsi="Arial;sans-serif"/>
+                <w:b w:val="false"/>
+                <w:i w:val="false"/>
+                <w:caps w:val="false"/>
+                <w:smallCaps w:val="false"/>
+                <w:strike w:val="false"/>
+                <w:dstrike w:val="false"/>
+                <w:color w:val="595959"/>
+                <w:sz w:val="18"/>
+                <w:u w:val="none"/>
+                <w:effect w:val="none"/>
+                <w:shd w:fill="auto" w:val="clear"/>
+              </w:rPr>
+              <w:t xml:space="preserve">control center </w:t>
+            </w:r>
+            <w:r>
+              <w:rPr>
+                <w:rFonts w:cs="Arial;sans-serif"/>
+                <w:bCs w:val="false"/>
+                <w:iCs w:val="false"/>
+                <w:caps w:val="false"/>
+                <w:smallCaps w:val="false"/>
+                <w:strike w:val="false"/>
+                <w:dstrike w:val="false"/>
+                <w:color w:val="595959"/>
+                <w:szCs w:val="18"/>
+                <w:u w:val="none"/>
+                <w:effect w:val="none"/>
+                <w:shd w:fill="auto" w:val="clear"/>
+              </w:rPr>
+              <w:t>কোনটি</w:t>
+            </w:r>
+            <w:r>
+              <w:rPr>
+                <w:rFonts w:ascii="Arial;sans-serif" w:hAnsi="Arial;sans-serif"/>
+                <w:b w:val="false"/>
+                <w:i w:val="false"/>
+                <w:caps w:val="false"/>
+                <w:smallCaps w:val="false"/>
+                <w:strike w:val="false"/>
+                <w:dstrike w:val="false"/>
+                <w:color w:val="595959"/>
+                <w:sz w:val="18"/>
+                <w:u w:val="none"/>
+                <w:effect w:val="none"/>
+                <w:shd w:fill="auto" w:val="clear"/>
+              </w:rPr>
+              <w:t>?").</w:t>
             </w:r>
           </w:p>
         </w:tc>
@@ -3954,12 +4223,733 @@
           </w:tcPr>
           <w:p>
             <w:pPr>
-              <w:pStyle w:val="Normal"/>
-              <w:spacing w:before="0" w:after="80"/>
-              <w:rPr/>
-            </w:pPr>
-            <w:r>
-              <w:rPr/>
+              <w:pStyle w:val="BodyText"/>
+              <w:spacing w:before="0" w:after="80"/>
+              <w:rPr>
+                <w:b w:val="false"/>
+              </w:rPr>
+            </w:pPr>
+            <w:bookmarkStart w:id="12" w:name="docs-internal-guid-9281da55-7fff-a64f-61"/>
+            <w:bookmarkEnd w:id="12"/>
+            <w:r>
+              <w:rPr>
+                <w:rFonts w:ascii="Arial;sans-serif" w:hAnsi="Arial;sans-serif"/>
+                <w:b/>
+                <w:i w:val="false"/>
+                <w:caps w:val="false"/>
+                <w:smallCaps w:val="false"/>
+                <w:strike w:val="false"/>
+                <w:dstrike w:val="false"/>
+                <w:color w:val="000000"/>
+                <w:sz w:val="22"/>
+                <w:u w:val="none"/>
+                <w:effect w:val="none"/>
+                <w:shd w:fill="auto" w:val="clear"/>
+              </w:rPr>
+              <w:t>Choice:</w:t>
+            </w:r>
+            <w:r>
+              <w:rPr>
+                <w:b w:val="false"/>
+                <w:caps w:val="false"/>
+                <w:smallCaps w:val="false"/>
+                <w:strike w:val="false"/>
+                <w:dstrike w:val="false"/>
+                <w:color w:val="000000"/>
+                <w:u w:val="none"/>
+                <w:effect w:val="none"/>
+                <w:shd w:fill="auto" w:val="clear"/>
+              </w:rPr>
+              <w:t xml:space="preserve"> </w:t>
+            </w:r>
+            <w:r>
+              <w:rPr>
+                <w:rFonts w:ascii="Arial;sans-serif" w:hAnsi="Arial;sans-serif"/>
+                <w:b w:val="false"/>
+                <w:i w:val="false"/>
+                <w:caps w:val="false"/>
+                <w:smallCaps w:val="false"/>
+                <w:strike w:val="false"/>
+                <w:dstrike w:val="false"/>
+                <w:color w:val="000000"/>
+                <w:sz w:val="22"/>
+                <w:u w:val="none"/>
+                <w:effect w:val="none"/>
+                <w:shd w:fill="auto" w:val="clear"/>
+              </w:rPr>
+              <w:t>`intfloat/multilingual-e5-large`</w:t>
+            </w:r>
+          </w:p>
+          <w:p>
+            <w:pPr>
+              <w:pStyle w:val="BodyText"/>
+              <w:bidi w:val="0"/>
+              <w:ind w:left="0"/>
+              <w:jc w:val="left"/>
+              <w:rPr/>
+            </w:pPr>
+            <w:r>
+              <w:rPr/>
+            </w:r>
+          </w:p>
+          <w:p>
+            <w:pPr>
+              <w:pStyle w:val="BodyText"/>
+              <w:bidi w:val="0"/>
+              <w:spacing w:lineRule="auto" w:line="331" w:before="0" w:after="80"/>
+              <w:ind w:hanging="0" w:left="0" w:right="0"/>
+              <w:jc w:val="left"/>
+              <w:rPr>
+                <w:b w:val="false"/>
+              </w:rPr>
+            </w:pPr>
+            <w:r>
+              <w:rPr>
+                <w:rFonts w:ascii="Arial;sans-serif" w:hAnsi="Arial;sans-serif"/>
+                <w:b/>
+                <w:i w:val="false"/>
+                <w:caps w:val="false"/>
+                <w:smallCaps w:val="false"/>
+                <w:strike w:val="false"/>
+                <w:dstrike w:val="false"/>
+                <w:color w:val="000000"/>
+                <w:sz w:val="22"/>
+                <w:u w:val="none"/>
+                <w:effect w:val="none"/>
+                <w:shd w:fill="auto" w:val="clear"/>
+              </w:rPr>
+              <w:t>Why:</w:t>
+            </w:r>
+            <w:r>
+              <w:rPr>
+                <w:b w:val="false"/>
+                <w:caps w:val="false"/>
+                <w:smallCaps w:val="false"/>
+                <w:strike w:val="false"/>
+                <w:dstrike w:val="false"/>
+                <w:color w:val="000000"/>
+                <w:u w:val="none"/>
+                <w:effect w:val="none"/>
+                <w:shd w:fill="auto" w:val="clear"/>
+              </w:rPr>
+              <w:t> </w:t>
+            </w:r>
+          </w:p>
+          <w:p>
+            <w:pPr>
+              <w:pStyle w:val="BodyText"/>
+              <w:bidi w:val="0"/>
+              <w:spacing w:lineRule="auto" w:line="331" w:before="0" w:after="80"/>
+              <w:ind w:hanging="0" w:left="0" w:right="0"/>
+              <w:jc w:val="left"/>
+              <w:rPr>
+                <w:rFonts w:ascii="Arial;sans-serif" w:hAnsi="Arial;sans-serif"/>
+                <w:b w:val="false"/>
+                <w:i w:val="false"/>
+                <w:caps w:val="false"/>
+                <w:smallCaps w:val="false"/>
+                <w:strike w:val="false"/>
+                <w:dstrike w:val="false"/>
+                <w:color w:val="000000"/>
+                <w:sz w:val="22"/>
+                <w:u w:val="none"/>
+                <w:effect w:val="none"/>
+                <w:shd w:fill="auto" w:val="clear"/>
+              </w:rPr>
+            </w:pPr>
+            <w:r>
+              <w:rPr>
+                <w:rFonts w:ascii="Arial;sans-serif" w:hAnsi="Arial;sans-serif"/>
+                <w:b w:val="false"/>
+                <w:i w:val="false"/>
+                <w:caps w:val="false"/>
+                <w:smallCaps w:val="false"/>
+                <w:strike w:val="false"/>
+                <w:dstrike w:val="false"/>
+                <w:color w:val="000000"/>
+                <w:sz w:val="22"/>
+                <w:u w:val="none"/>
+                <w:effect w:val="none"/>
+                <w:shd w:fill="auto" w:val="clear"/>
+              </w:rPr>
+              <w:t>Bonus Task (E23) requires handling Bangla-English code-switched queries and text. We evaluated the models by creating a test set of OCR-derived Bangla chunks (Physics, Chemistry, Biology) and testing them against pure Bangla, cross-lingual (English queries), and Romanized/Banglish queries.</w:t>
+            </w:r>
+          </w:p>
+          <w:p>
+            <w:pPr>
+              <w:pStyle w:val="BodyText"/>
+              <w:bidi w:val="0"/>
+              <w:ind w:left="0"/>
+              <w:jc w:val="left"/>
+              <w:rPr/>
+            </w:pPr>
+            <w:r>
+              <w:rPr/>
+            </w:r>
+          </w:p>
+          <w:p>
+            <w:pPr>
+              <w:pStyle w:val="BodyText"/>
+              <w:bidi w:val="0"/>
+              <w:spacing w:lineRule="auto" w:line="331" w:before="0" w:after="80"/>
+              <w:ind w:hanging="0" w:left="0" w:right="0"/>
+              <w:jc w:val="left"/>
+              <w:rPr>
+                <w:b w:val="false"/>
+              </w:rPr>
+            </w:pPr>
+            <w:r>
+              <w:rPr>
+                <w:rFonts w:ascii="Arial;sans-serif" w:hAnsi="Arial;sans-serif"/>
+                <w:b w:val="false"/>
+                <w:i w:val="false"/>
+                <w:caps w:val="false"/>
+                <w:smallCaps w:val="false"/>
+                <w:strike w:val="false"/>
+                <w:dstrike w:val="false"/>
+                <w:color w:val="000000"/>
+                <w:sz w:val="22"/>
+                <w:u w:val="none"/>
+                <w:effect w:val="none"/>
+                <w:shd w:fill="auto" w:val="clear"/>
+              </w:rPr>
+              <w:t xml:space="preserve">The baseline </w:t>
+            </w:r>
+            <w:r>
+              <w:rPr>
+                <w:rFonts w:ascii="Arial;sans-serif" w:hAnsi="Arial;sans-serif"/>
+                <w:b/>
+                <w:i w:val="false"/>
+                <w:caps w:val="false"/>
+                <w:smallCaps w:val="false"/>
+                <w:strike w:val="false"/>
+                <w:dstrike w:val="false"/>
+                <w:color w:val="000000"/>
+                <w:sz w:val="22"/>
+                <w:u w:val="none"/>
+                <w:effect w:val="none"/>
+                <w:shd w:fill="auto" w:val="clear"/>
+              </w:rPr>
+              <w:t>paraphrase-multilingual-MiniLM-L12-v2</w:t>
+            </w:r>
+            <w:r>
+              <w:rPr>
+                <w:b w:val="false"/>
+                <w:caps w:val="false"/>
+                <w:smallCaps w:val="false"/>
+                <w:strike w:val="false"/>
+                <w:dstrike w:val="false"/>
+                <w:color w:val="000000"/>
+                <w:u w:val="none"/>
+                <w:effect w:val="none"/>
+                <w:shd w:fill="auto" w:val="clear"/>
+              </w:rPr>
+              <w:t xml:space="preserve"> </w:t>
+            </w:r>
+            <w:r>
+              <w:rPr>
+                <w:rFonts w:ascii="Arial;sans-serif" w:hAnsi="Arial;sans-serif"/>
+                <w:b w:val="false"/>
+                <w:i w:val="false"/>
+                <w:caps w:val="false"/>
+                <w:smallCaps w:val="false"/>
+                <w:strike w:val="false"/>
+                <w:dstrike w:val="false"/>
+                <w:color w:val="000000"/>
+                <w:sz w:val="22"/>
+                <w:u w:val="none"/>
+                <w:effect w:val="none"/>
+                <w:shd w:fill="auto" w:val="clear"/>
+              </w:rPr>
+              <w:t xml:space="preserve">proved too weak, failing entirely on biology and physics equation matching. The final comparison was between </w:t>
+            </w:r>
+            <w:r>
+              <w:rPr>
+                <w:rFonts w:ascii="Arial;sans-serif" w:hAnsi="Arial;sans-serif"/>
+                <w:b/>
+                <w:i w:val="false"/>
+                <w:caps w:val="false"/>
+                <w:smallCaps w:val="false"/>
+                <w:strike w:val="false"/>
+                <w:dstrike w:val="false"/>
+                <w:color w:val="000000"/>
+                <w:sz w:val="22"/>
+                <w:u w:val="none"/>
+                <w:effect w:val="none"/>
+                <w:shd w:fill="auto" w:val="clear"/>
+              </w:rPr>
+              <w:t>LaBSE</w:t>
+            </w:r>
+            <w:r>
+              <w:rPr>
+                <w:b w:val="false"/>
+                <w:caps w:val="false"/>
+                <w:smallCaps w:val="false"/>
+                <w:strike w:val="false"/>
+                <w:dstrike w:val="false"/>
+                <w:color w:val="000000"/>
+                <w:u w:val="none"/>
+                <w:effect w:val="none"/>
+                <w:shd w:fill="auto" w:val="clear"/>
+              </w:rPr>
+              <w:t xml:space="preserve"> </w:t>
+            </w:r>
+            <w:r>
+              <w:rPr>
+                <w:rFonts w:ascii="Arial;sans-serif" w:hAnsi="Arial;sans-serif"/>
+                <w:b w:val="false"/>
+                <w:i w:val="false"/>
+                <w:caps w:val="false"/>
+                <w:smallCaps w:val="false"/>
+                <w:strike w:val="false"/>
+                <w:dstrike w:val="false"/>
+                <w:color w:val="000000"/>
+                <w:sz w:val="22"/>
+                <w:u w:val="none"/>
+                <w:effect w:val="none"/>
+                <w:shd w:fill="auto" w:val="clear"/>
+              </w:rPr>
+              <w:t xml:space="preserve">and </w:t>
+            </w:r>
+            <w:r>
+              <w:rPr>
+                <w:rFonts w:ascii="Arial;sans-serif" w:hAnsi="Arial;sans-serif"/>
+                <w:b/>
+                <w:i w:val="false"/>
+                <w:caps w:val="false"/>
+                <w:smallCaps w:val="false"/>
+                <w:strike w:val="false"/>
+                <w:dstrike w:val="false"/>
+                <w:color w:val="000000"/>
+                <w:sz w:val="22"/>
+                <w:u w:val="none"/>
+                <w:effect w:val="none"/>
+                <w:shd w:fill="auto" w:val="clear"/>
+              </w:rPr>
+              <w:t>multilingual-e5-large</w:t>
+            </w:r>
+            <w:r>
+              <w:rPr>
+                <w:rFonts w:ascii="Arial;sans-serif" w:hAnsi="Arial;sans-serif"/>
+                <w:b w:val="false"/>
+                <w:i w:val="false"/>
+                <w:caps w:val="false"/>
+                <w:smallCaps w:val="false"/>
+                <w:strike w:val="false"/>
+                <w:dstrike w:val="false"/>
+                <w:color w:val="000000"/>
+                <w:sz w:val="22"/>
+                <w:u w:val="none"/>
+                <w:effect w:val="none"/>
+                <w:shd w:fill="auto" w:val="clear"/>
+              </w:rPr>
+              <w:t>.</w:t>
+            </w:r>
+          </w:p>
+          <w:p>
+            <w:pPr>
+              <w:pStyle w:val="BodyText"/>
+              <w:bidi w:val="0"/>
+              <w:ind w:left="0"/>
+              <w:jc w:val="left"/>
+              <w:rPr/>
+            </w:pPr>
+            <w:r>
+              <w:rPr/>
+            </w:r>
+          </w:p>
+          <w:p>
+            <w:pPr>
+              <w:pStyle w:val="BodyText"/>
+              <w:bidi w:val="0"/>
+              <w:spacing w:lineRule="auto" w:line="331" w:before="0" w:after="80"/>
+              <w:ind w:hanging="0" w:left="0" w:right="0"/>
+              <w:jc w:val="left"/>
+              <w:rPr/>
+            </w:pPr>
+            <w:r>
+              <w:rPr>
+                <w:rFonts w:ascii="Arial;sans-serif" w:hAnsi="Arial;sans-serif"/>
+                <w:b w:val="false"/>
+                <w:i w:val="false"/>
+                <w:caps w:val="false"/>
+                <w:smallCaps w:val="false"/>
+                <w:strike w:val="false"/>
+                <w:dstrike w:val="false"/>
+                <w:color w:val="000000"/>
+                <w:sz w:val="22"/>
+                <w:u w:val="none"/>
+                <w:effect w:val="none"/>
+                <w:shd w:fill="auto" w:val="clear"/>
+              </w:rPr>
+              <w:t xml:space="preserve">While both models correctly mapped cross-lingual concepts (e.g., matching the English query "What is the pH level of a neutral solution?" to a Bangla chunk about acids) and Romanized Banglish ("V = IR kiser sutro?"), </w:t>
+            </w:r>
+            <w:r>
+              <w:rPr>
+                <w:rFonts w:ascii="Arial;sans-serif" w:hAnsi="Arial;sans-serif"/>
+                <w:b/>
+                <w:i w:val="false"/>
+                <w:caps w:val="false"/>
+                <w:smallCaps w:val="false"/>
+                <w:strike w:val="false"/>
+                <w:dstrike w:val="false"/>
+                <w:color w:val="000000"/>
+                <w:sz w:val="22"/>
+                <w:u w:val="none"/>
+                <w:effect w:val="none"/>
+                <w:shd w:fill="auto" w:val="clear"/>
+              </w:rPr>
+              <w:t>multilingual-e5-large</w:t>
+            </w:r>
+            <w:r>
+              <w:rPr>
+                <w:b w:val="false"/>
+                <w:caps w:val="false"/>
+                <w:smallCaps w:val="false"/>
+                <w:strike w:val="false"/>
+                <w:dstrike w:val="false"/>
+                <w:color w:val="000000"/>
+                <w:u w:val="none"/>
+                <w:effect w:val="none"/>
+                <w:shd w:fill="auto" w:val="clear"/>
+              </w:rPr>
+              <w:t xml:space="preserve"> </w:t>
+            </w:r>
+            <w:r>
+              <w:rPr>
+                <w:rFonts w:ascii="Arial;sans-serif" w:hAnsi="Arial;sans-serif"/>
+                <w:b w:val="false"/>
+                <w:i w:val="false"/>
+                <w:caps w:val="false"/>
+                <w:smallCaps w:val="false"/>
+                <w:strike w:val="false"/>
+                <w:dstrike w:val="false"/>
+                <w:color w:val="000000"/>
+                <w:sz w:val="22"/>
+                <w:u w:val="none"/>
+                <w:effect w:val="none"/>
+                <w:shd w:fill="auto" w:val="clear"/>
+              </w:rPr>
+              <w:t>proved strictly superior at deep semantic mapping. For example, it correctly matched the English query "Formula for kinetic energy" to the Bangla text "</w:t>
+            </w:r>
+            <w:r>
+              <w:rPr>
+                <w:rFonts w:cs="Arial;sans-serif"/>
+                <w:bCs w:val="false"/>
+                <w:iCs w:val="false"/>
+                <w:caps w:val="false"/>
+                <w:smallCaps w:val="false"/>
+                <w:strike w:val="false"/>
+                <w:dstrike w:val="false"/>
+                <w:color w:val="000000"/>
+                <w:szCs w:val="22"/>
+                <w:u w:val="none"/>
+                <w:effect w:val="none"/>
+                <w:shd w:fill="auto" w:val="clear"/>
+              </w:rPr>
+              <w:t xml:space="preserve">গতিশক্তি </w:t>
+            </w:r>
+            <w:r>
+              <w:rPr>
+                <w:rFonts w:ascii="Arial;sans-serif" w:hAnsi="Arial;sans-serif"/>
+                <w:b w:val="false"/>
+                <w:i w:val="false"/>
+                <w:caps w:val="false"/>
+                <w:smallCaps w:val="false"/>
+                <w:strike w:val="false"/>
+                <w:dstrike w:val="false"/>
+                <w:color w:val="000000"/>
+                <w:sz w:val="22"/>
+                <w:u w:val="none"/>
+                <w:effect w:val="none"/>
+                <w:shd w:fill="auto" w:val="clear"/>
+              </w:rPr>
+              <w:t xml:space="preserve">= </w:t>
+            </w:r>
+            <w:r>
+              <w:rPr>
+                <w:rFonts w:cs="Arial;sans-serif"/>
+                <w:bCs w:val="false"/>
+                <w:iCs w:val="false"/>
+                <w:caps w:val="false"/>
+                <w:smallCaps w:val="false"/>
+                <w:strike w:val="false"/>
+                <w:dstrike w:val="false"/>
+                <w:color w:val="000000"/>
+                <w:szCs w:val="22"/>
+                <w:u w:val="none"/>
+                <w:effect w:val="none"/>
+                <w:shd w:fill="auto" w:val="clear"/>
+              </w:rPr>
+              <w:t>অর্ধেক ভর গুণ বেগের বর্গ</w:t>
+            </w:r>
+            <w:r>
+              <w:rPr>
+                <w:rFonts w:ascii="Arial;sans-serif" w:hAnsi="Arial;sans-serif"/>
+                <w:b w:val="false"/>
+                <w:i w:val="false"/>
+                <w:caps w:val="false"/>
+                <w:smallCaps w:val="false"/>
+                <w:strike w:val="false"/>
+                <w:dstrike w:val="false"/>
+                <w:color w:val="000000"/>
+                <w:sz w:val="22"/>
+                <w:u w:val="none"/>
+                <w:effect w:val="none"/>
+                <w:shd w:fill="auto" w:val="clear"/>
+              </w:rPr>
+              <w:t xml:space="preserve">", whereas </w:t>
+            </w:r>
+            <w:r>
+              <w:rPr>
+                <w:rFonts w:ascii="Arial;sans-serif" w:hAnsi="Arial;sans-serif"/>
+                <w:b/>
+                <w:i w:val="false"/>
+                <w:caps w:val="false"/>
+                <w:smallCaps w:val="false"/>
+                <w:strike w:val="false"/>
+                <w:dstrike w:val="false"/>
+                <w:color w:val="000000"/>
+                <w:sz w:val="22"/>
+                <w:u w:val="none"/>
+                <w:effect w:val="none"/>
+                <w:shd w:fill="auto" w:val="clear"/>
+              </w:rPr>
+              <w:t>LaBSE</w:t>
+            </w:r>
+            <w:r>
+              <w:rPr>
+                <w:b w:val="false"/>
+                <w:caps w:val="false"/>
+                <w:smallCaps w:val="false"/>
+                <w:strike w:val="false"/>
+                <w:dstrike w:val="false"/>
+                <w:color w:val="000000"/>
+                <w:u w:val="none"/>
+                <w:effect w:val="none"/>
+                <w:shd w:fill="auto" w:val="clear"/>
+              </w:rPr>
+              <w:t xml:space="preserve"> </w:t>
+            </w:r>
+            <w:r>
+              <w:rPr>
+                <w:rFonts w:ascii="Arial;sans-serif" w:hAnsi="Arial;sans-serif"/>
+                <w:b w:val="false"/>
+                <w:i w:val="false"/>
+                <w:caps w:val="false"/>
+                <w:smallCaps w:val="false"/>
+                <w:strike w:val="false"/>
+                <w:dstrike w:val="false"/>
+                <w:color w:val="000000"/>
+                <w:sz w:val="22"/>
+                <w:u w:val="none"/>
+                <w:effect w:val="none"/>
+                <w:shd w:fill="auto" w:val="clear"/>
+              </w:rPr>
+              <w:t xml:space="preserve">failed and pointed to the force formula instead. </w:t>
+            </w:r>
+            <w:r>
+              <w:rPr>
+                <w:rFonts w:ascii="Arial;sans-serif" w:hAnsi="Arial;sans-serif"/>
+                <w:b/>
+                <w:i w:val="false"/>
+                <w:caps w:val="false"/>
+                <w:smallCaps w:val="false"/>
+                <w:strike w:val="false"/>
+                <w:dstrike w:val="false"/>
+                <w:color w:val="000000"/>
+                <w:sz w:val="22"/>
+                <w:u w:val="none"/>
+                <w:effect w:val="none"/>
+                <w:shd w:fill="auto" w:val="clear"/>
+              </w:rPr>
+              <w:t>multilingual-e5-large</w:t>
+            </w:r>
+            <w:r>
+              <w:rPr>
+                <w:b w:val="false"/>
+                <w:caps w:val="false"/>
+                <w:smallCaps w:val="false"/>
+                <w:strike w:val="false"/>
+                <w:dstrike w:val="false"/>
+                <w:color w:val="000000"/>
+                <w:u w:val="none"/>
+                <w:effect w:val="none"/>
+                <w:shd w:fill="auto" w:val="clear"/>
+              </w:rPr>
+              <w:t xml:space="preserve"> </w:t>
+            </w:r>
+            <w:r>
+              <w:rPr>
+                <w:rFonts w:ascii="Arial;sans-serif" w:hAnsi="Arial;sans-serif"/>
+                <w:b w:val="false"/>
+                <w:i w:val="false"/>
+                <w:caps w:val="false"/>
+                <w:smallCaps w:val="false"/>
+                <w:strike w:val="false"/>
+                <w:dstrike w:val="false"/>
+                <w:color w:val="000000"/>
+                <w:sz w:val="22"/>
+                <w:u w:val="none"/>
+                <w:effect w:val="none"/>
+                <w:shd w:fill="auto" w:val="clear"/>
+              </w:rPr>
+              <w:t>also successfully matched complex synonyms like mapping "</w:t>
+            </w:r>
+            <w:r>
+              <w:rPr>
+                <w:rFonts w:cs="Arial;sans-serif"/>
+                <w:bCs w:val="false"/>
+                <w:iCs w:val="false"/>
+                <w:caps w:val="false"/>
+                <w:smallCaps w:val="false"/>
+                <w:strike w:val="false"/>
+                <w:dstrike w:val="false"/>
+                <w:color w:val="000000"/>
+                <w:szCs w:val="22"/>
+                <w:u w:val="none"/>
+                <w:effect w:val="none"/>
+                <w:shd w:fill="auto" w:val="clear"/>
+              </w:rPr>
+              <w:t>বংশবৃদ্ধির জন্য</w:t>
+            </w:r>
+            <w:r>
+              <w:rPr>
+                <w:rFonts w:ascii="Arial;sans-serif" w:hAnsi="Arial;sans-serif"/>
+                <w:b w:val="false"/>
+                <w:i w:val="false"/>
+                <w:caps w:val="false"/>
+                <w:smallCaps w:val="false"/>
+                <w:strike w:val="false"/>
+                <w:dstrike w:val="false"/>
+                <w:color w:val="000000"/>
+                <w:sz w:val="22"/>
+                <w:u w:val="none"/>
+                <w:effect w:val="none"/>
+                <w:shd w:fill="auto" w:val="clear"/>
+              </w:rPr>
+              <w:t>" to a chunk about "</w:t>
+            </w:r>
+            <w:r>
+              <w:rPr>
+                <w:rFonts w:cs="Arial;sans-serif"/>
+                <w:bCs w:val="false"/>
+                <w:iCs w:val="false"/>
+                <w:caps w:val="false"/>
+                <w:smallCaps w:val="false"/>
+                <w:strike w:val="false"/>
+                <w:dstrike w:val="false"/>
+                <w:color w:val="000000"/>
+                <w:szCs w:val="22"/>
+                <w:u w:val="none"/>
+                <w:effect w:val="none"/>
+                <w:shd w:fill="auto" w:val="clear"/>
+              </w:rPr>
+              <w:t>জনন কোষ</w:t>
+            </w:r>
+            <w:r>
+              <w:rPr>
+                <w:rFonts w:ascii="Arial;sans-serif" w:hAnsi="Arial;sans-serif"/>
+                <w:b w:val="false"/>
+                <w:i w:val="false"/>
+                <w:caps w:val="false"/>
+                <w:smallCaps w:val="false"/>
+                <w:strike w:val="false"/>
+                <w:dstrike w:val="false"/>
+                <w:color w:val="000000"/>
+                <w:sz w:val="22"/>
+                <w:u w:val="none"/>
+                <w:effect w:val="none"/>
+                <w:shd w:fill="auto" w:val="clear"/>
+              </w:rPr>
+              <w:t>".</w:t>
+            </w:r>
+          </w:p>
+          <w:p>
+            <w:pPr>
+              <w:pStyle w:val="BodyText"/>
+              <w:bidi w:val="0"/>
+              <w:ind w:left="0"/>
+              <w:jc w:val="left"/>
+              <w:rPr/>
+            </w:pPr>
+            <w:r>
+              <w:rPr/>
+            </w:r>
+          </w:p>
+          <w:p>
+            <w:pPr>
+              <w:pStyle w:val="BodyText"/>
+              <w:bidi w:val="0"/>
+              <w:spacing w:lineRule="auto" w:line="331" w:before="0" w:after="80"/>
+              <w:ind w:hanging="0" w:left="0" w:right="0"/>
+              <w:jc w:val="left"/>
+              <w:rPr/>
+            </w:pPr>
+            <w:r>
+              <w:rPr>
+                <w:rFonts w:ascii="Arial;sans-serif" w:hAnsi="Arial;sans-serif"/>
+                <w:b w:val="false"/>
+                <w:i w:val="false"/>
+                <w:caps w:val="false"/>
+                <w:smallCaps w:val="false"/>
+                <w:strike w:val="false"/>
+                <w:dstrike w:val="false"/>
+                <w:color w:val="000000"/>
+                <w:sz w:val="22"/>
+                <w:u w:val="none"/>
+                <w:effect w:val="none"/>
+                <w:shd w:fill="auto" w:val="clear"/>
+              </w:rPr>
+              <w:t xml:space="preserve">We selected </w:t>
+            </w:r>
+            <w:r>
+              <w:rPr>
+                <w:rFonts w:ascii="Arial;sans-serif" w:hAnsi="Arial;sans-serif"/>
+                <w:b/>
+                <w:i w:val="false"/>
+                <w:caps w:val="false"/>
+                <w:smallCaps w:val="false"/>
+                <w:strike w:val="false"/>
+                <w:dstrike w:val="false"/>
+                <w:color w:val="000000"/>
+                <w:sz w:val="22"/>
+                <w:u w:val="none"/>
+                <w:effect w:val="none"/>
+                <w:shd w:fill="auto" w:val="clear"/>
+              </w:rPr>
+              <w:t>multilingual-e5-large</w:t>
+            </w:r>
+            <w:r>
+              <w:rPr>
+                <w:b w:val="false"/>
+                <w:caps w:val="false"/>
+                <w:smallCaps w:val="false"/>
+                <w:strike w:val="false"/>
+                <w:dstrike w:val="false"/>
+                <w:color w:val="000000"/>
+                <w:u w:val="none"/>
+                <w:effect w:val="none"/>
+                <w:shd w:fill="auto" w:val="clear"/>
+              </w:rPr>
+              <w:t xml:space="preserve"> </w:t>
+            </w:r>
+            <w:r>
+              <w:rPr>
+                <w:rFonts w:ascii="Arial;sans-serif" w:hAnsi="Arial;sans-serif"/>
+                <w:b w:val="false"/>
+                <w:i w:val="false"/>
+                <w:caps w:val="false"/>
+                <w:smallCaps w:val="false"/>
+                <w:strike w:val="false"/>
+                <w:dstrike w:val="false"/>
+                <w:color w:val="000000"/>
+                <w:sz w:val="22"/>
+                <w:u w:val="none"/>
+                <w:effect w:val="none"/>
+                <w:shd w:fill="auto" w:val="clear"/>
+              </w:rPr>
+              <w:t>because its state-of-the-art dense retrieval capabilities provide the highest accuracy for the complex cross-lingual and code-mixed (E23) demands of our corpus.</w:t>
             </w:r>
           </w:p>
         </w:tc>
@@ -3973,6 +4963,65 @@
               <w:right w:val="single" w:sz="4" w:space="0" w:color="000000"/>
             </w:tcBorders>
           </w:tcPr>
+          <w:p>
+            <w:pPr>
+              <w:pStyle w:val="BodyText"/>
+              <w:spacing w:before="0" w:after="80"/>
+              <w:rPr>
+                <w:b w:val="false"/>
+              </w:rPr>
+            </w:pPr>
+            <w:bookmarkStart w:id="13" w:name="docs-internal-guid-e6baa705-7fff-4795-32"/>
+            <w:bookmarkEnd w:id="13"/>
+            <w:r>
+              <w:rPr>
+                <w:rFonts w:ascii="Arial;sans-serif" w:hAnsi="Arial;sans-serif"/>
+                <w:b/>
+                <w:i w:val="false"/>
+                <w:caps w:val="false"/>
+                <w:smallCaps w:val="false"/>
+                <w:strike w:val="false"/>
+                <w:dstrike w:val="false"/>
+                <w:color w:val="000000"/>
+                <w:sz w:val="22"/>
+                <w:u w:val="none"/>
+                <w:effect w:val="none"/>
+                <w:shd w:fill="auto" w:val="clear"/>
+              </w:rPr>
+              <w:t>Yes</w:t>
+            </w:r>
+            <w:r>
+              <w:rPr>
+                <w:b w:val="false"/>
+                <w:caps w:val="false"/>
+                <w:smallCaps w:val="false"/>
+                <w:strike w:val="false"/>
+                <w:dstrike w:val="false"/>
+                <w:color w:val="000000"/>
+                <w:u w:val="none"/>
+                <w:effect w:val="none"/>
+                <w:shd w:fill="auto" w:val="clear"/>
+              </w:rPr>
+              <w:t xml:space="preserve"> — </w:t>
+            </w:r>
+            <w:r>
+              <w:rPr>
+                <w:rFonts w:ascii="Arial;sans-serif" w:hAnsi="Arial;sans-serif"/>
+                <w:b w:val="false"/>
+                <w:i w:val="false"/>
+                <w:caps w:val="false"/>
+                <w:smallCaps w:val="false"/>
+                <w:strike w:val="false"/>
+                <w:dstrike w:val="false"/>
+                <w:color w:val="000000"/>
+                <w:sz w:val="22"/>
+                <w:u w:val="none"/>
+                <w:effect w:val="none"/>
+                <w:shd w:fill="auto" w:val="clear"/>
+              </w:rPr>
+              <w:t>we reproduce and adapt the `multilingual-e5-large` architecture by using the pre-trained weights published by Microsoft/intfloat on HuggingFace.</w:t>
+            </w:r>
+          </w:p>
           <w:p>
             <w:pPr>
               <w:pStyle w:val="Normal"/>

</xml_diff>

<commit_message>
Vector Index comparison completed and form updated
</commit_message>
<xml_diff>
--- a/forms/A2_form.docx
+++ b/forms/A2_form.docx
@@ -5070,19 +5070,259 @@
           </w:tcPr>
           <w:p>
             <w:pPr>
-              <w:pStyle w:val="Normal"/>
-              <w:spacing w:before="0" w:after="80"/>
-              <w:rPr/>
-            </w:pPr>
-            <w:r>
-              <w:rPr>
+              <w:pStyle w:val="BodyText"/>
+              <w:spacing w:before="0" w:after="80"/>
+              <w:rPr>
+                <w:b w:val="false"/>
+              </w:rPr>
+            </w:pPr>
+            <w:bookmarkStart w:id="14" w:name="docs-internal-guid-9cd8a2db-7fff-f0cc-c1"/>
+            <w:bookmarkEnd w:id="14"/>
+            <w:r>
+              <w:rPr>
+                <w:rFonts w:ascii="Arial;sans-serif" w:hAnsi="Arial;sans-serif"/>
+                <w:b w:val="false"/>
+                <w:i w:val="false"/>
+                <w:iCs/>
+                <w:caps w:val="false"/>
+                <w:smallCaps w:val="false"/>
+                <w:strike w:val="false"/>
+                <w:dstrike w:val="false"/>
+                <w:color w:val="595959"/>
+                <w:sz w:val="18"/>
+                <w:szCs w:val="18"/>
+                <w:u w:val="none"/>
+                <w:effect w:val="none"/>
+                <w:shd w:fill="auto" w:val="clear"/>
+              </w:rPr>
+              <w:t xml:space="preserve">1. </w:t>
+            </w:r>
+            <w:r>
+              <w:rPr>
+                <w:rFonts w:ascii="Arial;sans-serif" w:hAnsi="Arial;sans-serif"/>
+                <w:b/>
+                <w:i w:val="false"/>
+                <w:iCs/>
+                <w:caps w:val="false"/>
+                <w:smallCaps w:val="false"/>
+                <w:strike w:val="false"/>
+                <w:dstrike w:val="false"/>
+                <w:color w:val="595959"/>
+                <w:sz w:val="18"/>
+                <w:szCs w:val="18"/>
+                <w:u w:val="none"/>
+                <w:effect w:val="none"/>
+                <w:shd w:fill="auto" w:val="clear"/>
+              </w:rPr>
+              <w:t>Flat / brute-force exact search</w:t>
+            </w:r>
+            <w:r>
+              <w:rPr>
+                <w:b w:val="false"/>
                 <w:i/>
                 <w:iCs/>
+                <w:caps w:val="false"/>
+                <w:smallCaps w:val="false"/>
+                <w:strike w:val="false"/>
+                <w:dstrike w:val="false"/>
                 <w:color w:val="595959"/>
                 <w:sz w:val="18"/>
                 <w:szCs w:val="18"/>
-              </w:rPr>
-              <w:t>e.g. flat vs HNSW vs IVF/PQ</w:t>
+                <w:u w:val="none"/>
+                <w:effect w:val="none"/>
+                <w:shd w:fill="auto" w:val="clear"/>
+              </w:rPr>
+              <w:t xml:space="preserve"> </w:t>
+            </w:r>
+            <w:r>
+              <w:rPr>
+                <w:rFonts w:ascii="Arial;sans-serif" w:hAnsi="Arial;sans-serif"/>
+                <w:b w:val="false"/>
+                <w:i w:val="false"/>
+                <w:iCs/>
+                <w:caps w:val="false"/>
+                <w:smallCaps w:val="false"/>
+                <w:strike w:val="false"/>
+                <w:dstrike w:val="false"/>
+                <w:color w:val="595959"/>
+                <w:sz w:val="18"/>
+                <w:szCs w:val="18"/>
+                <w:u w:val="none"/>
+                <w:effect w:val="none"/>
+                <w:shd w:fill="auto" w:val="clear"/>
+              </w:rPr>
+              <w:t>(numpy dot product over all vectors, no dependencies),</w:t>
+            </w:r>
+          </w:p>
+          <w:p>
+            <w:pPr>
+              <w:pStyle w:val="BodyText"/>
+              <w:bidi w:val="0"/>
+              <w:spacing w:lineRule="auto" w:line="331" w:before="0" w:after="80"/>
+              <w:ind w:hanging="0" w:left="0" w:right="0"/>
+              <w:jc w:val="left"/>
+              <w:rPr>
+                <w:b w:val="false"/>
+              </w:rPr>
+            </w:pPr>
+            <w:r>
+              <w:rPr>
+                <w:rFonts w:ascii="Arial;sans-serif" w:hAnsi="Arial;sans-serif"/>
+                <w:b w:val="false"/>
+                <w:i w:val="false"/>
+                <w:caps w:val="false"/>
+                <w:smallCaps w:val="false"/>
+                <w:strike w:val="false"/>
+                <w:dstrike w:val="false"/>
+                <w:color w:val="595959"/>
+                <w:sz w:val="18"/>
+                <w:u w:val="none"/>
+                <w:effect w:val="none"/>
+                <w:shd w:fill="auto" w:val="clear"/>
+              </w:rPr>
+              <w:t xml:space="preserve">2. </w:t>
+            </w:r>
+            <w:r>
+              <w:rPr>
+                <w:rFonts w:ascii="Arial;sans-serif" w:hAnsi="Arial;sans-serif"/>
+                <w:b/>
+                <w:i w:val="false"/>
+                <w:caps w:val="false"/>
+                <w:smallCaps w:val="false"/>
+                <w:strike w:val="false"/>
+                <w:dstrike w:val="false"/>
+                <w:color w:val="595959"/>
+                <w:sz w:val="18"/>
+                <w:u w:val="none"/>
+                <w:effect w:val="none"/>
+                <w:shd w:fill="auto" w:val="clear"/>
+              </w:rPr>
+              <w:t>FAISS `IndexFlatIP`</w:t>
+            </w:r>
+            <w:r>
+              <w:rPr>
+                <w:b w:val="false"/>
+                <w:caps w:val="false"/>
+                <w:smallCaps w:val="false"/>
+                <w:strike w:val="false"/>
+                <w:dstrike w:val="false"/>
+                <w:color w:val="595959"/>
+                <w:u w:val="none"/>
+                <w:effect w:val="none"/>
+                <w:shd w:fill="auto" w:val="clear"/>
+              </w:rPr>
+              <w:t xml:space="preserve"> </w:t>
+            </w:r>
+            <w:r>
+              <w:rPr>
+                <w:rFonts w:ascii="Arial;sans-serif" w:hAnsi="Arial;sans-serif"/>
+                <w:b w:val="false"/>
+                <w:i w:val="false"/>
+                <w:caps w:val="false"/>
+                <w:smallCaps w:val="false"/>
+                <w:strike w:val="false"/>
+                <w:dstrike w:val="false"/>
+                <w:color w:val="595959"/>
+                <w:sz w:val="18"/>
+                <w:u w:val="none"/>
+                <w:effect w:val="none"/>
+                <w:shd w:fill="auto" w:val="clear"/>
+              </w:rPr>
+              <w:t>(exact cosine search via inner product on L2-normalised vectors).</w:t>
+            </w:r>
+          </w:p>
+          <w:p>
+            <w:pPr>
+              <w:pStyle w:val="BodyText"/>
+              <w:bidi w:val="0"/>
+              <w:spacing w:lineRule="auto" w:line="331" w:before="0" w:after="80"/>
+              <w:ind w:hanging="0" w:left="0" w:right="0"/>
+              <w:jc w:val="left"/>
+              <w:rPr>
+                <w:b w:val="false"/>
+              </w:rPr>
+            </w:pPr>
+            <w:r>
+              <w:rPr>
+                <w:rFonts w:ascii="Arial;sans-serif" w:hAnsi="Arial;sans-serif"/>
+                <w:b w:val="false"/>
+                <w:i w:val="false"/>
+                <w:caps w:val="false"/>
+                <w:smallCaps w:val="false"/>
+                <w:strike w:val="false"/>
+                <w:dstrike w:val="false"/>
+                <w:color w:val="595959"/>
+                <w:sz w:val="18"/>
+                <w:u w:val="none"/>
+                <w:effect w:val="none"/>
+                <w:shd w:fill="auto" w:val="clear"/>
+              </w:rPr>
+              <w:t xml:space="preserve">3. </w:t>
+            </w:r>
+            <w:r>
+              <w:rPr>
+                <w:rFonts w:ascii="Arial;sans-serif" w:hAnsi="Arial;sans-serif"/>
+                <w:b/>
+                <w:i w:val="false"/>
+                <w:caps w:val="false"/>
+                <w:smallCaps w:val="false"/>
+                <w:strike w:val="false"/>
+                <w:dstrike w:val="false"/>
+                <w:color w:val="595959"/>
+                <w:sz w:val="18"/>
+                <w:u w:val="none"/>
+                <w:effect w:val="none"/>
+                <w:shd w:fill="auto" w:val="clear"/>
+              </w:rPr>
+              <w:t>FAISS `IndexHNSWFlat`</w:t>
+            </w:r>
+            <w:r>
+              <w:rPr>
+                <w:b w:val="false"/>
+                <w:caps w:val="false"/>
+                <w:smallCaps w:val="false"/>
+                <w:strike w:val="false"/>
+                <w:dstrike w:val="false"/>
+                <w:color w:val="595959"/>
+                <w:u w:val="none"/>
+                <w:effect w:val="none"/>
+                <w:shd w:fill="auto" w:val="clear"/>
+              </w:rPr>
+              <w:t xml:space="preserve"> </w:t>
+            </w:r>
+            <w:r>
+              <w:rPr>
+                <w:rFonts w:ascii="Arial;sans-serif" w:hAnsi="Arial;sans-serif"/>
+                <w:b w:val="false"/>
+                <w:i w:val="false"/>
+                <w:caps w:val="false"/>
+                <w:smallCaps w:val="false"/>
+                <w:strike w:val="false"/>
+                <w:dstrike w:val="false"/>
+                <w:color w:val="595959"/>
+                <w:sz w:val="18"/>
+                <w:u w:val="none"/>
+                <w:effect w:val="none"/>
+                <w:shd w:fill="auto" w:val="clear"/>
+              </w:rPr>
+              <w:t>(approximate nearest-neighbour, scalable to millions of vectors).</w:t>
+            </w:r>
+          </w:p>
+          <w:p>
+            <w:pPr>
+              <w:pStyle w:val="Normal"/>
+              <w:spacing w:before="0" w:after="80"/>
+              <w:rPr>
+                <w:i/>
+                <w:i/>
+                <w:iCs/>
+                <w:color w:val="595959"/>
+                <w:sz w:val="18"/>
+                <w:szCs w:val="18"/>
+              </w:rPr>
+            </w:pPr>
+            <w:r>
+              <w:rPr/>
             </w:r>
           </w:p>
         </w:tc>
@@ -5098,12 +5338,192 @@
           </w:tcPr>
           <w:p>
             <w:pPr>
-              <w:pStyle w:val="Normal"/>
-              <w:spacing w:before="0" w:after="80"/>
-              <w:rPr/>
-            </w:pPr>
-            <w:r>
-              <w:rPr/>
+              <w:pStyle w:val="BodyText"/>
+              <w:spacing w:before="0" w:after="80"/>
+              <w:rPr>
+                <w:b w:val="false"/>
+              </w:rPr>
+            </w:pPr>
+            <w:bookmarkStart w:id="15" w:name="docs-internal-guid-1abdb5bd-7fff-9ce3-52"/>
+            <w:bookmarkEnd w:id="15"/>
+            <w:r>
+              <w:rPr>
+                <w:rFonts w:ascii="Arial;sans-serif" w:hAnsi="Arial;sans-serif"/>
+                <w:b/>
+                <w:i w:val="false"/>
+                <w:caps w:val="false"/>
+                <w:smallCaps w:val="false"/>
+                <w:strike w:val="false"/>
+                <w:dstrike w:val="false"/>
+                <w:color w:val="595959"/>
+                <w:sz w:val="18"/>
+                <w:u w:val="none"/>
+                <w:effect w:val="none"/>
+                <w:shd w:fill="auto" w:val="clear"/>
+              </w:rPr>
+              <w:t>Choice:</w:t>
+            </w:r>
+            <w:r>
+              <w:rPr>
+                <w:b w:val="false"/>
+                <w:caps w:val="false"/>
+                <w:smallCaps w:val="false"/>
+                <w:strike w:val="false"/>
+                <w:dstrike w:val="false"/>
+                <w:color w:val="595959"/>
+                <w:u w:val="none"/>
+                <w:effect w:val="none"/>
+                <w:shd w:fill="auto" w:val="clear"/>
+              </w:rPr>
+              <w:t xml:space="preserve"> </w:t>
+            </w:r>
+            <w:r>
+              <w:rPr>
+                <w:rFonts w:ascii="Arial;sans-serif" w:hAnsi="Arial;sans-serif"/>
+                <w:b w:val="false"/>
+                <w:i w:val="false"/>
+                <w:caps w:val="false"/>
+                <w:smallCaps w:val="false"/>
+                <w:strike w:val="false"/>
+                <w:dstrike w:val="false"/>
+                <w:color w:val="595959"/>
+                <w:sz w:val="18"/>
+                <w:u w:val="none"/>
+                <w:effect w:val="none"/>
+                <w:shd w:fill="auto" w:val="clear"/>
+              </w:rPr>
+              <w:t>FAISS `IndexFlatIP` (exact search)</w:t>
+            </w:r>
+          </w:p>
+          <w:p>
+            <w:pPr>
+              <w:pStyle w:val="BodyText"/>
+              <w:bidi w:val="0"/>
+              <w:ind w:left="0"/>
+              <w:jc w:val="left"/>
+              <w:rPr/>
+            </w:pPr>
+            <w:r>
+              <w:rPr/>
+            </w:r>
+          </w:p>
+          <w:p>
+            <w:pPr>
+              <w:pStyle w:val="BodyText"/>
+              <w:bidi w:val="0"/>
+              <w:spacing w:lineRule="auto" w:line="331" w:before="0" w:after="80"/>
+              <w:ind w:hanging="0" w:left="0" w:right="0"/>
+              <w:jc w:val="left"/>
+              <w:rPr>
+                <w:rFonts w:ascii="Arial;sans-serif" w:hAnsi="Arial;sans-serif"/>
+                <w:b/>
+                <w:i w:val="false"/>
+                <w:caps w:val="false"/>
+                <w:smallCaps w:val="false"/>
+                <w:strike w:val="false"/>
+                <w:dstrike w:val="false"/>
+                <w:color w:val="595959"/>
+                <w:sz w:val="18"/>
+                <w:u w:val="none"/>
+                <w:effect w:val="none"/>
+                <w:shd w:fill="auto" w:val="clear"/>
+              </w:rPr>
+            </w:pPr>
+            <w:r>
+              <w:rPr>
+                <w:rFonts w:ascii="Arial;sans-serif" w:hAnsi="Arial;sans-serif"/>
+                <w:b/>
+                <w:i w:val="false"/>
+                <w:caps w:val="false"/>
+                <w:smallCaps w:val="false"/>
+                <w:strike w:val="false"/>
+                <w:dstrike w:val="false"/>
+                <w:color w:val="595959"/>
+                <w:sz w:val="18"/>
+                <w:u w:val="none"/>
+                <w:effect w:val="none"/>
+                <w:shd w:fill="auto" w:val="clear"/>
+              </w:rPr>
+              <w:t>Why:</w:t>
+            </w:r>
+          </w:p>
+          <w:p>
+            <w:pPr>
+              <w:pStyle w:val="BodyText"/>
+              <w:bidi w:val="0"/>
+              <w:spacing w:lineRule="auto" w:line="331" w:before="0" w:after="80"/>
+              <w:ind w:hanging="0" w:left="0" w:right="0"/>
+              <w:jc w:val="left"/>
+              <w:rPr>
+                <w:rFonts w:ascii="Arial;sans-serif" w:hAnsi="Arial;sans-serif"/>
+                <w:b w:val="false"/>
+                <w:i w:val="false"/>
+                <w:caps w:val="false"/>
+                <w:smallCaps w:val="false"/>
+                <w:strike w:val="false"/>
+                <w:dstrike w:val="false"/>
+                <w:color w:val="595959"/>
+                <w:sz w:val="18"/>
+                <w:u w:val="none"/>
+                <w:effect w:val="none"/>
+                <w:shd w:fill="auto" w:val="clear"/>
+              </w:rPr>
+            </w:pPr>
+            <w:r>
+              <w:rPr>
+                <w:rFonts w:ascii="Arial;sans-serif" w:hAnsi="Arial;sans-serif"/>
+                <w:b w:val="false"/>
+                <w:i w:val="false"/>
+                <w:caps w:val="false"/>
+                <w:smallCaps w:val="false"/>
+                <w:strike w:val="false"/>
+                <w:dstrike w:val="false"/>
+                <w:color w:val="595959"/>
+                <w:sz w:val="18"/>
+                <w:u w:val="none"/>
+                <w:effect w:val="none"/>
+                <w:shd w:fill="auto" w:val="clear"/>
+              </w:rPr>
+              <w:t>At our corpus scale (~1,000–3,000 chunks from 3 textbooks), a flat brute-force search returns results in milliseconds on CPU, so there is no accuracy vs. speed trade-off to make. We chose FAISS over a raw numpy approach because it provides built-in persistence (`faiss.write_index` / `faiss.read_index`), a production-tested search implementation, and a clean upgrade path: switching to `IndexHNSWFlat` (approximate, scalable) requires changing only one line in `config.yaml` (`type: hnsw`) if the corpus grows significantly. Pure numpy would require rewriting the persistence and search logic entirely.</w:t>
+            </w:r>
+          </w:p>
+          <w:p>
+            <w:pPr>
+              <w:pStyle w:val="BodyText"/>
+              <w:bidi w:val="0"/>
+              <w:ind w:left="0"/>
+              <w:jc w:val="left"/>
+              <w:rPr/>
+            </w:pPr>
+            <w:r>
+              <w:rPr/>
+            </w:r>
+          </w:p>
+          <w:p>
+            <w:pPr>
+              <w:pStyle w:val="BodyText"/>
+              <w:bidi w:val="0"/>
+              <w:spacing w:lineRule="auto" w:line="331" w:before="0" w:after="80"/>
+              <w:ind w:hanging="0" w:left="0" w:right="0"/>
+              <w:jc w:val="left"/>
+              <w:rPr/>
+            </w:pPr>
+            <w:r>
+              <w:rPr>
+                <w:rFonts w:ascii="Arial;sans-serif" w:hAnsi="Arial;sans-serif"/>
+                <w:b w:val="false"/>
+                <w:i w:val="false"/>
+                <w:caps w:val="false"/>
+                <w:smallCaps w:val="false"/>
+                <w:strike w:val="false"/>
+                <w:dstrike w:val="false"/>
+                <w:color w:val="595959"/>
+                <w:sz w:val="18"/>
+                <w:u w:val="none"/>
+                <w:effect w:val="none"/>
+                <w:shd w:fill="auto" w:val="clear"/>
+              </w:rPr>
+              <w:t>`IndexHNSWFlat` was evaluated but not used because approximate search introduces a small recall penalty (~1–3% top-k accuracy loss) that is not justified at our current corpus size where exact search is already instantaneous.</w:t>
             </w:r>
           </w:p>
         </w:tc>
@@ -5123,8 +5543,55 @@
               <w:spacing w:before="0" w:after="80"/>
               <w:rPr/>
             </w:pPr>
-            <w:r>
-              <w:rPr/>
+            <w:bookmarkStart w:id="16" w:name="docs-internal-guid-79281793-7fff-4e56-ff"/>
+            <w:bookmarkEnd w:id="16"/>
+            <w:r>
+              <w:rPr>
+                <w:rFonts w:ascii="Arial;sans-serif" w:hAnsi="Arial;sans-serif"/>
+                <w:b/>
+                <w:i w:val="false"/>
+                <w:caps w:val="false"/>
+                <w:smallCaps w:val="false"/>
+                <w:strike w:val="false"/>
+                <w:dstrike w:val="false"/>
+                <w:color w:val="595959"/>
+                <w:sz w:val="18"/>
+                <w:u w:val="none"/>
+                <w:effect w:val="none"/>
+                <w:shd w:fill="auto" w:val="clear"/>
+              </w:rPr>
+              <w:t>Yes</w:t>
+            </w:r>
+            <w:r>
+              <w:rPr>
+                <w:b w:val="false"/>
+                <w:caps w:val="false"/>
+                <w:smallCaps w:val="false"/>
+                <w:strike w:val="false"/>
+                <w:dstrike w:val="false"/>
+                <w:color w:val="595959"/>
+                <w:u w:val="none"/>
+                <w:effect w:val="none"/>
+                <w:shd w:fill="auto" w:val="clear"/>
+              </w:rPr>
+              <w:t xml:space="preserve"> — </w:t>
+            </w:r>
+            <w:r>
+              <w:rPr>
+                <w:rFonts w:ascii="Arial;sans-serif" w:hAnsi="Arial;sans-serif"/>
+                <w:b w:val="false"/>
+                <w:i w:val="false"/>
+                <w:caps w:val="false"/>
+                <w:smallCaps w:val="false"/>
+                <w:strike w:val="false"/>
+                <w:dstrike w:val="false"/>
+                <w:color w:val="595959"/>
+                <w:sz w:val="18"/>
+                <w:u w:val="none"/>
+                <w:effect w:val="none"/>
+                <w:shd w:fill="auto" w:val="clear"/>
+              </w:rPr>
+              <w:t>we reproduce the FAISS flat inner-product index published by Facebook AI Research, using the `faiss-cpu` library directly.</w:t>
             </w:r>
           </w:p>
         </w:tc>

</xml_diff>